<commit_message>
Programmazione cap. 16 e Laboratorio cap. 6-7 (conversioni di tipo, Lab02)
Co-Authored-By: Claude Sonnet 5.5 <noreply@anthropic.com>
</commit_message>
<xml_diff>
--- a/Riassunto Laboratorio.docx
+++ b/Riassunto Laboratorio.docx
@@ -3294,6 +3294,1314 @@
       <w:r>
         <w:rPr/>
         <w:t>L'ultimo punto è importante quanto gli altri: imparare a leggere i messaggi del compilatore, soprattutto con le opzioni -Wall -Werror che useremo all'esame, è parte dell'imparare a programmare.</w:t>
+      </w:r>
+    </w:p>
+    <w:p>
+      <w:pPr>
+        <w:pStyle w:val="Titolo1"/>
+      </w:pPr>
+      <w:r>
+        <w:rPr>
+          <w:b/>
+          <w:color w:val="EE0000"/>
+        </w:rPr>
+        <w:t>Capitolo 6: Laboratorio 2: Operatori, Ordine di Valutazione ed Errori in C</w:t>
+      </w:r>
+    </w:p>
+    <w:p>
+      <w:pPr>
+        <w:pStyle w:val="Titolo2"/>
+      </w:pPr>
+      <w:r>
+        <w:rPr>
+          <w:b/>
+          <w:color w:val="E97132"/>
+        </w:rPr>
+        <w:t>Di che cosa si occupa il laboratorio 2</w:t>
+      </w:r>
+    </w:p>
+    <w:p>
+      <w:r>
+        <w:rPr/>
+        <w:t>Il secondo laboratorio di Programmazione I, intitolato "Operatori e Tipi", riprende gli argomenti della teoria sulle variabili, sugli operatori aritmetici e sui tipi numerici (capitoli 6, 8 e 13-16 del riassunto di teoria) e li fa provare al computer. Questo capitolo raccoglie la parte sugli operatori, sull'ordine di valutazione delle espressioni e sulla ricerca degli errori; il capitolo successivo tratta i tipi, la documentazione del linguaggio e gli esercizi di sintesi.</w:t>
+      </w:r>
+    </w:p>
+    <w:p>
+      <w:r>
+        <w:rPr/>
+        <w:t xml:space="preserve">Per compilare si usa il comando gcc con l'opzione -Wall, che attiva un ampio insieme di avvisi del compilatore: in Unix </w:t>
+      </w:r>
+      <w:r>
+        <w:rPr>
+          <w:rFonts w:ascii="Consolas" w:hAnsi="Consolas" w:cs="Consolas"/>
+        </w:rPr>
+        <w:t>gcc -Wall aritmetica.c -o aritmetica</w:t>
+      </w:r>
+      <w:r>
+        <w:rPr/>
+        <w:t xml:space="preserve">, in Windows </w:t>
+      </w:r>
+      <w:r>
+        <w:rPr>
+          <w:rFonts w:ascii="Consolas" w:hAnsi="Consolas" w:cs="Consolas"/>
+        </w:rPr>
+        <w:t>gcc -Wall aritmetica.c -o aritmetica.exe</w:t>
+      </w:r>
+      <w:r>
+        <w:rPr/>
+        <w:t xml:space="preserve"> (come visto nel capitolo 4 di questo riassunto).</w:t>
+      </w:r>
+    </w:p>
+    <w:p>
+      <w:pPr>
+        <w:pStyle w:val="Titolo2"/>
+      </w:pPr>
+      <w:r>
+        <w:rPr>
+          <w:b/>
+          <w:color w:val="E97132"/>
+        </w:rPr>
+        <w:t>Aritmetica</w:t>
+      </w:r>
+    </w:p>
+    <w:p>
+      <w:r>
+        <w:rPr/>
+        <w:t xml:space="preserve">Il primo esercizio chiede di provare il programma </w:t>
+      </w:r>
+      <w:r>
+        <w:rPr>
+          <w:b/>
+        </w:rPr>
+        <w:t>aritmetica.c</w:t>
+      </w:r>
+      <w:r>
+        <w:rPr/>
+        <w:t xml:space="preserve"> leggendo attentamente il codice prima di eseguirlo: l'idea è di prevedere il risultato di ogni operazione e poi confrontarlo con l'output.</w:t>
+      </w:r>
+    </w:p>
+    <w:p>
+      <w:pPr>
+        <w:pStyle w:val="Titolo2"/>
+      </w:pPr>
+      <w:r>
+        <w:rPr>
+          <w:b/>
+          <w:color w:val="E97132"/>
+        </w:rPr>
+        <w:t>Operazioni su interi</w:t>
+      </w:r>
+    </w:p>
+    <w:p>
+      <w:r>
+        <w:rPr/>
+        <w:t xml:space="preserve">Il secondo esercizio è scrivere un programma </w:t>
+      </w:r>
+      <w:r>
+        <w:rPr>
+          <w:b/>
+        </w:rPr>
+        <w:t>operazioni_su_interi.c</w:t>
+      </w:r>
+      <w:r>
+        <w:rPr/>
+        <w:t xml:space="preserve"> che:</w:t>
+      </w:r>
+    </w:p>
+    <w:p>
+      <w:r>
+        <w:rPr/>
+        <w:t>1. chieda all'utente di inserire due numeri interi, che chiamiamo n1 e n2 (con scanf, come visto a lezione);</w:t>
+      </w:r>
+    </w:p>
+    <w:p>
+      <w:r>
+        <w:rPr/>
+        <w:t>2. calcoli la somma di n1 e n2 e ne stampi il valore;</w:t>
+      </w:r>
+    </w:p>
+    <w:p>
+      <w:r>
+        <w:rPr/>
+        <w:t>3. stampi il prodotto di n1 con n2;</w:t>
+      </w:r>
+    </w:p>
+    <w:p>
+      <w:r>
+        <w:rPr/>
+        <w:t>4. stampi la divisione intera n1 / n2;</w:t>
+      </w:r>
+    </w:p>
+    <w:p>
+      <w:r>
+        <w:rPr/>
+        <w:t>5. stampi la divisione reale n1 / n2;</w:t>
+      </w:r>
+    </w:p>
+    <w:p>
+      <w:r>
+        <w:rPr/>
+        <w:t>6. stampi il resto della divisione intera tra n1 e n2.</w:t>
+      </w:r>
+    </w:p>
+    <w:p>
+      <w:r>
+        <w:rPr/>
+        <w:t xml:space="preserve">I due tipi di divisione sono il punto delicato, e si ricollegano al capitolo 16 della teoria. Con n1 = 7 e n2 = 2, la divisione tra interi </w:t>
+      </w:r>
+      <w:r>
+        <w:rPr>
+          <w:rFonts w:ascii="Consolas" w:hAnsi="Consolas" w:cs="Consolas"/>
+        </w:rPr>
+        <w:t>n1 / n2</w:t>
+      </w:r>
+      <w:r>
+        <w:rPr/>
+        <w:t xml:space="preserve"> dà 3 (la parte frazionaria si perde) e il resto </w:t>
+      </w:r>
+      <w:r>
+        <w:rPr>
+          <w:rFonts w:ascii="Consolas" w:hAnsi="Consolas" w:cs="Consolas"/>
+        </w:rPr>
+        <w:t>n1 % n2</w:t>
+      </w:r>
+      <w:r>
+        <w:rPr/>
+        <w:t xml:space="preserve"> dà 1. Per ottenere la divisione reale 3.5 bisogna invece convertire almeno uno degli operandi in float con un cast, per esempio </w:t>
+      </w:r>
+      <w:r>
+        <w:rPr>
+          <w:rFonts w:ascii="Consolas" w:hAnsi="Consolas" w:cs="Consolas"/>
+        </w:rPr>
+        <w:t>(float)n1 / n2</w:t>
+      </w:r>
+      <w:r>
+        <w:rPr/>
+        <w:t xml:space="preserve">, e stampare il risultato con </w:t>
+      </w:r>
+      <w:r>
+        <w:rPr>
+          <w:rFonts w:ascii="Consolas" w:hAnsi="Consolas" w:cs="Consolas"/>
+        </w:rPr>
+        <w:t>%f</w:t>
+      </w:r>
+      <w:r>
+        <w:rPr/>
+        <w:t>.</w:t>
+      </w:r>
+    </w:p>
+    <w:p>
+      <w:pPr>
+        <w:pStyle w:val="Titolo2"/>
+      </w:pPr>
+      <w:r>
+        <w:rPr>
+          <w:b/>
+          <w:color w:val="E97132"/>
+        </w:rPr>
+        <w:t>Ordine di valutazione</w:t>
+      </w:r>
+    </w:p>
+    <w:p>
+      <w:r>
+        <w:rPr/>
+        <w:t>Un esercizio chiede quali risultati si ottengono in C da tre espressioni. Per risolverlo bisogna ricordare che in un'espressione senza parentesi la moltiplicazione, la divisione e il resto hanno la precedenza su somma e sottrazione, e che a parità di precedenza si procede da sinistra a destra. Le parentesi si valutano per prime, dalle più interne.</w:t>
+      </w:r>
+    </w:p>
+    <w:p>
+      <w:pPr>
+        <w:numPr>
+          <w:ilvl w:val="0"/>
+          <w:numId w:val="1"/>
+        </w:numPr>
+      </w:pPr>
+      <w:r>
+        <w:rPr>
+          <w:rFonts w:ascii="Consolas" w:hAnsi="Consolas" w:cs="Consolas"/>
+        </w:rPr>
+        <w:t>int x = 7 + 3 * 6 / 2 - 1;</w:t>
+      </w:r>
+      <w:r>
+        <w:rPr/>
+        <w:t xml:space="preserve"> si calcola prima </w:t>
+      </w:r>
+      <w:r>
+        <w:rPr>
+          <w:rFonts w:ascii="Consolas" w:hAnsi="Consolas" w:cs="Consolas"/>
+        </w:rPr>
+        <w:t>3 * 6</w:t>
+      </w:r>
+      <w:r>
+        <w:rPr/>
+        <w:t xml:space="preserve"> = 18, poi </w:t>
+      </w:r>
+      <w:r>
+        <w:rPr>
+          <w:rFonts w:ascii="Consolas" w:hAnsi="Consolas" w:cs="Consolas"/>
+        </w:rPr>
+        <w:t>18 / 2</w:t>
+      </w:r>
+      <w:r>
+        <w:rPr/>
+        <w:t xml:space="preserve"> = 9, infine </w:t>
+      </w:r>
+      <w:r>
+        <w:rPr>
+          <w:rFonts w:ascii="Consolas" w:hAnsi="Consolas" w:cs="Consolas"/>
+        </w:rPr>
+        <w:t>7 + 9 - 1</w:t>
+      </w:r>
+      <w:r>
+        <w:rPr/>
+        <w:t xml:space="preserve"> = </w:t>
+      </w:r>
+      <w:r>
+        <w:rPr>
+          <w:b/>
+        </w:rPr>
+        <w:t>15</w:t>
+      </w:r>
+      <w:r>
+        <w:rPr/>
+        <w:t>.</w:t>
+      </w:r>
+    </w:p>
+    <w:p>
+      <w:pPr>
+        <w:numPr>
+          <w:ilvl w:val="0"/>
+          <w:numId w:val="1"/>
+        </w:numPr>
+      </w:pPr>
+      <w:r>
+        <w:rPr>
+          <w:rFonts w:ascii="Consolas" w:hAnsi="Consolas" w:cs="Consolas"/>
+        </w:rPr>
+        <w:t>int x = 2 % 2 + 2 * 2 - 2 / 2;</w:t>
+      </w:r>
+      <w:r>
+        <w:rPr/>
+        <w:t xml:space="preserve"> dà </w:t>
+      </w:r>
+      <w:r>
+        <w:rPr>
+          <w:rFonts w:ascii="Consolas" w:hAnsi="Consolas" w:cs="Consolas"/>
+        </w:rPr>
+        <w:t>0 + 4 - 1</w:t>
+      </w:r>
+      <w:r>
+        <w:rPr/>
+        <w:t xml:space="preserve"> = </w:t>
+      </w:r>
+      <w:r>
+        <w:rPr>
+          <w:b/>
+        </w:rPr>
+        <w:t>3</w:t>
+      </w:r>
+      <w:r>
+        <w:rPr/>
+        <w:t>.</w:t>
+      </w:r>
+    </w:p>
+    <w:p>
+      <w:pPr>
+        <w:numPr>
+          <w:ilvl w:val="0"/>
+          <w:numId w:val="1"/>
+        </w:numPr>
+      </w:pPr>
+      <w:r>
+        <w:rPr>
+          <w:rFonts w:ascii="Consolas" w:hAnsi="Consolas" w:cs="Consolas"/>
+        </w:rPr>
+        <w:t>int x = (3 * 9 * (3 + (9 * 3 / (3))));</w:t>
+      </w:r>
+      <w:r>
+        <w:rPr/>
+        <w:t xml:space="preserve"> si parte dalle parentesi più interne: </w:t>
+      </w:r>
+      <w:r>
+        <w:rPr>
+          <w:rFonts w:ascii="Consolas" w:hAnsi="Consolas" w:cs="Consolas"/>
+        </w:rPr>
+        <w:t>9 * 3 / 3</w:t>
+      </w:r>
+      <w:r>
+        <w:rPr/>
+        <w:t xml:space="preserve"> = 9, poi </w:t>
+      </w:r>
+      <w:r>
+        <w:rPr>
+          <w:rFonts w:ascii="Consolas" w:hAnsi="Consolas" w:cs="Consolas"/>
+        </w:rPr>
+        <w:t>3 + 9</w:t>
+      </w:r>
+      <w:r>
+        <w:rPr/>
+        <w:t xml:space="preserve"> = 12, infine </w:t>
+      </w:r>
+      <w:r>
+        <w:rPr>
+          <w:rFonts w:ascii="Consolas" w:hAnsi="Consolas" w:cs="Consolas"/>
+        </w:rPr>
+        <w:t>3 * 9 * 12</w:t>
+      </w:r>
+      <w:r>
+        <w:rPr/>
+        <w:t xml:space="preserve"> = </w:t>
+      </w:r>
+      <w:r>
+        <w:rPr>
+          <w:b/>
+        </w:rPr>
+        <w:t>324</w:t>
+      </w:r>
+      <w:r>
+        <w:rPr/>
+        <w:t>.</w:t>
+      </w:r>
+    </w:p>
+    <w:p>
+      <w:r>
+        <w:rPr/>
+        <w:t>Un secondo esercizio chiede quali tra sei espressioni corrispondono a y = a·x</w:t>
+      </w:r>
+      <w:r>
+        <w:rPr>
+          <w:vertAlign w:val="superscript"/>
+        </w:rPr>
+        <w:t>3</w:t>
+      </w:r>
+      <w:r>
+        <w:rPr/>
+        <w:t xml:space="preserve"> + 7. Quelle corrette sono tre, perché in tutte e tre il prodotto a·x·x·x viene calcolato per intero prima di sommare 7:</w:t>
+      </w:r>
+    </w:p>
+    <w:p>
+      <w:pPr>
+        <w:numPr>
+          <w:ilvl w:val="0"/>
+          <w:numId w:val="1"/>
+        </w:numPr>
+      </w:pPr>
+      <w:r>
+        <w:rPr>
+          <w:rFonts w:ascii="Consolas" w:hAnsi="Consolas" w:cs="Consolas"/>
+        </w:rPr>
+        <w:t>int y = a * x * x * x + 7;</w:t>
+      </w:r>
+    </w:p>
+    <w:p>
+      <w:pPr>
+        <w:numPr>
+          <w:ilvl w:val="0"/>
+          <w:numId w:val="1"/>
+        </w:numPr>
+      </w:pPr>
+      <w:r>
+        <w:rPr>
+          <w:rFonts w:ascii="Consolas" w:hAnsi="Consolas" w:cs="Consolas"/>
+        </w:rPr>
+        <w:t>int y = (a * x) * x * x + 7;</w:t>
+      </w:r>
+    </w:p>
+    <w:p>
+      <w:pPr>
+        <w:numPr>
+          <w:ilvl w:val="0"/>
+          <w:numId w:val="1"/>
+        </w:numPr>
+      </w:pPr>
+      <w:r>
+        <w:rPr>
+          <w:rFonts w:ascii="Consolas" w:hAnsi="Consolas" w:cs="Consolas"/>
+        </w:rPr>
+        <w:t>int y = a * (x * x * x) + 7;</w:t>
+      </w:r>
+    </w:p>
+    <w:p>
+      <w:r>
+        <w:rPr/>
+        <w:t xml:space="preserve">Le altre tre sono sbagliate perché una parentesi fa sommare 7 prima di moltiplicare, per esempio </w:t>
+      </w:r>
+      <w:r>
+        <w:rPr>
+          <w:rFonts w:ascii="Consolas" w:hAnsi="Consolas" w:cs="Consolas"/>
+        </w:rPr>
+        <w:t>a * x * x * (x + 7)</w:t>
+      </w:r>
+      <w:r>
+        <w:rPr/>
+        <w:t>, che calcola a·x</w:t>
+      </w:r>
+      <w:r>
+        <w:rPr>
+          <w:vertAlign w:val="superscript"/>
+        </w:rPr>
+        <w:t>2</w:t>
+      </w:r>
+      <w:r>
+        <w:rPr/>
+        <w:t>·(x + 7) e non a·x</w:t>
+      </w:r>
+      <w:r>
+        <w:rPr>
+          <w:vertAlign w:val="superscript"/>
+        </w:rPr>
+        <w:t>3</w:t>
+      </w:r>
+      <w:r>
+        <w:rPr/>
+        <w:t xml:space="preserve"> + 7. Con a = 2 e x = 3 le tre espressioni corrette danno tutte 61, mentre le altre danno valori diversi (per esempio 180 oppure 96).</w:t>
+      </w:r>
+    </w:p>
+    <w:p>
+      <w:pPr>
+        <w:pStyle w:val="Titolo2"/>
+      </w:pPr>
+      <w:r>
+        <w:rPr>
+          <w:b/>
+          <w:color w:val="E97132"/>
+        </w:rPr>
+        <w:t>La circonferenza</w:t>
+      </w:r>
+    </w:p>
+    <w:p>
+      <w:r>
+        <w:rPr/>
+        <w:t xml:space="preserve">L'esercizio sul programma </w:t>
+      </w:r>
+      <w:r>
+        <w:rPr>
+          <w:b/>
+        </w:rPr>
+        <w:t>circonferenza.c</w:t>
+      </w:r>
+      <w:r>
+        <w:rPr/>
+        <w:t xml:space="preserve"> chiede di completare la parte che calcola la circonferenza di un cerchio di raggio r, ricordando che la circonferenza è 2πr e l'area è πr</w:t>
+      </w:r>
+      <w:r>
+        <w:rPr>
+          <w:vertAlign w:val="superscript"/>
+        </w:rPr>
+        <w:t>2</w:t>
+      </w:r>
+      <w:r>
+        <w:rPr/>
+        <w:t xml:space="preserve">. Se il programma usa le funzioni dell'header math.h, su Linux può essere necessario compilare con </w:t>
+      </w:r>
+      <w:r>
+        <w:rPr>
+          <w:rFonts w:ascii="Consolas" w:hAnsi="Consolas" w:cs="Consolas"/>
+        </w:rPr>
+        <w:t>gcc -Wall circonferenza.c -o circonferenza -lm</w:t>
+      </w:r>
+      <w:r>
+        <w:rPr/>
+        <w:t>, dove -lm indica di aggiungere le funzioni matematiche (capitolo 15 della teoria).</w:t>
+      </w:r>
+    </w:p>
+    <w:p>
+      <w:pPr>
+        <w:pStyle w:val="Titolo2"/>
+      </w:pPr>
+      <w:r>
+        <w:rPr>
+          <w:b/>
+          <w:color w:val="E97132"/>
+        </w:rPr>
+        <w:t>Gli errori in C</w:t>
+      </w:r>
+    </w:p>
+    <w:p>
+      <w:r>
+        <w:rPr/>
+        <w:t>Un esercizio propone di individuare gli errori in questo codice:</w:t>
+      </w:r>
+    </w:p>
+    <w:p>
+      <w:pPr>
+        <w:spacing w:after="0" w:before="0" w:line="240" w:lineRule="auto"/>
+      </w:pPr>
+      <w:r>
+        <w:rPr>
+          <w:rFonts w:ascii="Consolas" w:hAnsi="Consolas" w:cs="Consolas"/>
+          <w:sz w:val="17"/>
+        </w:rPr>
+        <w:t>#include &lt;stdio.h&gt;</w:t>
+      </w:r>
+    </w:p>
+    <w:p>
+      <w:pPr>
+        <w:spacing w:after="0" w:before="0" w:line="240" w:lineRule="auto"/>
+      </w:pPr>
+      <w:r>
+        <w:rPr>
+          <w:rFonts w:ascii="Consolas" w:hAnsi="Consolas" w:cs="Consolas"/>
+          <w:sz w:val="17"/>
+        </w:rPr>
+        <w:t>int main() {</w:t>
+      </w:r>
+    </w:p>
+    <w:p>
+      <w:pPr>
+        <w:spacing w:after="0" w:before="0" w:line="240" w:lineRule="auto"/>
+      </w:pPr>
+      <w:r>
+        <w:rPr>
+          <w:rFonts w:ascii="Consolas" w:hAnsi="Consolas" w:cs="Consolas"/>
+          <w:sz w:val="17"/>
+        </w:rPr>
+        <w:t>int x, y;</w:t>
+      </w:r>
+    </w:p>
+    <w:p>
+      <w:pPr>
+        <w:spacing w:after="0" w:before="0" w:line="240" w:lineRule="auto"/>
+      </w:pPr>
+      <w:r>
+        <w:rPr>
+          <w:rFonts w:ascii="Consolas" w:hAnsi="Consolas" w:cs="Consolas"/>
+          <w:sz w:val="17"/>
+        </w:rPr>
+        <w:t>printf("Inserisci due interi: ");</w:t>
+      </w:r>
+    </w:p>
+    <w:p>
+      <w:pPr>
+        <w:spacing w:after="0" w:before="0" w:line="240" w:lineRule="auto"/>
+      </w:pPr>
+      <w:r>
+        <w:rPr>
+          <w:rFonts w:ascii="Consolas" w:hAnsi="Consolas" w:cs="Consolas"/>
+          <w:sz w:val="17"/>
+        </w:rPr>
+        <w:t>scanf("%d %d", &amp;x, y)</w:t>
+      </w:r>
+    </w:p>
+    <w:p>
+      <w:pPr>
+        <w:spacing w:after="0" w:before="0" w:line="240" w:lineRule="auto"/>
+      </w:pPr>
+      <w:r>
+        <w:rPr>
+          <w:rFonts w:ascii="Consolas" w:hAnsi="Consolas" w:cs="Consolas"/>
+          <w:sz w:val="17"/>
+        </w:rPr>
+        <w:t>z = x + y;</w:t>
+      </w:r>
+    </w:p>
+    <w:p>
+      <w:pPr>
+        <w:spacing w:after="0" w:before="0" w:line="240" w:lineRule="auto"/>
+      </w:pPr>
+      <w:r>
+        <w:rPr>
+          <w:rFonts w:ascii="Consolas" w:hAnsi="Consolas" w:cs="Consolas"/>
+          <w:sz w:val="17"/>
+        </w:rPr>
+        <w:t>printf("La somma %d + %d vale ", x, y);</w:t>
+      </w:r>
+    </w:p>
+    <w:p>
+      <w:pPr>
+        <w:spacing w:after="0" w:before="0" w:line="240" w:lineRule="auto"/>
+      </w:pPr>
+      <w:r>
+        <w:rPr>
+          <w:rFonts w:ascii="Consolas" w:hAnsi="Consolas" w:cs="Consolas"/>
+          <w:sz w:val="17"/>
+        </w:rPr>
+        <w:t>printf("%d\n", &amp;z);</w:t>
+      </w:r>
+    </w:p>
+    <w:p>
+      <w:pPr>
+        <w:spacing w:after="0" w:before="0" w:line="240" w:lineRule="auto"/>
+      </w:pPr>
+      <w:r>
+        <w:rPr>
+          <w:rFonts w:ascii="Consolas" w:hAnsi="Consolas" w:cs="Consolas"/>
+          <w:sz w:val="17"/>
+        </w:rPr>
+        <w:t>}</w:t>
+      </w:r>
+    </w:p>
+    <w:p/>
+    <w:p>
+      <w:r>
+        <w:rPr/>
+        <w:t>Leggendolo con attenzione si trovano quattro problemi, di natura diversa: due sono veri errori di compilazione, gli altri due il compilatore li segnala come avvisi con -Wall (oppure producono un comportamento sbagliato in esecuzione).</w:t>
+      </w:r>
+    </w:p>
+    <w:p>
+      <w:pPr>
+        <w:numPr>
+          <w:ilvl w:val="0"/>
+          <w:numId w:val="1"/>
+        </w:numPr>
+      </w:pPr>
+      <w:r>
+        <w:rPr/>
+        <w:t>nella scanf manca l'operatore &amp; davanti a y: scanf vuole l'indirizzo di ogni variabile in cui scrivere (capitoli 9 e 10 della teoria); senza &amp; il programma scriverebbe all'indirizzo contenuto in y, con ogni probabilità facendolo bloccare;</w:t>
+      </w:r>
+    </w:p>
+    <w:p>
+      <w:pPr>
+        <w:numPr>
+          <w:ilvl w:val="0"/>
+          <w:numId w:val="1"/>
+        </w:numPr>
+      </w:pPr>
+      <w:r>
+        <w:rPr/>
+        <w:t>manca il punto e virgola alla fine della riga della scanf;</w:t>
+      </w:r>
+    </w:p>
+    <w:p>
+      <w:pPr>
+        <w:numPr>
+          <w:ilvl w:val="0"/>
+          <w:numId w:val="1"/>
+        </w:numPr>
+      </w:pPr>
+      <w:r>
+        <w:rPr/>
+        <w:t>la variabile z non è stata dichiarata prima di essere usata;</w:t>
+      </w:r>
+    </w:p>
+    <w:p>
+      <w:pPr>
+        <w:numPr>
+          <w:ilvl w:val="0"/>
+          <w:numId w:val="1"/>
+        </w:numPr>
+      </w:pPr>
+      <w:r>
+        <w:rPr/>
+        <w:t xml:space="preserve">l'ultima printf stampa </w:t>
+      </w:r>
+      <w:r>
+        <w:rPr>
+          <w:rFonts w:ascii="Consolas" w:hAnsi="Consolas" w:cs="Consolas"/>
+        </w:rPr>
+        <w:t>&amp;z</w:t>
+      </w:r>
+      <w:r>
+        <w:rPr/>
+        <w:t xml:space="preserve">, cioè l'indirizzo di z, con %d, mentre per stampare il valore bisogna scrivere </w:t>
+      </w:r>
+      <w:r>
+        <w:rPr>
+          <w:rFonts w:ascii="Consolas" w:hAnsi="Consolas" w:cs="Consolas"/>
+        </w:rPr>
+        <w:t>z</w:t>
+      </w:r>
+      <w:r>
+        <w:rPr/>
+        <w:t>.</w:t>
+      </w:r>
+    </w:p>
+    <w:p>
+      <w:r>
+        <w:rPr/>
+        <w:t xml:space="preserve">Il </w:t>
+      </w:r>
+      <w:r>
+        <w:rPr>
+          <w:rFonts w:ascii="Consolas" w:hAnsi="Consolas" w:cs="Consolas"/>
+        </w:rPr>
+        <w:t>main()</w:t>
+      </w:r>
+      <w:r>
+        <w:rPr/>
+        <w:t xml:space="preserve"> senza </w:t>
+      </w:r>
+      <w:r>
+        <w:rPr>
+          <w:rFonts w:ascii="Consolas" w:hAnsi="Consolas" w:cs="Consolas"/>
+        </w:rPr>
+        <w:t>void</w:t>
+      </w:r>
+      <w:r>
+        <w:rPr/>
+        <w:t xml:space="preserve"> e l'assenza di </w:t>
+      </w:r>
+      <w:r>
+        <w:rPr>
+          <w:rFonts w:ascii="Consolas" w:hAnsi="Consolas" w:cs="Consolas"/>
+        </w:rPr>
+        <w:t>return 0;</w:t>
+      </w:r>
+      <w:r>
+        <w:rPr/>
+        <w:t>, invece, non sono errori in C.</w:t>
+      </w:r>
+    </w:p>
+    <w:p>
+      <w:r>
+        <w:rPr/>
+        <w:t xml:space="preserve">Un secondo esercizio chiede di leggere il file </w:t>
+      </w:r>
+      <w:r>
+        <w:rPr>
+          <w:b/>
+        </w:rPr>
+        <w:t>errori.c</w:t>
+      </w:r>
+      <w:r>
+        <w:rPr/>
+        <w:t xml:space="preserve"> e, senza compilare, individuare tutti gli errori presenti: nel testo dell'esercizio si dice che sono 8. Il metodo è lo stesso: rileggere il codice riga per riga, cercando errori dei tipi appena visti.</w:t>
+      </w:r>
+    </w:p>
+    <w:p>
+      <w:pPr>
+        <w:pStyle w:val="Titolo2"/>
+      </w:pPr>
+      <w:r>
+        <w:rPr>
+          <w:b/>
+          <w:color w:val="E97132"/>
+        </w:rPr>
+        <w:t>Media di tre numeri</w:t>
+      </w:r>
+    </w:p>
+    <w:p>
+      <w:r>
+        <w:rPr/>
+        <w:t xml:space="preserve">Infine l'esercizio su </w:t>
+      </w:r>
+      <w:r>
+        <w:rPr>
+          <w:b/>
+        </w:rPr>
+        <w:t>media.c</w:t>
+      </w:r>
+      <w:r>
+        <w:rPr/>
+        <w:t xml:space="preserve"> chiede di leggere il codice, sperimentare input differenti seguendo gli esercizi proposti e rispondere alle domande indicate nei commenti del codice.</w:t>
+      </w:r>
+    </w:p>
+    <w:p>
+      <w:pPr>
+        <w:pStyle w:val="Titolo1"/>
+      </w:pPr>
+      <w:r>
+        <w:rPr>
+          <w:b/>
+          <w:color w:val="EE0000"/>
+        </w:rPr>
+        <w:t>Capitolo 7: Laboratorio 2: Tipi, Documentazione ed Esercizi di Sintesi</w:t>
+      </w:r>
+    </w:p>
+    <w:p>
+      <w:pPr>
+        <w:pStyle w:val="Titolo2"/>
+      </w:pPr>
+      <w:r>
+        <w:rPr>
+          <w:b/>
+          <w:color w:val="E97132"/>
+        </w:rPr>
+        <w:t>La tabella dei tipi e degli specificatori</w:t>
+      </w:r>
+    </w:p>
+    <w:p>
+      <w:r>
+        <w:rPr/>
+        <w:t>La seconda parte del laboratorio 2 riguarda i tipi del C. Il laboratorio riporta due tabelle con la dimensione di ogni tipo (in byte e in bit), l'intervallo dei valori e lo specificatore di conversione, per CPU a 32 e a 64 bit, e approfondiscono quanto visto sui tipi nel capitolo 6 della teoria. Gli intervalli dei tipi interi con segno vanno da −2</w:t>
+      </w:r>
+      <w:r>
+        <w:rPr>
+          <w:vertAlign w:val="superscript"/>
+        </w:rPr>
+        <w:t>N−1</w:t>
+      </w:r>
+      <w:r>
+        <w:rPr/>
+        <w:t xml:space="preserve"> a 2</w:t>
+      </w:r>
+      <w:r>
+        <w:rPr>
+          <w:vertAlign w:val="superscript"/>
+        </w:rPr>
+        <w:t>N−1</w:t>
+      </w:r>
+      <w:r>
+        <w:rPr/>
+        <w:t xml:space="preserve"> − 1, dove N è il numero di bit (per esempio da −2</w:t>
+      </w:r>
+      <w:r>
+        <w:rPr>
+          <w:vertAlign w:val="superscript"/>
+        </w:rPr>
+        <w:t>31</w:t>
+      </w:r>
+      <w:r>
+        <w:rPr/>
+        <w:t xml:space="preserve"> a 2</w:t>
+      </w:r>
+      <w:r>
+        <w:rPr>
+          <w:vertAlign w:val="superscript"/>
+        </w:rPr>
+        <w:t>31</w:t>
+      </w:r>
+      <w:r>
+        <w:rPr/>
+        <w:t xml:space="preserve"> − 1 per un int).</w:t>
+      </w:r>
+    </w:p>
+    <w:p>
+      <w:r>
+        <w:rPr/>
+        <w:t xml:space="preserve">I </w:t>
+      </w:r>
+      <w:r>
+        <w:rPr>
+          <w:b/>
+        </w:rPr>
+        <w:t>tipi con segno</w:t>
+      </w:r>
+      <w:r>
+        <w:rPr/>
+        <w:t xml:space="preserve"> e i loro specificatori sono:</w:t>
+      </w:r>
+    </w:p>
+    <w:p>
+      <w:pPr>
+        <w:numPr>
+          <w:ilvl w:val="0"/>
+          <w:numId w:val="1"/>
+        </w:numPr>
+      </w:pPr>
+      <w:r>
+        <w:rPr/>
+        <w:t>char (1 byte): %c;</w:t>
+      </w:r>
+    </w:p>
+    <w:p>
+      <w:pPr>
+        <w:numPr>
+          <w:ilvl w:val="0"/>
+          <w:numId w:val="1"/>
+        </w:numPr>
+      </w:pPr>
+      <w:r>
+        <w:rPr/>
+        <w:t>short (2 byte): %hd;</w:t>
+      </w:r>
+    </w:p>
+    <w:p>
+      <w:pPr>
+        <w:numPr>
+          <w:ilvl w:val="0"/>
+          <w:numId w:val="1"/>
+        </w:numPr>
+      </w:pPr>
+      <w:r>
+        <w:rPr/>
+        <w:t>int (4 byte): %d;</w:t>
+      </w:r>
+    </w:p>
+    <w:p>
+      <w:pPr>
+        <w:numPr>
+          <w:ilvl w:val="0"/>
+          <w:numId w:val="1"/>
+        </w:numPr>
+      </w:pPr>
+      <w:r>
+        <w:rPr/>
+        <w:t>long (4 byte su CPU a 32 bit, 8 su 64): %ld;</w:t>
+      </w:r>
+    </w:p>
+    <w:p>
+      <w:pPr>
+        <w:numPr>
+          <w:ilvl w:val="0"/>
+          <w:numId w:val="1"/>
+        </w:numPr>
+      </w:pPr>
+      <w:r>
+        <w:rPr/>
+        <w:t>long long (8 byte): %lld;</w:t>
+      </w:r>
+    </w:p>
+    <w:p>
+      <w:pPr>
+        <w:numPr>
+          <w:ilvl w:val="0"/>
+          <w:numId w:val="1"/>
+        </w:numPr>
+      </w:pPr>
+      <w:r>
+        <w:rPr/>
+        <w:t>ptrdiff_t (4 byte a 32 bit, 8 a 64): %t nella tabella del corso (lo specificatore completo in C è %td);</w:t>
+      </w:r>
+    </w:p>
+    <w:p>
+      <w:pPr>
+        <w:numPr>
+          <w:ilvl w:val="0"/>
+          <w:numId w:val="1"/>
+        </w:numPr>
+      </w:pPr>
+      <w:r>
+        <w:rPr/>
+        <w:t>float (4 byte, intervallo da circa 10</w:t>
+      </w:r>
+      <w:r>
+        <w:rPr>
+          <w:vertAlign w:val="superscript"/>
+        </w:rPr>
+        <w:t>-38</w:t>
+      </w:r>
+      <w:r>
+        <w:rPr/>
+        <w:t xml:space="preserve"> a 10</w:t>
+      </w:r>
+      <w:r>
+        <w:rPr>
+          <w:vertAlign w:val="superscript"/>
+        </w:rPr>
+        <w:t>38</w:t>
+      </w:r>
+      <w:r>
+        <w:rPr/>
+        <w:t>): %f;</w:t>
+      </w:r>
+    </w:p>
+    <w:p>
+      <w:pPr>
+        <w:numPr>
+          <w:ilvl w:val="0"/>
+          <w:numId w:val="1"/>
+        </w:numPr>
+      </w:pPr>
+      <w:r>
+        <w:rPr/>
+        <w:t>double (8 byte, da circa 10</w:t>
+      </w:r>
+      <w:r>
+        <w:rPr>
+          <w:vertAlign w:val="superscript"/>
+        </w:rPr>
+        <w:t>-308</w:t>
+      </w:r>
+      <w:r>
+        <w:rPr/>
+        <w:t xml:space="preserve"> a 10</w:t>
+      </w:r>
+      <w:r>
+        <w:rPr>
+          <w:vertAlign w:val="superscript"/>
+        </w:rPr>
+        <w:t>308</w:t>
+      </w:r>
+      <w:r>
+        <w:rPr/>
+        <w:t>): %lf nella tabella, anche se in printf %f va bene per entrambi i tipi (capitolo 14 della teoria).</w:t>
+      </w:r>
+    </w:p>
+    <w:p>
+      <w:r>
+        <w:rPr/>
+        <w:t xml:space="preserve">I </w:t>
+      </w:r>
+      <w:r>
+        <w:rPr>
+          <w:b/>
+        </w:rPr>
+        <w:t>tipi senza segno</w:t>
+      </w:r>
+      <w:r>
+        <w:rPr/>
+        <w:t xml:space="preserve"> sono unsigned char (%hhu), unsigned short (%hu), unsigned int (%u), unsigned long (%lu), unsigned long long (%llu) e size_t (%zu); i loro valori vanno da 0 a 2</w:t>
+      </w:r>
+      <w:r>
+        <w:rPr>
+          <w:vertAlign w:val="superscript"/>
+        </w:rPr>
+        <w:t>N</w:t>
+      </w:r>
+      <w:r>
+        <w:rPr/>
+        <w:t xml:space="preserve"> − 1, dove N è il numero di bit del tipo. Due precisazioni: le dimensioni sono indicative, perché dipendono dal sistema in uso (come per long int: per esempio su Windows a 64 bit con gcc un long occupa 4 byte), e </w:t>
+      </w:r>
+      <w:r>
+        <w:rPr>
+          <w:b/>
+        </w:rPr>
+        <w:t>non serve imparare a memoria queste tabelle</w:t>
+      </w:r>
+      <w:r>
+        <w:rPr/>
+        <w:t>.</w:t>
+      </w:r>
+    </w:p>
+    <w:p>
+      <w:pPr>
+        <w:pStyle w:val="Titolo2"/>
+      </w:pPr>
+      <w:r>
+        <w:rPr>
+          <w:b/>
+          <w:color w:val="E97132"/>
+        </w:rPr>
+        <w:t>Le dimensioni dei tipi</w:t>
+      </w:r>
+    </w:p>
+    <w:p>
+      <w:r>
+        <w:rPr/>
+        <w:t xml:space="preserve">L'esercizio sul programma </w:t>
+      </w:r>
+      <w:r>
+        <w:rPr>
+          <w:b/>
+        </w:rPr>
+        <w:t>dim_tipi.c</w:t>
+      </w:r>
+      <w:r>
+        <w:rPr/>
+        <w:t xml:space="preserve"> chiede di leggerlo, compilarlo e provarlo, e di rispondere a una domanda: quale caratteristica hanno le dimensioni dei tipi puntatore, e perché. La risposta si trova nel capitolo 12 della teoria: un puntatore occupa la stessa quantità di memoria qualunque sia il tipo della variabile a cui punta (per esempio 8 byte su una piattaforma a 64 bit), perché contiene sempre e solo un indirizzo, la cui dimensione dipende dalla piattaforma e non dal tipo puntato.</w:t>
+      </w:r>
+    </w:p>
+    <w:p>
+      <w:pPr>
+        <w:pStyle w:val="Titolo2"/>
+      </w:pPr>
+      <w:r>
+        <w:rPr>
+          <w:b/>
+          <w:color w:val="E97132"/>
+        </w:rPr>
+        <w:t>La documentazione del linguaggio</w:t>
+      </w:r>
+    </w:p>
+    <w:p>
+      <w:r>
+        <w:rPr/>
+        <w:t xml:space="preserve">Si può usare una versione </w:t>
+      </w:r>
+      <w:r>
+        <w:rPr>
+          <w:b/>
+        </w:rPr>
+        <w:t>offline</w:t>
+      </w:r>
+      <w:r>
+        <w:rPr/>
+        <w:t xml:space="preserve"> della documentazione del linguaggio e della libreria del C:</w:t>
+      </w:r>
+    </w:p>
+    <w:p>
+      <w:r>
+        <w:rPr/>
+        <w:t>1. accedere a https://en.cppreference.com/w/c;</w:t>
+      </w:r>
+    </w:p>
+    <w:p>
+      <w:r>
+        <w:rPr/>
+        <w:t>2. andare su "Offline version" in fondo alla pagina e scaricare la versione più recente (Unofficial Release);</w:t>
+      </w:r>
+    </w:p>
+    <w:p>
+      <w:r>
+        <w:rPr/>
+        <w:t xml:space="preserve">3. aprire la pagina </w:t>
+      </w:r>
+      <w:r>
+        <w:rPr>
+          <w:rFonts w:ascii="Consolas" w:hAnsi="Consolas" w:cs="Consolas"/>
+        </w:rPr>
+        <w:t>html-book/reference/en/c.html</w:t>
+      </w:r>
+      <w:r>
+        <w:rPr/>
+        <w:t>;</w:t>
+      </w:r>
+    </w:p>
+    <w:p>
+      <w:r>
+        <w:rPr/>
+        <w:t xml:space="preserve">4. cercare nella sezione degli header la documentazione di </w:t>
+      </w:r>
+      <w:r>
+        <w:rPr>
+          <w:rFonts w:ascii="Consolas" w:hAnsi="Consolas" w:cs="Consolas"/>
+        </w:rPr>
+        <w:t>&lt;stdio.h&gt;</w:t>
+      </w:r>
+      <w:r>
+        <w:rPr/>
+        <w:t xml:space="preserve"> e leggere la documentazione completa di printf.</w:t>
+      </w:r>
+    </w:p>
+    <w:p>
+      <w:r>
+        <w:rPr/>
+        <w:t>Il laboratorio avverte che la documentazione di riferimento è molto più elaborata di quanto visto finora, ma serve per imparare a cercare le informazioni di cui si ha bisogno (come visto nel capitolo 15 della teoria).</w:t>
+      </w:r>
+    </w:p>
+    <w:p>
+      <w:pPr>
+        <w:pStyle w:val="Titolo2"/>
+      </w:pPr>
+      <w:r>
+        <w:rPr>
+          <w:b/>
+          <w:color w:val="E97132"/>
+        </w:rPr>
+        <w:t>Esercizio: il mercato</w:t>
+      </w:r>
+    </w:p>
+    <w:p>
+      <w:r>
+        <w:rPr/>
+        <w:t xml:space="preserve">L'esercizio </w:t>
+      </w:r>
+      <w:r>
+        <w:rPr>
+          <w:b/>
+        </w:rPr>
+        <w:t>mercato.c</w:t>
+      </w:r>
+      <w:r>
+        <w:rPr/>
+        <w:t xml:space="preserve"> chiede di calcolare la spesa al supermercato: 3 pacchi di orecchiette, a 1,50 euro al pacco, e 1 kg e mezzo di pomodori, a 2,50 euro al kg. La funzione main deve calcolare e visualizzare la spesa totale. I suggerimenti sono di modellare il problema con variabili dichiarate con tipi adeguati, usare una variabile anche per il totale, indentare e commentare il programma.</w:t>
+      </w:r>
+    </w:p>
+    <w:p>
+      <w:r>
+        <w:rPr/>
+        <w:t xml:space="preserve">Poiché i prezzi e il peso dei pomodori non sono interi servono dei tipi reali (float o double), e il totale è 3 × 1,50 + 1,5 × 2,50 = 4,50 + 3,75 = </w:t>
+      </w:r>
+      <w:r>
+        <w:rPr>
+          <w:b/>
+        </w:rPr>
+        <w:t>8,25 euro</w:t>
+      </w:r>
+      <w:r>
+        <w:rPr/>
+        <w:t>. Infine il programma va modificato per far inserire le quantità da tastiera, invece di fissarle nel codice, con scanf: ricordando che per leggere un double si usa %lf (capitolo 14 della teoria). Nel codice i decimali si scrivono con il punto (1.50), non con la virgola.</w:t>
+      </w:r>
+    </w:p>
+    <w:p>
+      <w:pPr>
+        <w:pStyle w:val="Titolo2"/>
+      </w:pPr>
+      <w:r>
+        <w:rPr>
+          <w:b/>
+          <w:color w:val="E97132"/>
+        </w:rPr>
+        <w:t>Esercizio: scambio di quattro variabili</w:t>
+      </w:r>
+    </w:p>
+    <w:p>
+      <w:r>
+        <w:rPr/>
+        <w:t xml:space="preserve">L'esercizio sullo scambio parte dal programma </w:t>
+      </w:r>
+      <w:r>
+        <w:rPr>
+          <w:b/>
+        </w:rPr>
+        <w:t>scambio.c</w:t>
+      </w:r>
+      <w:r>
+        <w:rPr/>
+        <w:t xml:space="preserve">, simile a quello visto a lezione (capitolo 13 della teoria), da leggere, compilare e provare. Poi bisogna scrivere </w:t>
+      </w:r>
+      <w:r>
+        <w:rPr>
+          <w:b/>
+        </w:rPr>
+        <w:t>scambio4.c</w:t>
+      </w:r>
+      <w:r>
+        <w:rPr/>
+        <w:t>, con quattro variabili intere v1, v2, v3 e v4, inizializzate a piacere, da scambiare in modo che v1 prenda il valore di v2, v2 quello di v3, v3 quello di v4 e v4 quello originale di v1. I valori vanno stampati prima e dopo lo scambio.</w:t>
+      </w:r>
+    </w:p>
+    <w:p>
+      <w:r>
+        <w:rPr/>
+        <w:t>L'idea è quella della variabile temporanea: il valore di v1 va salvato prima di essere sovrascritto. Con una variabile d'appoggio temp:</w:t>
+      </w:r>
+    </w:p>
+    <w:p>
+      <w:pPr>
+        <w:spacing w:after="0" w:before="0" w:line="240" w:lineRule="auto"/>
+      </w:pPr>
+      <w:r>
+        <w:rPr>
+          <w:rFonts w:ascii="Consolas" w:hAnsi="Consolas" w:cs="Consolas"/>
+          <w:sz w:val="17"/>
+        </w:rPr>
+        <w:t>temp = v1;</w:t>
+      </w:r>
+    </w:p>
+    <w:p>
+      <w:pPr>
+        <w:spacing w:after="0" w:before="0" w:line="240" w:lineRule="auto"/>
+      </w:pPr>
+      <w:r>
+        <w:rPr>
+          <w:rFonts w:ascii="Consolas" w:hAnsi="Consolas" w:cs="Consolas"/>
+          <w:sz w:val="17"/>
+        </w:rPr>
+        <w:t>v1 = v2;</w:t>
+      </w:r>
+    </w:p>
+    <w:p>
+      <w:pPr>
+        <w:spacing w:after="0" w:before="0" w:line="240" w:lineRule="auto"/>
+      </w:pPr>
+      <w:r>
+        <w:rPr>
+          <w:rFonts w:ascii="Consolas" w:hAnsi="Consolas" w:cs="Consolas"/>
+          <w:sz w:val="17"/>
+        </w:rPr>
+        <w:t>v2 = v3;</w:t>
+      </w:r>
+    </w:p>
+    <w:p>
+      <w:pPr>
+        <w:spacing w:after="0" w:before="0" w:line="240" w:lineRule="auto"/>
+      </w:pPr>
+      <w:r>
+        <w:rPr>
+          <w:rFonts w:ascii="Consolas" w:hAnsi="Consolas" w:cs="Consolas"/>
+          <w:sz w:val="17"/>
+        </w:rPr>
+        <w:t>v3 = v4;</w:t>
+      </w:r>
+    </w:p>
+    <w:p>
+      <w:pPr>
+        <w:spacing w:after="0" w:before="0" w:line="240" w:lineRule="auto"/>
+      </w:pPr>
+      <w:r>
+        <w:rPr>
+          <w:rFonts w:ascii="Consolas" w:hAnsi="Consolas" w:cs="Consolas"/>
+          <w:sz w:val="17"/>
+        </w:rPr>
+        <w:t>v4 = temp;</w:t>
+      </w:r>
+    </w:p>
+    <w:p/>
+    <w:p>
+      <w:r>
+        <w:rPr/>
+        <w:t>Con v1, v2, v3 e v4 uguali a 1, 2, 3 e 4 il risultato è 2, 3, 4, 1. Anche qui l'ordine è essenziale: ogni assegnamento deve avvenire quando il valore che sta per essere sovrascritto è già stato copiato altrove.</w:t>
       </w:r>
     </w:p>
     <w:sectPr>

</xml_diff>

<commit_message>
Programmazione cap. 20-22 (cicli, slide 04A) e Laboratorio cap. 8-10 (Lab03)
Aggiornati STATO.md, figure (figure_cicli.py) e cache di testo delle slide.

Co-Authored-By: Claude Sonnet 5.5 <noreply@anthropic.com>
</commit_message>
<xml_diff>
--- a/Riassunto Laboratorio.docx
+++ b/Riassunto Laboratorio.docx
@@ -4746,6 +4746,4292 @@
       <w:r>
         <w:rPr/>
         <w:t>Con v1, v2, v3 e v4 uguali a 1, 2, 3 e 4 il risultato è 2, 3, 4, 1. Anche qui l'ordine è essenziale: ogni assegnamento deve avvenire quando il valore che sta per essere sovrascritto è già stato copiato altrove.</w:t>
+      </w:r>
+    </w:p>
+    <w:p>
+      <w:pPr>
+        <w:pStyle w:val="Titolo1"/>
+      </w:pPr>
+      <w:r>
+        <w:rPr>
+          <w:b/>
+          <w:color w:val="EE0000"/>
+        </w:rPr>
+        <w:t>Capitolo 8: Laboratorio 3: Espressioni Booleane ed Errori con if</w:t>
+      </w:r>
+    </w:p>
+    <w:p>
+      <w:pPr>
+        <w:pStyle w:val="Titolo2"/>
+      </w:pPr>
+      <w:r>
+        <w:rPr>
+          <w:b/>
+          <w:color w:val="E97132"/>
+        </w:rPr>
+        <w:t>Di che cosa parla il laboratorio 3</w:t>
+      </w:r>
+    </w:p>
+    <w:p>
+      <w:r>
+        <w:rPr/>
+        <w:t xml:space="preserve">Il laboratorio 3, «Condizioni booleane», mette in pratica quanto visto a teoria sulle espressioni booleane (capitoli 17 e 18) e sul costrutto </w:t>
+      </w:r>
+      <w:r>
+        <w:rPr>
+          <w:rFonts w:ascii="Consolas" w:hAnsi="Consolas" w:cs="Consolas"/>
+        </w:rPr>
+        <w:t>if</w:t>
+      </w:r>
+      <w:r>
+        <w:rPr/>
+        <w:t xml:space="preserve"> (capitolo 19). Le prime attività sono la valutazione di espressioni, la lettura del codice di </w:t>
+      </w:r>
+      <w:r>
+        <w:rPr>
+          <w:rFonts w:ascii="Consolas" w:hAnsi="Consolas" w:cs="Consolas"/>
+        </w:rPr>
+        <w:t>booleani.c</w:t>
+      </w:r>
+      <w:r>
+        <w:rPr/>
+        <w:t xml:space="preserve"> e sei esercizi da completare; poi si passa agli errori tipici con </w:t>
+      </w:r>
+      <w:r>
+        <w:rPr>
+          <w:rFonts w:ascii="Consolas" w:hAnsi="Consolas" w:cs="Consolas"/>
+        </w:rPr>
+        <w:t>if</w:t>
+      </w:r>
+      <w:r>
+        <w:rPr/>
+        <w:t>/</w:t>
+      </w:r>
+      <w:r>
+        <w:rPr>
+          <w:rFonts w:ascii="Consolas" w:hAnsi="Consolas" w:cs="Consolas"/>
+        </w:rPr>
+        <w:t>else</w:t>
+      </w:r>
+      <w:r>
+        <w:rPr/>
+        <w:t xml:space="preserve">, agli esercizi su Moodle (capitolo 9 di questo riassunto) ai programmi </w:t>
+      </w:r>
+      <w:r>
+        <w:rPr>
+          <w:rFonts w:ascii="Consolas" w:hAnsi="Consolas" w:cs="Consolas"/>
+        </w:rPr>
+        <w:t>saluta.c</w:t>
+      </w:r>
+      <w:r>
+        <w:rPr/>
+        <w:t xml:space="preserve"> e </w:t>
+      </w:r>
+      <w:r>
+        <w:rPr>
+          <w:rFonts w:ascii="Consolas" w:hAnsi="Consolas" w:cs="Consolas"/>
+        </w:rPr>
+        <w:t>selezione_operazioni.c</w:t>
+      </w:r>
+      <w:r>
+        <w:rPr/>
+        <w:t xml:space="preserve"> (capitolo 9) e a due programmi più lunghi, l'equazione di secondo grado e il gioco sasso-carta-forbici-lucertola-Spock (capitolo 10).</w:t>
+      </w:r>
+    </w:p>
+    <w:p>
+      <w:pPr>
+        <w:pStyle w:val="Titolo2"/>
+      </w:pPr>
+      <w:r>
+        <w:rPr>
+          <w:b/>
+          <w:color w:val="E97132"/>
+        </w:rPr>
+        <w:t>Quali valori assumono queste espressioni</w:t>
+      </w:r>
+    </w:p>
+    <w:p>
+      <w:r>
+        <w:rPr/>
+        <w:t>Il laboratorio propone nove espressioni da valutare. Le risposte sono queste:</w:t>
+      </w:r>
+    </w:p>
+    <w:p>
+      <w:pPr>
+        <w:numPr>
+          <w:ilvl w:val="0"/>
+          <w:numId w:val="1"/>
+        </w:numPr>
+      </w:pPr>
+      <w:r>
+        <w:rPr>
+          <w:rFonts w:ascii="Consolas" w:hAnsi="Consolas" w:cs="Consolas"/>
+        </w:rPr>
+        <w:t>3 &gt; 5 || 10 == 7 + 3</w:t>
+      </w:r>
+      <w:r>
+        <w:rPr/>
+        <w:t xml:space="preserve">: </w:t>
+      </w:r>
+      <w:r>
+        <w:rPr>
+          <w:b/>
+        </w:rPr>
+        <w:t>true</w:t>
+      </w:r>
+      <w:r>
+        <w:rPr/>
+        <w:t xml:space="preserve"> (la prima parte è falsa, la seconda è vera);</w:t>
+      </w:r>
+    </w:p>
+    <w:p>
+      <w:pPr>
+        <w:numPr>
+          <w:ilvl w:val="0"/>
+          <w:numId w:val="1"/>
+        </w:numPr>
+      </w:pPr>
+      <w:r>
+        <w:rPr>
+          <w:rFonts w:ascii="Consolas" w:hAnsi="Consolas" w:cs="Consolas"/>
+        </w:rPr>
+        <w:t>3 != 5 &amp;&amp; (6 &lt; 2 || 5 + 2 == 10 - 3)</w:t>
+      </w:r>
+      <w:r>
+        <w:rPr/>
+        <w:t xml:space="preserve">: </w:t>
+      </w:r>
+      <w:r>
+        <w:rPr>
+          <w:b/>
+        </w:rPr>
+        <w:t>true</w:t>
+      </w:r>
+      <w:r>
+        <w:rPr/>
+        <w:t xml:space="preserve"> (3 è diverso da 5, e nella parentesi la seconda parte è vera: 7 == 7);</w:t>
+      </w:r>
+    </w:p>
+    <w:p>
+      <w:pPr>
+        <w:numPr>
+          <w:ilvl w:val="0"/>
+          <w:numId w:val="1"/>
+        </w:numPr>
+      </w:pPr>
+      <w:r>
+        <w:rPr>
+          <w:rFonts w:ascii="Consolas" w:hAnsi="Consolas" w:cs="Consolas"/>
+        </w:rPr>
+        <w:t>3 &lt; 5 &lt; 7</w:t>
+      </w:r>
+      <w:r>
+        <w:rPr/>
+        <w:t xml:space="preserve">: </w:t>
+      </w:r>
+      <w:r>
+        <w:rPr>
+          <w:b/>
+        </w:rPr>
+        <w:t>non va scritta così</w:t>
+      </w:r>
+      <w:r>
+        <w:rPr/>
+        <w:t xml:space="preserve"> (vedi sotto);</w:t>
+      </w:r>
+    </w:p>
+    <w:p>
+      <w:pPr>
+        <w:numPr>
+          <w:ilvl w:val="0"/>
+          <w:numId w:val="1"/>
+        </w:numPr>
+      </w:pPr>
+      <w:r>
+        <w:rPr>
+          <w:rFonts w:ascii="Consolas" w:hAnsi="Consolas" w:cs="Consolas"/>
+        </w:rPr>
+        <w:t>4 &gt; 3 &gt; 2</w:t>
+      </w:r>
+      <w:r>
+        <w:rPr/>
+        <w:t xml:space="preserve">: </w:t>
+      </w:r>
+      <w:r>
+        <w:rPr>
+          <w:b/>
+        </w:rPr>
+        <w:t>non va scritta così</w:t>
+      </w:r>
+      <w:r>
+        <w:rPr/>
+        <w:t>;</w:t>
+      </w:r>
+    </w:p>
+    <w:p>
+      <w:pPr>
+        <w:numPr>
+          <w:ilvl w:val="0"/>
+          <w:numId w:val="1"/>
+        </w:numPr>
+      </w:pPr>
+      <w:r>
+        <w:rPr>
+          <w:rFonts w:ascii="Consolas" w:hAnsi="Consolas" w:cs="Consolas"/>
+        </w:rPr>
+        <w:t>3 &lt; 5 &amp;&amp; 5 &lt; 7</w:t>
+      </w:r>
+      <w:r>
+        <w:rPr/>
+        <w:t xml:space="preserve">: </w:t>
+      </w:r>
+      <w:r>
+        <w:rPr>
+          <w:b/>
+        </w:rPr>
+        <w:t>true</w:t>
+      </w:r>
+      <w:r>
+        <w:rPr/>
+        <w:t>;</w:t>
+      </w:r>
+    </w:p>
+    <w:p>
+      <w:pPr>
+        <w:numPr>
+          <w:ilvl w:val="0"/>
+          <w:numId w:val="1"/>
+        </w:numPr>
+      </w:pPr>
+      <w:r>
+        <w:rPr>
+          <w:rFonts w:ascii="Consolas" w:hAnsi="Consolas" w:cs="Consolas"/>
+        </w:rPr>
+        <w:t>3 &lt; 5 &amp;&amp; 7 &lt; 5</w:t>
+      </w:r>
+      <w:r>
+        <w:rPr/>
+        <w:t xml:space="preserve">: </w:t>
+      </w:r>
+      <w:r>
+        <w:rPr>
+          <w:b/>
+        </w:rPr>
+        <w:t>false</w:t>
+      </w:r>
+      <w:r>
+        <w:rPr/>
+        <w:t>;</w:t>
+      </w:r>
+    </w:p>
+    <w:p>
+      <w:pPr>
+        <w:numPr>
+          <w:ilvl w:val="0"/>
+          <w:numId w:val="1"/>
+        </w:numPr>
+      </w:pPr>
+      <w:r>
+        <w:rPr>
+          <w:rFonts w:ascii="Consolas" w:hAnsi="Consolas" w:cs="Consolas"/>
+        </w:rPr>
+        <w:t>true &amp;&amp; false</w:t>
+      </w:r>
+      <w:r>
+        <w:rPr/>
+        <w:t xml:space="preserve">: </w:t>
+      </w:r>
+      <w:r>
+        <w:rPr>
+          <w:b/>
+        </w:rPr>
+        <w:t>false</w:t>
+      </w:r>
+      <w:r>
+        <w:rPr/>
+        <w:t xml:space="preserve"> (</w:t>
+      </w:r>
+      <w:r>
+        <w:rPr>
+          <w:rFonts w:ascii="Consolas" w:hAnsi="Consolas" w:cs="Consolas"/>
+        </w:rPr>
+        <w:t>true</w:t>
+      </w:r>
+      <w:r>
+        <w:rPr/>
+        <w:t xml:space="preserve"> e </w:t>
+      </w:r>
+      <w:r>
+        <w:rPr>
+          <w:rFonts w:ascii="Consolas" w:hAnsi="Consolas" w:cs="Consolas"/>
+        </w:rPr>
+        <w:t>false</w:t>
+      </w:r>
+      <w:r>
+        <w:rPr/>
+        <w:t xml:space="preserve"> richiedono </w:t>
+      </w:r>
+      <w:r>
+        <w:rPr>
+          <w:rFonts w:ascii="Consolas" w:hAnsi="Consolas" w:cs="Consolas"/>
+        </w:rPr>
+        <w:t>&lt;stdbool.h&gt;</w:t>
+      </w:r>
+      <w:r>
+        <w:rPr/>
+        <w:t>, capitolo 17);</w:t>
+      </w:r>
+    </w:p>
+    <w:p>
+      <w:pPr>
+        <w:numPr>
+          <w:ilvl w:val="0"/>
+          <w:numId w:val="1"/>
+        </w:numPr>
+      </w:pPr>
+      <w:r>
+        <w:rPr>
+          <w:rFonts w:ascii="Consolas" w:hAnsi="Consolas" w:cs="Consolas"/>
+        </w:rPr>
+        <w:t>true &amp;&amp; 5 &lt; 7</w:t>
+      </w:r>
+      <w:r>
+        <w:rPr/>
+        <w:t xml:space="preserve">: </w:t>
+      </w:r>
+      <w:r>
+        <w:rPr>
+          <w:b/>
+        </w:rPr>
+        <w:t>true</w:t>
+      </w:r>
+      <w:r>
+        <w:rPr/>
+        <w:t>;</w:t>
+      </w:r>
+    </w:p>
+    <w:p>
+      <w:pPr>
+        <w:numPr>
+          <w:ilvl w:val="0"/>
+          <w:numId w:val="1"/>
+        </w:numPr>
+      </w:pPr>
+      <w:r>
+        <w:rPr>
+          <w:rFonts w:ascii="Consolas" w:hAnsi="Consolas" w:cs="Consolas"/>
+        </w:rPr>
+        <w:t>false || 5 &lt; 10</w:t>
+      </w:r>
+      <w:r>
+        <w:rPr/>
+        <w:t xml:space="preserve">: </w:t>
+      </w:r>
+      <w:r>
+        <w:rPr>
+          <w:b/>
+        </w:rPr>
+        <w:t>true</w:t>
+      </w:r>
+      <w:r>
+        <w:rPr/>
+        <w:t>.</w:t>
+      </w:r>
+    </w:p>
+    <w:p>
+      <w:r>
+        <w:rPr/>
+        <w:t xml:space="preserve">Le due espressioni «con la catena» sono il trabocchetto dell'esercizio. In C i confronti si valutano </w:t>
+      </w:r>
+      <w:r>
+        <w:rPr>
+          <w:b/>
+        </w:rPr>
+        <w:t>uno alla volta, da sinistra a destra</w:t>
+      </w:r>
+      <w:r>
+        <w:rPr/>
+        <w:t xml:space="preserve">, e il risultato di un confronto è un intero, 1 se vero e 0 se falso. Quindi </w:t>
+      </w:r>
+      <w:r>
+        <w:rPr>
+          <w:rFonts w:ascii="Consolas" w:hAnsi="Consolas" w:cs="Consolas"/>
+        </w:rPr>
+        <w:t>3 &lt; 5 &lt; 7</w:t>
+      </w:r>
+      <w:r>
+        <w:rPr/>
+        <w:t xml:space="preserve"> diventa </w:t>
+      </w:r>
+      <w:r>
+        <w:rPr>
+          <w:rFonts w:ascii="Consolas" w:hAnsi="Consolas" w:cs="Consolas"/>
+        </w:rPr>
+        <w:t>(3 &lt; 5) &lt; 7</w:t>
+      </w:r>
+      <w:r>
+        <w:rPr/>
+        <w:t xml:space="preserve">, cioè </w:t>
+      </w:r>
+      <w:r>
+        <w:rPr>
+          <w:rFonts w:ascii="Consolas" w:hAnsi="Consolas" w:cs="Consolas"/>
+        </w:rPr>
+        <w:t>1 &lt; 7</w:t>
+      </w:r>
+      <w:r>
+        <w:rPr/>
+        <w:t xml:space="preserve">, che è vero, ma </w:t>
+      </w:r>
+      <w:r>
+        <w:rPr>
+          <w:b/>
+        </w:rPr>
+        <w:t>per il motivo sbagliato</w:t>
+      </w:r>
+      <w:r>
+        <w:rPr/>
+        <w:t xml:space="preserve">: non si è confrontato 5 con 7. E </w:t>
+      </w:r>
+      <w:r>
+        <w:rPr>
+          <w:rFonts w:ascii="Consolas" w:hAnsi="Consolas" w:cs="Consolas"/>
+        </w:rPr>
+        <w:t>4 &gt; 3 &gt; 2</w:t>
+      </w:r>
+      <w:r>
+        <w:rPr/>
+        <w:t xml:space="preserve"> diventa </w:t>
+      </w:r>
+      <w:r>
+        <w:rPr>
+          <w:rFonts w:ascii="Consolas" w:hAnsi="Consolas" w:cs="Consolas"/>
+        </w:rPr>
+        <w:t>(4 &gt; 3) &gt; 2</w:t>
+      </w:r>
+      <w:r>
+        <w:rPr/>
+        <w:t xml:space="preserve">, cioè </w:t>
+      </w:r>
+      <w:r>
+        <w:rPr>
+          <w:rFonts w:ascii="Consolas" w:hAnsi="Consolas" w:cs="Consolas"/>
+        </w:rPr>
+        <w:t>1 &gt; 2</w:t>
+      </w:r>
+      <w:r>
+        <w:rPr/>
+        <w:t xml:space="preserve">, che è </w:t>
+      </w:r>
+      <w:r>
+        <w:rPr>
+          <w:b/>
+        </w:rPr>
+        <w:t>falso</w:t>
+      </w:r>
+      <w:r>
+        <w:rPr/>
+        <w:t xml:space="preserve">, mentre in matematica 4 &gt; 3 &gt; 2 è vero. La scrittura corretta per dire «5 sta fra 3 e 7» è, come già visto nel capitolo 18, </w:t>
+      </w:r>
+      <w:r>
+        <w:rPr>
+          <w:rFonts w:ascii="Consolas" w:hAnsi="Consolas" w:cs="Consolas"/>
+        </w:rPr>
+        <w:t>3 &lt; 5 &amp;&amp; 5 &lt; 7</w:t>
+      </w:r>
+      <w:r>
+        <w:rPr/>
+        <w:t>.</w:t>
+      </w:r>
+    </w:p>
+    <w:p>
+      <w:r>
+        <w:rPr/>
+        <w:t xml:space="preserve">(In parole povere: in C non esiste la catena di disuguaglianze della matematica. Per dire «x sta fra a e b» bisogna scrivere due confronti separati e unirli con </w:t>
+      </w:r>
+      <w:r>
+        <w:rPr>
+          <w:rFonts w:ascii="Consolas" w:hAnsi="Consolas" w:cs="Consolas"/>
+        </w:rPr>
+        <w:t>&amp;&amp;</w:t>
+      </w:r>
+      <w:r>
+        <w:rPr/>
+        <w:t>.)</w:t>
+      </w:r>
+    </w:p>
+    <w:p>
+      <w:pPr>
+        <w:pStyle w:val="Titolo2"/>
+      </w:pPr>
+      <w:r>
+        <w:rPr>
+          <w:b/>
+          <w:color w:val="E97132"/>
+        </w:rPr>
+        <w:t>Il codice di booleani.c e le leggi di De Morgan</w:t>
+      </w:r>
+    </w:p>
+    <w:p>
+      <w:r>
+        <w:rPr/>
+        <w:t xml:space="preserve">Il laboratorio chiede di leggere il file </w:t>
+      </w:r>
+      <w:r>
+        <w:rPr>
+          <w:rFonts w:ascii="Consolas" w:hAnsi="Consolas" w:cs="Consolas"/>
+        </w:rPr>
+        <w:t>booleani.c</w:t>
+      </w:r>
+      <w:r>
+        <w:rPr/>
+        <w:t xml:space="preserve">, che contiene vari esempi di operazioni booleane in C, e di </w:t>
+      </w:r>
+      <w:r>
+        <w:rPr>
+          <w:b/>
+        </w:rPr>
+        <w:t>procedere con gli esercizi successivi solo dopo aver capito tutte le operazioni di quel codice</w:t>
+      </w:r>
+      <w:r>
+        <w:rPr/>
+        <w:t xml:space="preserve">. Come promemoria, per compilare si usano i comandi </w:t>
+      </w:r>
+      <w:r>
+        <w:rPr>
+          <w:rFonts w:ascii="Consolas" w:hAnsi="Consolas" w:cs="Consolas"/>
+        </w:rPr>
+        <w:t>gcc -Wall booleani.c -o booleani</w:t>
+      </w:r>
+      <w:r>
+        <w:rPr/>
+        <w:t xml:space="preserve"> (Unix) oppure </w:t>
+      </w:r>
+      <w:r>
+        <w:rPr>
+          <w:rFonts w:ascii="Consolas" w:hAnsi="Consolas" w:cs="Consolas"/>
+        </w:rPr>
+        <w:t>gcc -Wall booleani.c -o booleani.exe</w:t>
+      </w:r>
+      <w:r>
+        <w:rPr/>
+        <w:t xml:space="preserve"> (Windows).</w:t>
+      </w:r>
+    </w:p>
+    <w:p>
+      <w:r>
+        <w:rPr/>
+        <w:t xml:space="preserve">Il laboratorio ricorda anche le </w:t>
+      </w:r>
+      <w:r>
+        <w:rPr>
+          <w:b/>
+        </w:rPr>
+        <w:t>leggi di De Morgan</w:t>
+      </w:r>
+      <w:r>
+        <w:rPr/>
+        <w:t>, che stabiliscono una relazione di equivalenza fra congiunzione e disgiunzione logica e si possono riassumere così:</w:t>
+      </w:r>
+    </w:p>
+    <w:p>
+      <w:pPr>
+        <w:numPr>
+          <w:ilvl w:val="0"/>
+          <w:numId w:val="1"/>
+        </w:numPr>
+      </w:pPr>
+      <w:r>
+        <w:rPr/>
+        <w:t>¬(a ∧ b) = ¬a ∨ ¬b</w:t>
+      </w:r>
+    </w:p>
+    <w:p>
+      <w:pPr>
+        <w:numPr>
+          <w:ilvl w:val="0"/>
+          <w:numId w:val="1"/>
+        </w:numPr>
+      </w:pPr>
+      <w:r>
+        <w:rPr/>
+        <w:t>¬(a ∨ b) = ¬a ∧ ¬b</w:t>
+      </w:r>
+    </w:p>
+    <w:p>
+      <w:r>
+        <w:rPr/>
+        <w:t xml:space="preserve">In C si scrivono </w:t>
+      </w:r>
+      <w:r>
+        <w:rPr>
+          <w:rFonts w:ascii="Consolas" w:hAnsi="Consolas" w:cs="Consolas"/>
+        </w:rPr>
+        <w:t>!(a &amp;&amp; b)</w:t>
+      </w:r>
+      <w:r>
+        <w:rPr/>
+        <w:t xml:space="preserve"> equivalente a </w:t>
+      </w:r>
+      <w:r>
+        <w:rPr>
+          <w:rFonts w:ascii="Consolas" w:hAnsi="Consolas" w:cs="Consolas"/>
+        </w:rPr>
+        <w:t>!a || !b</w:t>
+      </w:r>
+      <w:r>
+        <w:rPr/>
+        <w:t xml:space="preserve">, e </w:t>
+      </w:r>
+      <w:r>
+        <w:rPr>
+          <w:rFonts w:ascii="Consolas" w:hAnsi="Consolas" w:cs="Consolas"/>
+        </w:rPr>
+        <w:t>!(a || b)</w:t>
+      </w:r>
+      <w:r>
+        <w:rPr/>
+        <w:t xml:space="preserve"> equivalente a </w:t>
+      </w:r>
+      <w:r>
+        <w:rPr>
+          <w:rFonts w:ascii="Consolas" w:hAnsi="Consolas" w:cs="Consolas"/>
+        </w:rPr>
+        <w:t>!a &amp;&amp; !b</w:t>
+      </w:r>
+      <w:r>
+        <w:rPr/>
+        <w:t>.</w:t>
+      </w:r>
+    </w:p>
+    <w:p>
+      <w:r>
+        <w:rPr/>
+        <w:t>(In parole povere: per negare «a e b insieme» basta dire «manca almeno uno dei due», cioè «non a oppure non b». E per negare «a oppure b» bisogna dire «mancano tutti e due», cioè «non a e non b». Si cambia l'operatore e si nega ciascun pezzo.)</w:t>
+      </w:r>
+    </w:p>
+    <w:p>
+      <w:pPr>
+        <w:pStyle w:val="Titolo2"/>
+      </w:pPr>
+      <w:r>
+        <w:rPr>
+          <w:b/>
+          <w:color w:val="E97132"/>
+        </w:rPr>
+        <w:t>I sei esercizi booleani</w:t>
+      </w:r>
+    </w:p>
+    <w:p>
+      <w:r>
+        <w:rPr/>
+        <w:t xml:space="preserve">Il file </w:t>
+      </w:r>
+      <w:r>
+        <w:rPr>
+          <w:rFonts w:ascii="Consolas" w:hAnsi="Consolas" w:cs="Consolas"/>
+        </w:rPr>
+        <w:t>esercizi_booleani.c</w:t>
+      </w:r>
+      <w:r>
+        <w:rPr/>
+        <w:t xml:space="preserve"> va aperto e completato implementando sei punti. Le soluzioni qui sotto sono ricavate da noi ragionando sul testo (le slide non le riportano):</w:t>
+      </w:r>
+    </w:p>
+    <w:p>
+      <w:r>
+        <w:rPr/>
+        <w:t xml:space="preserve">1. </w:t>
+      </w:r>
+      <w:r>
+        <w:rPr>
+          <w:b/>
+        </w:rPr>
+        <w:t>Multiplo</w:t>
+      </w:r>
+      <w:r>
+        <w:rPr/>
+        <w:t xml:space="preserve">: dati due interi a e b, stampare 1 se il primo è multiplo del secondo, 0 altrimenti. Un numero a è multiplo di b quando la divisione dà resto zero (con b diverso da zero): </w:t>
+      </w:r>
+      <w:r>
+        <w:rPr>
+          <w:rFonts w:ascii="Consolas" w:hAnsi="Consolas" w:cs="Consolas"/>
+        </w:rPr>
+        <w:t>printf("%d\n", a % b == 0);</w:t>
+      </w:r>
+      <w:r>
+        <w:rPr/>
+        <w:t>. Il risultato di un confronto è già 0 o 1, quindi si può stampare direttamente.</w:t>
+      </w:r>
+    </w:p>
+    <w:p>
+      <w:r>
+        <w:rPr/>
+        <w:t xml:space="preserve">2. </w:t>
+      </w:r>
+      <w:r>
+        <w:rPr>
+          <w:b/>
+        </w:rPr>
+        <w:t>Voto valido</w:t>
+      </w:r>
+      <w:r>
+        <w:rPr/>
+        <w:t xml:space="preserve">: dato un voto a, stampare «true» se è compreso fra 1 e 30 inclusi, «false» altrimenti. Servono due confronti uniti da </w:t>
+      </w:r>
+      <w:r>
+        <w:rPr>
+          <w:rFonts w:ascii="Consolas" w:hAnsi="Consolas" w:cs="Consolas"/>
+        </w:rPr>
+        <w:t>&amp;&amp;</w:t>
+      </w:r>
+      <w:r>
+        <w:rPr/>
+        <w:t xml:space="preserve">: la condizione è </w:t>
+      </w:r>
+      <w:r>
+        <w:rPr>
+          <w:rFonts w:ascii="Consolas" w:hAnsi="Consolas" w:cs="Consolas"/>
+        </w:rPr>
+        <w:t>a &gt;= 1 &amp;&amp; a &lt;= 30</w:t>
+      </w:r>
+      <w:r>
+        <w:rPr/>
+        <w:t xml:space="preserve">, e per stampare la parola e non 0/1 si scrive </w:t>
+      </w:r>
+      <w:r>
+        <w:rPr>
+          <w:rFonts w:ascii="Consolas" w:hAnsi="Consolas" w:cs="Consolas"/>
+        </w:rPr>
+        <w:t>printf("%s\n", (a &gt;= 1 &amp;&amp; a &lt;= 30) ? "true" : "false");</w:t>
+      </w:r>
+      <w:r>
+        <w:rPr/>
+        <w:t xml:space="preserve"> (operatore ternario, capitolo 18).</w:t>
+      </w:r>
+    </w:p>
+    <w:p>
+      <w:r>
+        <w:rPr/>
+        <w:t xml:space="preserve">3. </w:t>
+      </w:r>
+      <w:r>
+        <w:rPr>
+          <w:b/>
+        </w:rPr>
+        <w:t>Negazione dell'and</w:t>
+      </w:r>
+      <w:r>
+        <w:rPr/>
+        <w:t xml:space="preserve">: dati due booleani b1 e b2, stampare «false» se sono entrambi veri, «true» altrimenti. È la negazione dell'and, </w:t>
+      </w:r>
+      <w:r>
+        <w:rPr>
+          <w:rFonts w:ascii="Consolas" w:hAnsi="Consolas" w:cs="Consolas"/>
+        </w:rPr>
+        <w:t>!(b1 &amp;&amp; b2)</w:t>
+      </w:r>
+      <w:r>
+        <w:rPr/>
+        <w:t xml:space="preserve">, che per De Morgan equivale a </w:t>
+      </w:r>
+      <w:r>
+        <w:rPr>
+          <w:rFonts w:ascii="Consolas" w:hAnsi="Consolas" w:cs="Consolas"/>
+        </w:rPr>
+        <w:t>!b1 || !b2</w:t>
+      </w:r>
+      <w:r>
+        <w:rPr/>
+        <w:t xml:space="preserve">; anche qui si stampa la parola con </w:t>
+      </w:r>
+      <w:r>
+        <w:rPr>
+          <w:rFonts w:ascii="Consolas" w:hAnsi="Consolas" w:cs="Consolas"/>
+        </w:rPr>
+        <w:t>printf("%s\n", !(b1 &amp;&amp; b2) ? "true" : "false");</w:t>
+      </w:r>
+      <w:r>
+        <w:rPr/>
+        <w:t>.</w:t>
+      </w:r>
+    </w:p>
+    <w:p>
+      <w:r>
+        <w:rPr/>
+        <w:t xml:space="preserve">4. </w:t>
+      </w:r>
+      <w:r>
+        <w:rPr>
+          <w:b/>
+        </w:rPr>
+        <w:t>Massimo di due, con uguali</w:t>
+      </w:r>
+      <w:r>
+        <w:rPr/>
+        <w:t>: dati a e b, stampare il massimo; se sono uguali stampare «I due valori sono uguali». Servono tre casi distinti:</w:t>
+      </w:r>
+    </w:p>
+    <w:p>
+      <w:pPr>
+        <w:spacing w:after="0" w:before="0" w:line="240" w:lineRule="auto"/>
+      </w:pPr>
+      <w:r>
+        <w:rPr>
+          <w:rFonts w:ascii="Consolas" w:hAnsi="Consolas" w:cs="Consolas"/>
+          <w:sz w:val="17"/>
+        </w:rPr>
+        <w:t>if (a &gt; b) {</w:t>
+      </w:r>
+    </w:p>
+    <w:p>
+      <w:pPr>
+        <w:spacing w:after="0" w:before="0" w:line="240" w:lineRule="auto"/>
+      </w:pPr>
+      <w:r>
+        <w:rPr>
+          <w:rFonts w:ascii="Consolas" w:hAnsi="Consolas" w:cs="Consolas"/>
+          <w:sz w:val="17"/>
+        </w:rPr>
+        <w:t xml:space="preserve">    printf("%d\n", a);</w:t>
+      </w:r>
+    </w:p>
+    <w:p>
+      <w:pPr>
+        <w:spacing w:after="0" w:before="0" w:line="240" w:lineRule="auto"/>
+      </w:pPr>
+      <w:r>
+        <w:rPr>
+          <w:rFonts w:ascii="Consolas" w:hAnsi="Consolas" w:cs="Consolas"/>
+          <w:sz w:val="17"/>
+        </w:rPr>
+        <w:t>}</w:t>
+      </w:r>
+    </w:p>
+    <w:p>
+      <w:pPr>
+        <w:spacing w:after="0" w:before="0" w:line="240" w:lineRule="auto"/>
+      </w:pPr>
+      <w:r>
+        <w:rPr>
+          <w:rFonts w:ascii="Consolas" w:hAnsi="Consolas" w:cs="Consolas"/>
+          <w:sz w:val="17"/>
+        </w:rPr>
+        <w:t>else if (b &gt; a) {</w:t>
+      </w:r>
+    </w:p>
+    <w:p>
+      <w:pPr>
+        <w:spacing w:after="0" w:before="0" w:line="240" w:lineRule="auto"/>
+      </w:pPr>
+      <w:r>
+        <w:rPr>
+          <w:rFonts w:ascii="Consolas" w:hAnsi="Consolas" w:cs="Consolas"/>
+          <w:sz w:val="17"/>
+        </w:rPr>
+        <w:t xml:space="preserve">    printf("%d\n", b);</w:t>
+      </w:r>
+    </w:p>
+    <w:p>
+      <w:pPr>
+        <w:spacing w:after="0" w:before="0" w:line="240" w:lineRule="auto"/>
+      </w:pPr>
+      <w:r>
+        <w:rPr>
+          <w:rFonts w:ascii="Consolas" w:hAnsi="Consolas" w:cs="Consolas"/>
+          <w:sz w:val="17"/>
+        </w:rPr>
+        <w:t>}</w:t>
+      </w:r>
+    </w:p>
+    <w:p>
+      <w:pPr>
+        <w:spacing w:after="0" w:before="0" w:line="240" w:lineRule="auto"/>
+      </w:pPr>
+      <w:r>
+        <w:rPr>
+          <w:rFonts w:ascii="Consolas" w:hAnsi="Consolas" w:cs="Consolas"/>
+          <w:sz w:val="17"/>
+        </w:rPr>
+        <w:t>else {</w:t>
+      </w:r>
+    </w:p>
+    <w:p>
+      <w:pPr>
+        <w:spacing w:after="0" w:before="0" w:line="240" w:lineRule="auto"/>
+      </w:pPr>
+      <w:r>
+        <w:rPr>
+          <w:rFonts w:ascii="Consolas" w:hAnsi="Consolas" w:cs="Consolas"/>
+          <w:sz w:val="17"/>
+        </w:rPr>
+        <w:t xml:space="preserve">    printf("I due valori sono uguali\n");</w:t>
+      </w:r>
+    </w:p>
+    <w:p>
+      <w:pPr>
+        <w:spacing w:after="0" w:before="0" w:line="240" w:lineRule="auto"/>
+      </w:pPr>
+      <w:r>
+        <w:rPr>
+          <w:rFonts w:ascii="Consolas" w:hAnsi="Consolas" w:cs="Consolas"/>
+          <w:sz w:val="17"/>
+        </w:rPr>
+        <w:t>}</w:t>
+      </w:r>
+    </w:p>
+    <w:p/>
+    <w:p>
+      <w:r>
+        <w:rPr/>
+        <w:t xml:space="preserve">5. </w:t>
+      </w:r>
+      <w:r>
+        <w:rPr>
+          <w:b/>
+        </w:rPr>
+        <w:t>Massimo di tre</w:t>
+      </w:r>
+      <w:r>
+        <w:rPr/>
+        <w:t xml:space="preserve">: dati a, b e c, stampare il massimo usando una variabile di supporto </w:t>
+      </w:r>
+      <w:r>
+        <w:rPr>
+          <w:rFonts w:ascii="Consolas" w:hAnsi="Consolas" w:cs="Consolas"/>
+        </w:rPr>
+        <w:t>max</w:t>
+      </w:r>
+      <w:r>
+        <w:rPr/>
+        <w:t>. L'idea è quella dell'«emersione del massimo»: si parte da un candidato e lo si sostituisce quando se ne trova uno più grande:</w:t>
+      </w:r>
+    </w:p>
+    <w:p>
+      <w:pPr>
+        <w:spacing w:after="0" w:before="0" w:line="240" w:lineRule="auto"/>
+      </w:pPr>
+      <w:r>
+        <w:rPr>
+          <w:rFonts w:ascii="Consolas" w:hAnsi="Consolas" w:cs="Consolas"/>
+          <w:sz w:val="17"/>
+        </w:rPr>
+        <w:t>int max = a;</w:t>
+      </w:r>
+    </w:p>
+    <w:p>
+      <w:pPr>
+        <w:spacing w:after="0" w:before="0" w:line="240" w:lineRule="auto"/>
+      </w:pPr>
+      <w:r>
+        <w:rPr>
+          <w:rFonts w:ascii="Consolas" w:hAnsi="Consolas" w:cs="Consolas"/>
+          <w:sz w:val="17"/>
+        </w:rPr>
+        <w:t>if (b &gt; max) {</w:t>
+      </w:r>
+    </w:p>
+    <w:p>
+      <w:pPr>
+        <w:spacing w:after="0" w:before="0" w:line="240" w:lineRule="auto"/>
+      </w:pPr>
+      <w:r>
+        <w:rPr>
+          <w:rFonts w:ascii="Consolas" w:hAnsi="Consolas" w:cs="Consolas"/>
+          <w:sz w:val="17"/>
+        </w:rPr>
+        <w:t xml:space="preserve">    max = b;</w:t>
+      </w:r>
+    </w:p>
+    <w:p>
+      <w:pPr>
+        <w:spacing w:after="0" w:before="0" w:line="240" w:lineRule="auto"/>
+      </w:pPr>
+      <w:r>
+        <w:rPr>
+          <w:rFonts w:ascii="Consolas" w:hAnsi="Consolas" w:cs="Consolas"/>
+          <w:sz w:val="17"/>
+        </w:rPr>
+        <w:t>}</w:t>
+      </w:r>
+    </w:p>
+    <w:p>
+      <w:pPr>
+        <w:spacing w:after="0" w:before="0" w:line="240" w:lineRule="auto"/>
+      </w:pPr>
+      <w:r>
+        <w:rPr>
+          <w:rFonts w:ascii="Consolas" w:hAnsi="Consolas" w:cs="Consolas"/>
+          <w:sz w:val="17"/>
+        </w:rPr>
+        <w:t>if (c &gt; max) {</w:t>
+      </w:r>
+    </w:p>
+    <w:p>
+      <w:pPr>
+        <w:spacing w:after="0" w:before="0" w:line="240" w:lineRule="auto"/>
+      </w:pPr>
+      <w:r>
+        <w:rPr>
+          <w:rFonts w:ascii="Consolas" w:hAnsi="Consolas" w:cs="Consolas"/>
+          <w:sz w:val="17"/>
+        </w:rPr>
+        <w:t xml:space="preserve">    max = c;</w:t>
+      </w:r>
+    </w:p>
+    <w:p>
+      <w:pPr>
+        <w:spacing w:after="0" w:before="0" w:line="240" w:lineRule="auto"/>
+      </w:pPr>
+      <w:r>
+        <w:rPr>
+          <w:rFonts w:ascii="Consolas" w:hAnsi="Consolas" w:cs="Consolas"/>
+          <w:sz w:val="17"/>
+        </w:rPr>
+        <w:t>}</w:t>
+      </w:r>
+    </w:p>
+    <w:p>
+      <w:pPr>
+        <w:spacing w:after="0" w:before="0" w:line="240" w:lineRule="auto"/>
+      </w:pPr>
+      <w:r>
+        <w:rPr>
+          <w:rFonts w:ascii="Consolas" w:hAnsi="Consolas" w:cs="Consolas"/>
+          <w:sz w:val="17"/>
+        </w:rPr>
+        <w:t>printf("%d\n", max);</w:t>
+      </w:r>
+    </w:p>
+    <w:p/>
+    <w:p>
+      <w:r>
+        <w:rPr/>
+        <w:t xml:space="preserve">6. </w:t>
+      </w:r>
+      <w:r>
+        <w:rPr>
+          <w:b/>
+        </w:rPr>
+        <w:t>Ordinati</w:t>
+      </w:r>
+      <w:r>
+        <w:rPr/>
+        <w:t xml:space="preserve">: dati tre interi a, b e c, stampare «ordinati» se sono in ordine crescente, altrimenti niente. Basta confrontare le coppie vicine: </w:t>
+      </w:r>
+      <w:r>
+        <w:rPr>
+          <w:rFonts w:ascii="Consolas" w:hAnsi="Consolas" w:cs="Consolas"/>
+        </w:rPr>
+        <w:t>if (a &lt;= b &amp;&amp; b &lt;= c) { printf("ordinati\n"); }</w:t>
+      </w:r>
+      <w:r>
+        <w:rPr/>
+        <w:t xml:space="preserve">. Il testo non precisa se «crescente» sia in senso stretto o largo: con </w:t>
+      </w:r>
+      <w:r>
+        <w:rPr>
+          <w:rFonts w:ascii="Consolas" w:hAnsi="Consolas" w:cs="Consolas"/>
+        </w:rPr>
+        <w:t>&lt;</w:t>
+      </w:r>
+      <w:r>
+        <w:rPr/>
+        <w:t xml:space="preserve"> al posto di </w:t>
+      </w:r>
+      <w:r>
+        <w:rPr>
+          <w:rFonts w:ascii="Consolas" w:hAnsi="Consolas" w:cs="Consolas"/>
+        </w:rPr>
+        <w:t>&lt;=</w:t>
+      </w:r>
+      <w:r>
+        <w:rPr/>
+        <w:t xml:space="preserve"> si richiederebbe che siano tutti distinti,: il testo non lo dice, quindi la scelta va fatta in base a come lo intende l'esercizio.</w:t>
+      </w:r>
+    </w:p>
+    <w:p>
+      <w:r>
+        <w:rPr/>
+        <w:t xml:space="preserve">Notare che nel punto 6 la condizione non si scrive </w:t>
+      </w:r>
+      <w:r>
+        <w:rPr>
+          <w:rFonts w:ascii="Consolas" w:hAnsi="Consolas" w:cs="Consolas"/>
+        </w:rPr>
+        <w:t>a &lt;= b &lt;= c</w:t>
+      </w:r>
+      <w:r>
+        <w:rPr/>
+        <w:t>: sarebbe lo stesso errore delle espressioni a catena viste sopra.</w:t>
+      </w:r>
+    </w:p>
+    <w:p>
+      <w:pPr>
+        <w:pStyle w:val="Titolo2"/>
+      </w:pPr>
+      <w:r>
+        <w:rPr>
+          <w:b/>
+          <w:color w:val="E97132"/>
+        </w:rPr>
+        <w:t>Errori insidiosi con if e else</w:t>
+      </w:r>
+    </w:p>
+    <w:p>
+      <w:r>
+        <w:rPr/>
+        <w:t xml:space="preserve">Il laboratorio fa osservare due frammenti di codice sbagliati, chiedendo di trovare gli errori. Sono entrambi </w:t>
+      </w:r>
+      <w:r>
+        <w:rPr>
+          <w:b/>
+        </w:rPr>
+        <w:t>insidiosi</w:t>
+      </w:r>
+      <w:r>
+        <w:rPr/>
+        <w:t xml:space="preserve"> perché il codice </w:t>
+      </w:r>
+      <w:r>
+        <w:rPr>
+          <w:b/>
+        </w:rPr>
+        <w:t>compila senza segnalare problemi</w:t>
+      </w:r>
+      <w:r>
+        <w:rPr/>
+        <w:t>.</w:t>
+      </w:r>
+    </w:p>
+    <w:p>
+      <w:r>
+        <w:rPr/>
+        <w:t>Il primo è:</w:t>
+      </w:r>
+    </w:p>
+    <w:p>
+      <w:pPr>
+        <w:spacing w:after="0" w:before="0" w:line="240" w:lineRule="auto"/>
+      </w:pPr>
+      <w:r>
+        <w:rPr>
+          <w:rFonts w:ascii="Consolas" w:hAnsi="Consolas" w:cs="Consolas"/>
+          <w:sz w:val="17"/>
+        </w:rPr>
+        <w:t>#include &lt;stdio.h&gt;</w:t>
+      </w:r>
+    </w:p>
+    <w:p>
+      <w:pPr>
+        <w:spacing w:after="0" w:before="0" w:line="240" w:lineRule="auto"/>
+      </w:pPr>
+      <w:r>
+        <w:rPr>
+          <w:rFonts w:ascii="Consolas" w:hAnsi="Consolas" w:cs="Consolas"/>
+          <w:sz w:val="17"/>
+        </w:rPr>
+        <w:t>int main() {</w:t>
+      </w:r>
+    </w:p>
+    <w:p>
+      <w:pPr>
+        <w:spacing w:after="0" w:before="0" w:line="240" w:lineRule="auto"/>
+      </w:pPr>
+      <w:r>
+        <w:rPr>
+          <w:rFonts w:ascii="Consolas" w:hAnsi="Consolas" w:cs="Consolas"/>
+          <w:sz w:val="17"/>
+        </w:rPr>
+        <w:t xml:space="preserve">    int voto;</w:t>
+      </w:r>
+    </w:p>
+    <w:p>
+      <w:pPr>
+        <w:spacing w:after="0" w:before="0" w:line="240" w:lineRule="auto"/>
+      </w:pPr>
+      <w:r>
+        <w:rPr>
+          <w:rFonts w:ascii="Consolas" w:hAnsi="Consolas" w:cs="Consolas"/>
+          <w:sz w:val="17"/>
+        </w:rPr>
+        <w:t xml:space="preserve">    scanf("%d", &amp;voto);</w:t>
+      </w:r>
+    </w:p>
+    <w:p>
+      <w:pPr>
+        <w:spacing w:after="0" w:before="0" w:line="240" w:lineRule="auto"/>
+      </w:pPr>
+      <w:r>
+        <w:rPr>
+          <w:rFonts w:ascii="Consolas" w:hAnsi="Consolas" w:cs="Consolas"/>
+          <w:sz w:val="17"/>
+        </w:rPr>
+        <w:t xml:space="preserve">    if (voto &gt;= 18);</w:t>
+      </w:r>
+    </w:p>
+    <w:p>
+      <w:pPr>
+        <w:spacing w:after="0" w:before="0" w:line="240" w:lineRule="auto"/>
+      </w:pPr>
+      <w:r>
+        <w:rPr>
+          <w:rFonts w:ascii="Consolas" w:hAnsi="Consolas" w:cs="Consolas"/>
+          <w:sz w:val="17"/>
+        </w:rPr>
+        <w:t xml:space="preserve">    printf("Esame passato.\n");</w:t>
+      </w:r>
+    </w:p>
+    <w:p>
+      <w:pPr>
+        <w:spacing w:after="0" w:before="0" w:line="240" w:lineRule="auto"/>
+      </w:pPr>
+      <w:r>
+        <w:rPr>
+          <w:rFonts w:ascii="Consolas" w:hAnsi="Consolas" w:cs="Consolas"/>
+          <w:sz w:val="17"/>
+        </w:rPr>
+        <w:t>}</w:t>
+      </w:r>
+    </w:p>
+    <w:p/>
+    <w:p>
+      <w:r>
+        <w:rPr/>
+        <w:t xml:space="preserve">L'errore è il </w:t>
+      </w:r>
+      <w:r>
+        <w:rPr>
+          <w:b/>
+        </w:rPr>
+        <w:t>punto e virgola</w:t>
+      </w:r>
+      <w:r>
+        <w:rPr/>
+        <w:t xml:space="preserve"> subito dopo la condizione. Per il linguaggio C è come se fosse scritto </w:t>
+      </w:r>
+      <w:r>
+        <w:rPr>
+          <w:rFonts w:ascii="Consolas" w:hAnsi="Consolas" w:cs="Consolas"/>
+        </w:rPr>
+        <w:t>if (voto &gt;= 18) ;</w:t>
+      </w:r>
+      <w:r>
+        <w:rPr/>
+        <w:t xml:space="preserve"> seguito da </w:t>
+      </w:r>
+      <w:r>
+        <w:rPr>
+          <w:rFonts w:ascii="Consolas" w:hAnsi="Consolas" w:cs="Consolas"/>
+        </w:rPr>
+        <w:t>printf(...)</w:t>
+      </w:r>
+      <w:r>
+        <w:rPr/>
+        <w:t xml:space="preserve">: il </w:t>
+      </w:r>
+      <w:r>
+        <w:rPr>
+          <w:rFonts w:ascii="Consolas" w:hAnsi="Consolas" w:cs="Consolas"/>
+        </w:rPr>
+        <w:t>;</w:t>
+      </w:r>
+      <w:r>
+        <w:rPr/>
+        <w:t xml:space="preserve"> è un'</w:t>
+      </w:r>
+      <w:r>
+        <w:rPr>
+          <w:b/>
+        </w:rPr>
+        <w:t>istruzione vuota</w:t>
+      </w:r>
+      <w:r>
+        <w:rPr/>
+        <w:t xml:space="preserve">, e la </w:t>
+      </w:r>
+      <w:r>
+        <w:rPr>
+          <w:rFonts w:ascii="Consolas" w:hAnsi="Consolas" w:cs="Consolas"/>
+        </w:rPr>
+        <w:t>printf</w:t>
+      </w:r>
+      <w:r>
+        <w:rPr/>
+        <w:t xml:space="preserve"> non fa parte dell'</w:t>
+      </w:r>
+      <w:r>
+        <w:rPr>
+          <w:rFonts w:ascii="Consolas" w:hAnsi="Consolas" w:cs="Consolas"/>
+        </w:rPr>
+        <w:t>if</w:t>
+      </w:r>
+      <w:r>
+        <w:rPr/>
+        <w:t xml:space="preserve"> e viene eseguita </w:t>
+      </w:r>
+      <w:r>
+        <w:rPr>
+          <w:b/>
+        </w:rPr>
+        <w:t>sempre</w:t>
+      </w:r>
+      <w:r>
+        <w:rPr/>
+        <w:t>, anche se il voto è inferiore a 18.</w:t>
+      </w:r>
+    </w:p>
+    <w:p>
+      <w:r>
+        <w:rPr/>
+        <w:t>Il secondo è:</w:t>
+      </w:r>
+    </w:p>
+    <w:p>
+      <w:pPr>
+        <w:spacing w:after="0" w:before="0" w:line="240" w:lineRule="auto"/>
+      </w:pPr>
+      <w:r>
+        <w:rPr>
+          <w:rFonts w:ascii="Consolas" w:hAnsi="Consolas" w:cs="Consolas"/>
+          <w:sz w:val="17"/>
+        </w:rPr>
+        <w:t>if (voto &gt;= 18)</w:t>
+      </w:r>
+    </w:p>
+    <w:p>
+      <w:pPr>
+        <w:spacing w:after="0" w:before="0" w:line="240" w:lineRule="auto"/>
+      </w:pPr>
+      <w:r>
+        <w:rPr>
+          <w:rFonts w:ascii="Consolas" w:hAnsi="Consolas" w:cs="Consolas"/>
+          <w:sz w:val="17"/>
+        </w:rPr>
+        <w:t xml:space="preserve">    printf("Esame passato.\n");</w:t>
+      </w:r>
+    </w:p>
+    <w:p>
+      <w:pPr>
+        <w:spacing w:after="0" w:before="0" w:line="240" w:lineRule="auto"/>
+      </w:pPr>
+      <w:r>
+        <w:rPr>
+          <w:rFonts w:ascii="Consolas" w:hAnsi="Consolas" w:cs="Consolas"/>
+          <w:sz w:val="17"/>
+        </w:rPr>
+        <w:t>else</w:t>
+      </w:r>
+    </w:p>
+    <w:p>
+      <w:pPr>
+        <w:spacing w:after="0" w:before="0" w:line="240" w:lineRule="auto"/>
+      </w:pPr>
+      <w:r>
+        <w:rPr>
+          <w:rFonts w:ascii="Consolas" w:hAnsi="Consolas" w:cs="Consolas"/>
+          <w:sz w:val="17"/>
+        </w:rPr>
+        <w:t xml:space="preserve">    printf("Esame non passato.\n");</w:t>
+      </w:r>
+    </w:p>
+    <w:p>
+      <w:pPr>
+        <w:spacing w:after="0" w:before="0" w:line="240" w:lineRule="auto"/>
+      </w:pPr>
+      <w:r>
+        <w:rPr>
+          <w:rFonts w:ascii="Consolas" w:hAnsi="Consolas" w:cs="Consolas"/>
+          <w:sz w:val="17"/>
+        </w:rPr>
+        <w:t xml:space="preserve">    printf("Ripresentarsi al prossimo appello.\n");</w:t>
+      </w:r>
+    </w:p>
+    <w:p/>
+    <w:p>
+      <w:r>
+        <w:rPr/>
+        <w:t xml:space="preserve">Mancano le </w:t>
+      </w:r>
+      <w:r>
+        <w:rPr>
+          <w:b/>
+        </w:rPr>
+        <w:t>graffe</w:t>
+      </w:r>
+      <w:r>
+        <w:rPr/>
+        <w:t xml:space="preserve"> per un blocco </w:t>
+      </w:r>
+      <w:r>
+        <w:rPr>
+          <w:rFonts w:ascii="Consolas" w:hAnsi="Consolas" w:cs="Consolas"/>
+        </w:rPr>
+        <w:t>else</w:t>
+      </w:r>
+      <w:r>
+        <w:rPr/>
+        <w:t xml:space="preserve"> con più di un'istruzione (nelle slide il codice è privo di indentazione, e compila senza segnalazioni; un compilatore recente con </w:t>
+      </w:r>
+      <w:r>
+        <w:rPr>
+          <w:rFonts w:ascii="Consolas" w:hAnsi="Consolas" w:cs="Consolas"/>
+        </w:rPr>
+        <w:t>-Wall</w:t>
+      </w:r>
+      <w:r>
+        <w:rPr/>
+        <w:t xml:space="preserve"> può avvisare dell'indentazione ingannevole, ma non dà errore). Per il C solo la </w:t>
+      </w:r>
+      <w:r>
+        <w:rPr>
+          <w:b/>
+        </w:rPr>
+        <w:t>prima</w:t>
+      </w:r>
+      <w:r>
+        <w:rPr/>
+        <w:t xml:space="preserve"> istruzione dopo la parola chiave </w:t>
+      </w:r>
+      <w:r>
+        <w:rPr>
+          <w:rFonts w:ascii="Consolas" w:hAnsi="Consolas" w:cs="Consolas"/>
+        </w:rPr>
+        <w:t>else</w:t>
+      </w:r>
+      <w:r>
+        <w:rPr/>
+        <w:t xml:space="preserve"> appartiene al blocco condizionale: l'ultima </w:t>
+      </w:r>
+      <w:r>
+        <w:rPr>
+          <w:rFonts w:ascii="Consolas" w:hAnsi="Consolas" w:cs="Consolas"/>
+        </w:rPr>
+        <w:t>printf</w:t>
+      </w:r>
+      <w:r>
+        <w:rPr/>
+        <w:t xml:space="preserve"> è quindi eseguita sempre, anche per chi ha passato l'esame. La versione corretta racchiude il blocco fra graffe:</w:t>
+      </w:r>
+    </w:p>
+    <w:p>
+      <w:pPr>
+        <w:spacing w:after="0" w:before="0" w:line="240" w:lineRule="auto"/>
+      </w:pPr>
+      <w:r>
+        <w:rPr>
+          <w:rFonts w:ascii="Consolas" w:hAnsi="Consolas" w:cs="Consolas"/>
+          <w:sz w:val="17"/>
+        </w:rPr>
+        <w:t>if (voto &gt;= 18) {</w:t>
+      </w:r>
+    </w:p>
+    <w:p>
+      <w:pPr>
+        <w:spacing w:after="0" w:before="0" w:line="240" w:lineRule="auto"/>
+      </w:pPr>
+      <w:r>
+        <w:rPr>
+          <w:rFonts w:ascii="Consolas" w:hAnsi="Consolas" w:cs="Consolas"/>
+          <w:sz w:val="17"/>
+        </w:rPr>
+        <w:t xml:space="preserve">    printf("Esame passato.\n");</w:t>
+      </w:r>
+    </w:p>
+    <w:p>
+      <w:pPr>
+        <w:spacing w:after="0" w:before="0" w:line="240" w:lineRule="auto"/>
+      </w:pPr>
+      <w:r>
+        <w:rPr>
+          <w:rFonts w:ascii="Consolas" w:hAnsi="Consolas" w:cs="Consolas"/>
+          <w:sz w:val="17"/>
+        </w:rPr>
+        <w:t>}</w:t>
+      </w:r>
+    </w:p>
+    <w:p>
+      <w:pPr>
+        <w:spacing w:after="0" w:before="0" w:line="240" w:lineRule="auto"/>
+      </w:pPr>
+      <w:r>
+        <w:rPr>
+          <w:rFonts w:ascii="Consolas" w:hAnsi="Consolas" w:cs="Consolas"/>
+          <w:sz w:val="17"/>
+        </w:rPr>
+        <w:t>else {</w:t>
+      </w:r>
+    </w:p>
+    <w:p>
+      <w:pPr>
+        <w:spacing w:after="0" w:before="0" w:line="240" w:lineRule="auto"/>
+      </w:pPr>
+      <w:r>
+        <w:rPr>
+          <w:rFonts w:ascii="Consolas" w:hAnsi="Consolas" w:cs="Consolas"/>
+          <w:sz w:val="17"/>
+        </w:rPr>
+        <w:t xml:space="preserve">    printf("Esame non passato.\n");</w:t>
+      </w:r>
+    </w:p>
+    <w:p>
+      <w:pPr>
+        <w:spacing w:after="0" w:before="0" w:line="240" w:lineRule="auto"/>
+      </w:pPr>
+      <w:r>
+        <w:rPr>
+          <w:rFonts w:ascii="Consolas" w:hAnsi="Consolas" w:cs="Consolas"/>
+          <w:sz w:val="17"/>
+        </w:rPr>
+        <w:t xml:space="preserve">    printf("Ripresentarsi al prossimo appello.\n");</w:t>
+      </w:r>
+    </w:p>
+    <w:p>
+      <w:pPr>
+        <w:spacing w:after="0" w:before="0" w:line="240" w:lineRule="auto"/>
+      </w:pPr>
+      <w:r>
+        <w:rPr>
+          <w:rFonts w:ascii="Consolas" w:hAnsi="Consolas" w:cs="Consolas"/>
+          <w:sz w:val="17"/>
+        </w:rPr>
+        <w:t>}</w:t>
+      </w:r>
+    </w:p>
+    <w:p/>
+    <w:p>
+      <w:r>
+        <w:rPr/>
+        <w:t xml:space="preserve">La regola pratica del laboratorio è: </w:t>
+      </w:r>
+      <w:r>
+        <w:rPr>
+          <w:b/>
+        </w:rPr>
+        <w:t>è sempre meglio mettere i blocchi condizionali fra parentesi graffe</w:t>
+      </w:r>
+      <w:r>
+        <w:rPr/>
+        <w:t>, a meno che non siano molto brevi ed evidenti.</w:t>
+      </w:r>
+    </w:p>
+    <w:p>
+      <w:r>
+        <w:rPr/>
+        <w:t>(In parole povere: l'</w:t>
+      </w:r>
+      <w:r>
+        <w:rPr>
+          <w:rFonts w:ascii="Consolas" w:hAnsi="Consolas" w:cs="Consolas"/>
+        </w:rPr>
+        <w:t>if</w:t>
+      </w:r>
+      <w:r>
+        <w:rPr/>
+        <w:t xml:space="preserve"> da solo «controlla» una sola istruzione, quella che viene subito dopo. Se ne vuoi controllare di più, le graffe servono a dire al C «tutte queste insieme». E un punto e virgola messo a caso dopo la parentesi dice al C «qui l'</w:t>
+      </w:r>
+      <w:r>
+        <w:rPr>
+          <w:rFonts w:ascii="Consolas" w:hAnsi="Consolas" w:cs="Consolas"/>
+        </w:rPr>
+        <w:t>if</w:t>
+      </w:r>
+      <w:r>
+        <w:rPr/>
+        <w:t xml:space="preserve"> ha già finito», con effetti disastrosi che il compilatore non nota.)</w:t>
+      </w:r>
+    </w:p>
+    <w:p>
+      <w:r>
+        <w:rPr/>
+        <w:t>Il prossimo capitolo riguarda l'uso di Coderunner su Moodle e gli esercizi sulle scelte.</w:t>
+      </w:r>
+    </w:p>
+    <w:p>
+      <w:pPr>
+        <w:pStyle w:val="Titolo1"/>
+      </w:pPr>
+      <w:r>
+        <w:rPr>
+          <w:b/>
+          <w:color w:val="EE0000"/>
+        </w:rPr>
+        <w:t>Capitolo 9: Laboratorio 3: Coderunner ed Esercizi sulle Scelte</w:t>
+      </w:r>
+    </w:p>
+    <w:p>
+      <w:pPr>
+        <w:pStyle w:val="Titolo2"/>
+      </w:pPr>
+      <w:r>
+        <w:rPr>
+          <w:b/>
+          <w:color w:val="E97132"/>
+        </w:rPr>
+        <w:t>Gli esercizi su Moodle con Coderunner</w:t>
+      </w:r>
+    </w:p>
+    <w:p>
+      <w:r>
+        <w:rPr/>
+        <w:t xml:space="preserve">Tre degli esercizi del laboratorio 3 sono quiz su </w:t>
+      </w:r>
+      <w:r>
+        <w:rPr>
+          <w:b/>
+        </w:rPr>
+        <w:t>Moodle</w:t>
+      </w:r>
+      <w:r>
+        <w:rPr/>
+        <w:t xml:space="preserve">, in un ambiente che si chiama </w:t>
+      </w:r>
+      <w:r>
+        <w:rPr>
+          <w:b/>
+        </w:rPr>
+        <w:t>Coderunner</w:t>
+      </w:r>
+      <w:r>
+        <w:rPr/>
+        <w:t>: sulla pagina del corso ci sono tre quiz (Lab03-Es1 «Scelte su Interi», Lab03-Es2 «Emersione del Massimo» e Lab03-Es3 «Sasso-carta-forbici-lucertola-Spock»), e si aprono con il pulsante «Tenta il quiz adesso». Le slide non riportano i testi dei tre quiz, ma solo i titoli e le indicazioni generali di funzionamento riassunte qui.</w:t>
+      </w:r>
+    </w:p>
+    <w:p>
+      <w:r>
+        <w:rPr/>
+        <w:t xml:space="preserve">Nella pagina dell'esercizio si trovano il </w:t>
+      </w:r>
+      <w:r>
+        <w:rPr>
+          <w:b/>
+        </w:rPr>
+        <w:t>testo</w:t>
+      </w:r>
+      <w:r>
+        <w:rPr/>
+        <w:t xml:space="preserve"> (da leggere con cura prima di scrivere codice), un'</w:t>
+      </w:r>
+      <w:r>
+        <w:rPr>
+          <w:b/>
+        </w:rPr>
+        <w:t>area di lavoro</w:t>
+      </w:r>
+      <w:r>
+        <w:rPr/>
+        <w:t xml:space="preserve"> in cui scrivere il codice C del programma e un pulsante per </w:t>
+      </w:r>
+      <w:r>
+        <w:rPr>
+          <w:b/>
+        </w:rPr>
+        <w:t>compilare ed eseguire</w:t>
+      </w:r>
+      <w:r>
+        <w:rPr/>
+        <w:t xml:space="preserve">, che si può usare quante volte si vuole. Il programma viene eseguito con </w:t>
+      </w:r>
+      <w:r>
+        <w:rPr>
+          <w:b/>
+        </w:rPr>
+        <w:t>diversi input</w:t>
+      </w:r>
+      <w:r>
+        <w:rPr/>
+        <w:t xml:space="preserve"> e il sistema controlla che quanto stampato con </w:t>
+      </w:r>
+      <w:r>
+        <w:rPr>
+          <w:rFonts w:ascii="Consolas" w:hAnsi="Consolas" w:cs="Consolas"/>
+        </w:rPr>
+        <w:t>printf</w:t>
+      </w:r>
+      <w:r>
+        <w:rPr/>
+        <w:t xml:space="preserve"> corrisponda a quanto atteso.</w:t>
+      </w:r>
+    </w:p>
+    <w:p>
+      <w:r>
+        <w:rPr/>
+        <w:t>(In parole povere: Coderunner è un correttore automatico. Scrivi il programma, premi il pulsante, e lui lo prova con una serie di input già preparati confrontando le tue stampe con quelle giuste, sulle stampe.)</w:t>
+      </w:r>
+    </w:p>
+    <w:p>
+      <w:pPr>
+        <w:pStyle w:val="Titolo2"/>
+      </w:pPr>
+      <w:r>
+        <w:rPr>
+          <w:b/>
+          <w:color w:val="E97132"/>
+        </w:rPr>
+        <w:t>Gli esiti della verifica</w:t>
+      </w:r>
+    </w:p>
+    <w:p>
+      <w:r>
+        <w:rPr/>
+        <w:t>Dopo ogni tentativo si può trovare uno di tre esiti:</w:t>
+      </w:r>
+    </w:p>
+    <w:p>
+      <w:pPr>
+        <w:numPr>
+          <w:ilvl w:val="0"/>
+          <w:numId w:val="1"/>
+        </w:numPr>
+      </w:pPr>
+      <w:r>
+        <w:rPr>
+          <w:b/>
+        </w:rPr>
+        <w:t>errore di compilazione</w:t>
+      </w:r>
+      <w:r>
+        <w:rPr/>
+        <w:t xml:space="preserve">: il codice non compila. Va ricordato che Coderunner compila con le opzioni </w:t>
+      </w:r>
+      <w:r>
+        <w:rPr>
+          <w:rFonts w:ascii="Consolas" w:hAnsi="Consolas" w:cs="Consolas"/>
+        </w:rPr>
+        <w:t>-Wall -Werror</w:t>
+      </w:r>
+      <w:r>
+        <w:rPr/>
+        <w:t xml:space="preserve">, quindi anche un semplice </w:t>
+      </w:r>
+      <w:r>
+        <w:rPr>
+          <w:i/>
+        </w:rPr>
+        <w:t>warning</w:t>
+      </w:r>
+      <w:r>
+        <w:rPr/>
+        <w:t xml:space="preserve"> viene trattato come errore;</w:t>
+      </w:r>
+    </w:p>
+    <w:p>
+      <w:pPr>
+        <w:numPr>
+          <w:ilvl w:val="0"/>
+          <w:numId w:val="1"/>
+        </w:numPr>
+      </w:pPr>
+      <w:r>
+        <w:rPr/>
+        <w:t xml:space="preserve">il programma </w:t>
+      </w:r>
+      <w:r>
+        <w:rPr>
+          <w:b/>
+        </w:rPr>
+        <w:t>compila ed esegue, ma non passa tutti i test</w:t>
+      </w:r>
+      <w:r>
+        <w:rPr/>
+        <w:t>: non produce in output il testo atteso;</w:t>
+      </w:r>
+    </w:p>
+    <w:p>
+      <w:pPr>
+        <w:numPr>
+          <w:ilvl w:val="0"/>
+          <w:numId w:val="1"/>
+        </w:numPr>
+      </w:pPr>
+      <w:r>
+        <w:rPr/>
+        <w:t xml:space="preserve">il programma </w:t>
+      </w:r>
+      <w:r>
+        <w:rPr>
+          <w:b/>
+        </w:rPr>
+        <w:t>compila, esegue e passa tutti i test</w:t>
+      </w:r>
+      <w:r>
+        <w:rPr/>
+        <w:t>: produce tutti gli output attesi.</w:t>
+      </w:r>
+    </w:p>
+    <w:p>
+      <w:r>
+        <w:rPr/>
+        <w:t xml:space="preserve">Il laboratorio rassicura con un «niente panico»: la compilazione e l'esecuzione con degli input predefiniti sono automatiche, e l'obiettivo è scrivere un </w:t>
+      </w:r>
+      <w:r>
+        <w:rPr>
+          <w:b/>
+        </w:rPr>
+        <w:t>codice robusto</w:t>
+      </w:r>
+      <w:r>
+        <w:rPr/>
+        <w:t xml:space="preserve">, che risponda correttamente a input diversi. Gli input proposti sono formulati per mettere alla prova varie casistiche. </w:t>
+      </w:r>
+      <w:r>
+        <w:rPr>
+          <w:b/>
+        </w:rPr>
+        <w:t>Non è l'esame e l'esercizio non viene valutato</w:t>
+      </w:r>
+      <w:r>
+        <w:rPr/>
+        <w:t>: i messaggi sui punteggi che l'interfaccia mostra qua e là si possono ignorare.</w:t>
+      </w:r>
+    </w:p>
+    <w:p>
+      <w:pPr>
+        <w:pStyle w:val="Titolo2"/>
+      </w:pPr>
+      <w:r>
+        <w:rPr>
+          <w:b/>
+          <w:color w:val="E97132"/>
+        </w:rPr>
+        <w:t>Esercizio: saluti</w:t>
+      </w:r>
+    </w:p>
+    <w:p>
+      <w:r>
+        <w:rPr/>
+        <w:t xml:space="preserve">L'esercizio chiede un programma </w:t>
+      </w:r>
+      <w:r>
+        <w:rPr>
+          <w:rFonts w:ascii="Consolas" w:hAnsi="Consolas" w:cs="Consolas"/>
+        </w:rPr>
+        <w:t>saluta.c</w:t>
+      </w:r>
+      <w:r>
+        <w:rPr/>
+        <w:t xml:space="preserve"> che chieda all'utente l'ora, come numero intero, e stampi il saluto più appropriato fra «Buongiorno», «Buon pomeriggio», «Buonasera» e «Buona notte». Gli intervalli da usare vanno scelti da noi. Una scelta possibile (nostra soluzione), con ora da 0 a 23, è questa:</w:t>
+      </w:r>
+    </w:p>
+    <w:p>
+      <w:pPr>
+        <w:spacing w:after="0" w:before="0" w:line="240" w:lineRule="auto"/>
+      </w:pPr>
+      <w:r>
+        <w:rPr>
+          <w:rFonts w:ascii="Consolas" w:hAnsi="Consolas" w:cs="Consolas"/>
+          <w:sz w:val="17"/>
+        </w:rPr>
+        <w:t>#include &lt;stdio.h&gt;</w:t>
+      </w:r>
+    </w:p>
+    <w:p>
+      <w:pPr>
+        <w:spacing w:after="0" w:before="0" w:line="240" w:lineRule="auto"/>
+      </w:pPr>
+      <w:r>
+        <w:rPr>
+          <w:rFonts w:ascii="Consolas" w:hAnsi="Consolas" w:cs="Consolas"/>
+          <w:sz w:val="17"/>
+        </w:rPr>
+      </w:r>
+    </w:p>
+    <w:p>
+      <w:pPr>
+        <w:spacing w:after="0" w:before="0" w:line="240" w:lineRule="auto"/>
+      </w:pPr>
+      <w:r>
+        <w:rPr>
+          <w:rFonts w:ascii="Consolas" w:hAnsi="Consolas" w:cs="Consolas"/>
+          <w:sz w:val="17"/>
+        </w:rPr>
+        <w:t>int main(void) {</w:t>
+      </w:r>
+    </w:p>
+    <w:p>
+      <w:pPr>
+        <w:spacing w:after="0" w:before="0" w:line="240" w:lineRule="auto"/>
+      </w:pPr>
+      <w:r>
+        <w:rPr>
+          <w:rFonts w:ascii="Consolas" w:hAnsi="Consolas" w:cs="Consolas"/>
+          <w:sz w:val="17"/>
+        </w:rPr>
+        <w:t xml:space="preserve">    int ora;</w:t>
+      </w:r>
+    </w:p>
+    <w:p>
+      <w:pPr>
+        <w:spacing w:after="0" w:before="0" w:line="240" w:lineRule="auto"/>
+      </w:pPr>
+      <w:r>
+        <w:rPr>
+          <w:rFonts w:ascii="Consolas" w:hAnsi="Consolas" w:cs="Consolas"/>
+          <w:sz w:val="17"/>
+        </w:rPr>
+        <w:t xml:space="preserve">    printf("Che ora e'? ");</w:t>
+      </w:r>
+    </w:p>
+    <w:p>
+      <w:pPr>
+        <w:spacing w:after="0" w:before="0" w:line="240" w:lineRule="auto"/>
+      </w:pPr>
+      <w:r>
+        <w:rPr>
+          <w:rFonts w:ascii="Consolas" w:hAnsi="Consolas" w:cs="Consolas"/>
+          <w:sz w:val="17"/>
+        </w:rPr>
+        <w:t xml:space="preserve">    scanf("%d", &amp;ora);</w:t>
+      </w:r>
+    </w:p>
+    <w:p>
+      <w:pPr>
+        <w:spacing w:after="0" w:before="0" w:line="240" w:lineRule="auto"/>
+      </w:pPr>
+      <w:r>
+        <w:rPr>
+          <w:rFonts w:ascii="Consolas" w:hAnsi="Consolas" w:cs="Consolas"/>
+          <w:sz w:val="17"/>
+        </w:rPr>
+      </w:r>
+    </w:p>
+    <w:p>
+      <w:pPr>
+        <w:spacing w:after="0" w:before="0" w:line="240" w:lineRule="auto"/>
+      </w:pPr>
+      <w:r>
+        <w:rPr>
+          <w:rFonts w:ascii="Consolas" w:hAnsi="Consolas" w:cs="Consolas"/>
+          <w:sz w:val="17"/>
+        </w:rPr>
+        <w:t xml:space="preserve">    if (ora &gt;= 6 &amp;&amp; ora &lt; 12) {</w:t>
+      </w:r>
+    </w:p>
+    <w:p>
+      <w:pPr>
+        <w:spacing w:after="0" w:before="0" w:line="240" w:lineRule="auto"/>
+      </w:pPr>
+      <w:r>
+        <w:rPr>
+          <w:rFonts w:ascii="Consolas" w:hAnsi="Consolas" w:cs="Consolas"/>
+          <w:sz w:val="17"/>
+        </w:rPr>
+        <w:t xml:space="preserve">        printf("Buongiorno\n");</w:t>
+      </w:r>
+    </w:p>
+    <w:p>
+      <w:pPr>
+        <w:spacing w:after="0" w:before="0" w:line="240" w:lineRule="auto"/>
+      </w:pPr>
+      <w:r>
+        <w:rPr>
+          <w:rFonts w:ascii="Consolas" w:hAnsi="Consolas" w:cs="Consolas"/>
+          <w:sz w:val="17"/>
+        </w:rPr>
+        <w:t xml:space="preserve">    }</w:t>
+      </w:r>
+    </w:p>
+    <w:p>
+      <w:pPr>
+        <w:spacing w:after="0" w:before="0" w:line="240" w:lineRule="auto"/>
+      </w:pPr>
+      <w:r>
+        <w:rPr>
+          <w:rFonts w:ascii="Consolas" w:hAnsi="Consolas" w:cs="Consolas"/>
+          <w:sz w:val="17"/>
+        </w:rPr>
+        <w:t xml:space="preserve">    else if (ora &gt;= 12 &amp;&amp; ora &lt; 18) {</w:t>
+      </w:r>
+    </w:p>
+    <w:p>
+      <w:pPr>
+        <w:spacing w:after="0" w:before="0" w:line="240" w:lineRule="auto"/>
+      </w:pPr>
+      <w:r>
+        <w:rPr>
+          <w:rFonts w:ascii="Consolas" w:hAnsi="Consolas" w:cs="Consolas"/>
+          <w:sz w:val="17"/>
+        </w:rPr>
+        <w:t xml:space="preserve">        printf("Buon pomeriggio\n");</w:t>
+      </w:r>
+    </w:p>
+    <w:p>
+      <w:pPr>
+        <w:spacing w:after="0" w:before="0" w:line="240" w:lineRule="auto"/>
+      </w:pPr>
+      <w:r>
+        <w:rPr>
+          <w:rFonts w:ascii="Consolas" w:hAnsi="Consolas" w:cs="Consolas"/>
+          <w:sz w:val="17"/>
+        </w:rPr>
+        <w:t xml:space="preserve">    }</w:t>
+      </w:r>
+    </w:p>
+    <w:p>
+      <w:pPr>
+        <w:spacing w:after="0" w:before="0" w:line="240" w:lineRule="auto"/>
+      </w:pPr>
+      <w:r>
+        <w:rPr>
+          <w:rFonts w:ascii="Consolas" w:hAnsi="Consolas" w:cs="Consolas"/>
+          <w:sz w:val="17"/>
+        </w:rPr>
+        <w:t xml:space="preserve">    else if (ora &gt;= 18 &amp;&amp; ora &lt; 22) {</w:t>
+      </w:r>
+    </w:p>
+    <w:p>
+      <w:pPr>
+        <w:spacing w:after="0" w:before="0" w:line="240" w:lineRule="auto"/>
+      </w:pPr>
+      <w:r>
+        <w:rPr>
+          <w:rFonts w:ascii="Consolas" w:hAnsi="Consolas" w:cs="Consolas"/>
+          <w:sz w:val="17"/>
+        </w:rPr>
+        <w:t xml:space="preserve">        printf("Buonasera\n");</w:t>
+      </w:r>
+    </w:p>
+    <w:p>
+      <w:pPr>
+        <w:spacing w:after="0" w:before="0" w:line="240" w:lineRule="auto"/>
+      </w:pPr>
+      <w:r>
+        <w:rPr>
+          <w:rFonts w:ascii="Consolas" w:hAnsi="Consolas" w:cs="Consolas"/>
+          <w:sz w:val="17"/>
+        </w:rPr>
+        <w:t xml:space="preserve">    }</w:t>
+      </w:r>
+    </w:p>
+    <w:p>
+      <w:pPr>
+        <w:spacing w:after="0" w:before="0" w:line="240" w:lineRule="auto"/>
+      </w:pPr>
+      <w:r>
+        <w:rPr>
+          <w:rFonts w:ascii="Consolas" w:hAnsi="Consolas" w:cs="Consolas"/>
+          <w:sz w:val="17"/>
+        </w:rPr>
+        <w:t xml:space="preserve">    else {</w:t>
+      </w:r>
+    </w:p>
+    <w:p>
+      <w:pPr>
+        <w:spacing w:after="0" w:before="0" w:line="240" w:lineRule="auto"/>
+      </w:pPr>
+      <w:r>
+        <w:rPr>
+          <w:rFonts w:ascii="Consolas" w:hAnsi="Consolas" w:cs="Consolas"/>
+          <w:sz w:val="17"/>
+        </w:rPr>
+        <w:t xml:space="preserve">        printf("Buona notte\n");</w:t>
+      </w:r>
+    </w:p>
+    <w:p>
+      <w:pPr>
+        <w:spacing w:after="0" w:before="0" w:line="240" w:lineRule="auto"/>
+      </w:pPr>
+      <w:r>
+        <w:rPr>
+          <w:rFonts w:ascii="Consolas" w:hAnsi="Consolas" w:cs="Consolas"/>
+          <w:sz w:val="17"/>
+        </w:rPr>
+        <w:t xml:space="preserve">    }</w:t>
+      </w:r>
+    </w:p>
+    <w:p>
+      <w:pPr>
+        <w:spacing w:after="0" w:before="0" w:line="240" w:lineRule="auto"/>
+      </w:pPr>
+      <w:r>
+        <w:rPr>
+          <w:rFonts w:ascii="Consolas" w:hAnsi="Consolas" w:cs="Consolas"/>
+          <w:sz w:val="17"/>
+        </w:rPr>
+        <w:t>}</w:t>
+      </w:r>
+    </w:p>
+    <w:p/>
+    <w:p>
+      <w:r>
+        <w:rPr/>
+        <w:t xml:space="preserve">Gli intervalli sono semiaperti sinistri, [6, 12) e così via (capitolo 18), così ogni ora appartiene a uno e un solo saluto. Il ramo finale </w:t>
+      </w:r>
+      <w:r>
+        <w:rPr>
+          <w:rFonts w:ascii="Consolas" w:hAnsi="Consolas" w:cs="Consolas"/>
+        </w:rPr>
+        <w:t>else</w:t>
+      </w:r>
+      <w:r>
+        <w:rPr/>
+        <w:t xml:space="preserve"> raccoglie le ore dalle 22 alle 5 e vale anche per input non validi (per esempio 40): se si vuole gestirli serve un controllo in più, ma l'esercizio non lo richiede.</w:t>
+      </w:r>
+    </w:p>
+    <w:p>
+      <w:pPr>
+        <w:pStyle w:val="Titolo2"/>
+      </w:pPr>
+      <w:r>
+        <w:rPr>
+          <w:b/>
+          <w:color w:val="E97132"/>
+        </w:rPr>
+        <w:t>Esercizio: emersione del massimo con 4 variabili</w:t>
+      </w:r>
+    </w:p>
+    <w:p>
+      <w:r>
+        <w:rPr/>
+        <w:t xml:space="preserve">Nel laboratorio si invita a completare un programma (quello del quiz Lab03-Es2) che trova il massimo fra </w:t>
+      </w:r>
+      <w:r>
+        <w:rPr>
+          <w:b/>
+        </w:rPr>
+        <w:t>quattro variabili</w:t>
+      </w:r>
+      <w:r>
+        <w:rPr/>
+        <w:t>, assicurandosi che passi tutti i test; l'esercizio è descritto come simile, ma più semplice, a uno visto a lezione. Il testo originale è sul quiz di Moodle. Lo schema (nostro, perché il testo del quiz non è nelle slide) è lo stesso usato per il massimo di tre numeri nel capitolo 8: si parte dal primo valore come candidato e lo si sostituisce quando se ne trova uno più grande:</w:t>
+      </w:r>
+    </w:p>
+    <w:p>
+      <w:pPr>
+        <w:spacing w:after="0" w:before="0" w:line="240" w:lineRule="auto"/>
+      </w:pPr>
+      <w:r>
+        <w:rPr>
+          <w:rFonts w:ascii="Consolas" w:hAnsi="Consolas" w:cs="Consolas"/>
+          <w:sz w:val="17"/>
+        </w:rPr>
+        <w:t>int max = a;</w:t>
+      </w:r>
+    </w:p>
+    <w:p>
+      <w:pPr>
+        <w:spacing w:after="0" w:before="0" w:line="240" w:lineRule="auto"/>
+      </w:pPr>
+      <w:r>
+        <w:rPr>
+          <w:rFonts w:ascii="Consolas" w:hAnsi="Consolas" w:cs="Consolas"/>
+          <w:sz w:val="17"/>
+        </w:rPr>
+        <w:t>if (b &gt; max) {</w:t>
+      </w:r>
+    </w:p>
+    <w:p>
+      <w:pPr>
+        <w:spacing w:after="0" w:before="0" w:line="240" w:lineRule="auto"/>
+      </w:pPr>
+      <w:r>
+        <w:rPr>
+          <w:rFonts w:ascii="Consolas" w:hAnsi="Consolas" w:cs="Consolas"/>
+          <w:sz w:val="17"/>
+        </w:rPr>
+        <w:t xml:space="preserve">    max = b;</w:t>
+      </w:r>
+    </w:p>
+    <w:p>
+      <w:pPr>
+        <w:spacing w:after="0" w:before="0" w:line="240" w:lineRule="auto"/>
+      </w:pPr>
+      <w:r>
+        <w:rPr>
+          <w:rFonts w:ascii="Consolas" w:hAnsi="Consolas" w:cs="Consolas"/>
+          <w:sz w:val="17"/>
+        </w:rPr>
+        <w:t>}</w:t>
+      </w:r>
+    </w:p>
+    <w:p>
+      <w:pPr>
+        <w:spacing w:after="0" w:before="0" w:line="240" w:lineRule="auto"/>
+      </w:pPr>
+      <w:r>
+        <w:rPr>
+          <w:rFonts w:ascii="Consolas" w:hAnsi="Consolas" w:cs="Consolas"/>
+          <w:sz w:val="17"/>
+        </w:rPr>
+        <w:t>if (c &gt; max) {</w:t>
+      </w:r>
+    </w:p>
+    <w:p>
+      <w:pPr>
+        <w:spacing w:after="0" w:before="0" w:line="240" w:lineRule="auto"/>
+      </w:pPr>
+      <w:r>
+        <w:rPr>
+          <w:rFonts w:ascii="Consolas" w:hAnsi="Consolas" w:cs="Consolas"/>
+          <w:sz w:val="17"/>
+        </w:rPr>
+        <w:t xml:space="preserve">    max = c;</w:t>
+      </w:r>
+    </w:p>
+    <w:p>
+      <w:pPr>
+        <w:spacing w:after="0" w:before="0" w:line="240" w:lineRule="auto"/>
+      </w:pPr>
+      <w:r>
+        <w:rPr>
+          <w:rFonts w:ascii="Consolas" w:hAnsi="Consolas" w:cs="Consolas"/>
+          <w:sz w:val="17"/>
+        </w:rPr>
+        <w:t>}</w:t>
+      </w:r>
+    </w:p>
+    <w:p>
+      <w:pPr>
+        <w:spacing w:after="0" w:before="0" w:line="240" w:lineRule="auto"/>
+      </w:pPr>
+      <w:r>
+        <w:rPr>
+          <w:rFonts w:ascii="Consolas" w:hAnsi="Consolas" w:cs="Consolas"/>
+          <w:sz w:val="17"/>
+        </w:rPr>
+        <w:t>if (d &gt; max) {</w:t>
+      </w:r>
+    </w:p>
+    <w:p>
+      <w:pPr>
+        <w:spacing w:after="0" w:before="0" w:line="240" w:lineRule="auto"/>
+      </w:pPr>
+      <w:r>
+        <w:rPr>
+          <w:rFonts w:ascii="Consolas" w:hAnsi="Consolas" w:cs="Consolas"/>
+          <w:sz w:val="17"/>
+        </w:rPr>
+        <w:t xml:space="preserve">    max = d;</w:t>
+      </w:r>
+    </w:p>
+    <w:p>
+      <w:pPr>
+        <w:spacing w:after="0" w:before="0" w:line="240" w:lineRule="auto"/>
+      </w:pPr>
+      <w:r>
+        <w:rPr>
+          <w:rFonts w:ascii="Consolas" w:hAnsi="Consolas" w:cs="Consolas"/>
+          <w:sz w:val="17"/>
+        </w:rPr>
+        <w:t>}</w:t>
+      </w:r>
+    </w:p>
+    <w:p/>
+    <w:p>
+      <w:r>
+        <w:rPr/>
+        <w:t xml:space="preserve">(In parole povere: è come una gara a eliminazione. Il campione in carica all'inizio è </w:t>
+      </w:r>
+      <w:r>
+        <w:rPr>
+          <w:rFonts w:ascii="Consolas" w:hAnsi="Consolas" w:cs="Consolas"/>
+        </w:rPr>
+        <w:t>a</w:t>
+      </w:r>
+      <w:r>
+        <w:rPr/>
+        <w:t>; a ogni sfida, se lo sfidante è più grande, diventa lui il nuovo campione. Alla fine il campione è il massimo.)</w:t>
+      </w:r>
+    </w:p>
+    <w:p>
+      <w:r>
+        <w:rPr/>
+        <w:t xml:space="preserve">I tre </w:t>
+      </w:r>
+      <w:r>
+        <w:rPr>
+          <w:rFonts w:ascii="Consolas" w:hAnsi="Consolas" w:cs="Consolas"/>
+        </w:rPr>
+        <w:t>if</w:t>
+      </w:r>
+      <w:r>
+        <w:rPr/>
+        <w:t xml:space="preserve"> sono indipendenti e non </w:t>
+      </w:r>
+      <w:r>
+        <w:rPr>
+          <w:rFonts w:ascii="Consolas" w:hAnsi="Consolas" w:cs="Consolas"/>
+        </w:rPr>
+        <w:t>else if</w:t>
+      </w:r>
+      <w:r>
+        <w:rPr/>
+        <w:t>: ogni variabile va confrontata con il massimo trovato fin lì, anche se una precedente lo ha già cambiato.</w:t>
+      </w:r>
+    </w:p>
+    <w:p>
+      <w:pPr>
+        <w:pStyle w:val="Titolo2"/>
+      </w:pPr>
+      <w:r>
+        <w:rPr>
+          <w:b/>
+          <w:color w:val="E97132"/>
+        </w:rPr>
+        <w:t>Esercizio: selezione delle operazioni</w:t>
+      </w:r>
+    </w:p>
+    <w:p>
+      <w:r>
+        <w:rPr/>
+        <w:t xml:space="preserve">Il programma </w:t>
+      </w:r>
+      <w:r>
+        <w:rPr>
+          <w:rFonts w:ascii="Consolas" w:hAnsi="Consolas" w:cs="Consolas"/>
+        </w:rPr>
+        <w:t>selezione_operazioni.c</w:t>
+      </w:r>
+      <w:r>
+        <w:rPr/>
+        <w:t xml:space="preserve"> fa questo: chiede all'utente tre interi x1, x2 e x3; stampa il menù «scrivi 1 per calcolare la somma», «scrivi 2 per calcolare il prodotto» e «scrivi 3 per calcolare la media»; chiede un numero fra 1, 2 e 3; se l'operazione scelta non è fra quelle proposte stampa un messaggio di errore appropriato, altrimenti esegue l'operazione sui tre interi e mostra il risultato. Una soluzione:</w:t>
+      </w:r>
+    </w:p>
+    <w:p>
+      <w:pPr>
+        <w:spacing w:after="0" w:before="0" w:line="240" w:lineRule="auto"/>
+      </w:pPr>
+      <w:r>
+        <w:rPr>
+          <w:rFonts w:ascii="Consolas" w:hAnsi="Consolas" w:cs="Consolas"/>
+          <w:sz w:val="17"/>
+        </w:rPr>
+        <w:t>#include &lt;stdio.h&gt;</w:t>
+      </w:r>
+    </w:p>
+    <w:p>
+      <w:pPr>
+        <w:spacing w:after="0" w:before="0" w:line="240" w:lineRule="auto"/>
+      </w:pPr>
+      <w:r>
+        <w:rPr>
+          <w:rFonts w:ascii="Consolas" w:hAnsi="Consolas" w:cs="Consolas"/>
+          <w:sz w:val="17"/>
+        </w:rPr>
+      </w:r>
+    </w:p>
+    <w:p>
+      <w:pPr>
+        <w:spacing w:after="0" w:before="0" w:line="240" w:lineRule="auto"/>
+      </w:pPr>
+      <w:r>
+        <w:rPr>
+          <w:rFonts w:ascii="Consolas" w:hAnsi="Consolas" w:cs="Consolas"/>
+          <w:sz w:val="17"/>
+        </w:rPr>
+        <w:t>int main(void) {</w:t>
+      </w:r>
+    </w:p>
+    <w:p>
+      <w:pPr>
+        <w:spacing w:after="0" w:before="0" w:line="240" w:lineRule="auto"/>
+      </w:pPr>
+      <w:r>
+        <w:rPr>
+          <w:rFonts w:ascii="Consolas" w:hAnsi="Consolas" w:cs="Consolas"/>
+          <w:sz w:val="17"/>
+        </w:rPr>
+        <w:t xml:space="preserve">    int x1, x2, x3, scelta;</w:t>
+      </w:r>
+    </w:p>
+    <w:p>
+      <w:pPr>
+        <w:spacing w:after="0" w:before="0" w:line="240" w:lineRule="auto"/>
+      </w:pPr>
+      <w:r>
+        <w:rPr>
+          <w:rFonts w:ascii="Consolas" w:hAnsi="Consolas" w:cs="Consolas"/>
+          <w:sz w:val="17"/>
+        </w:rPr>
+      </w:r>
+    </w:p>
+    <w:p>
+      <w:pPr>
+        <w:spacing w:after="0" w:before="0" w:line="240" w:lineRule="auto"/>
+      </w:pPr>
+      <w:r>
+        <w:rPr>
+          <w:rFonts w:ascii="Consolas" w:hAnsi="Consolas" w:cs="Consolas"/>
+          <w:sz w:val="17"/>
+        </w:rPr>
+        <w:t xml:space="preserve">    printf("Inserisci tre interi: ");</w:t>
+      </w:r>
+    </w:p>
+    <w:p>
+      <w:pPr>
+        <w:spacing w:after="0" w:before="0" w:line="240" w:lineRule="auto"/>
+      </w:pPr>
+      <w:r>
+        <w:rPr>
+          <w:rFonts w:ascii="Consolas" w:hAnsi="Consolas" w:cs="Consolas"/>
+          <w:sz w:val="17"/>
+        </w:rPr>
+        <w:t xml:space="preserve">    scanf("%d %d %d", &amp;x1, &amp;x2, &amp;x3);</w:t>
+      </w:r>
+    </w:p>
+    <w:p>
+      <w:pPr>
+        <w:spacing w:after="0" w:before="0" w:line="240" w:lineRule="auto"/>
+      </w:pPr>
+      <w:r>
+        <w:rPr>
+          <w:rFonts w:ascii="Consolas" w:hAnsi="Consolas" w:cs="Consolas"/>
+          <w:sz w:val="17"/>
+        </w:rPr>
+      </w:r>
+    </w:p>
+    <w:p>
+      <w:pPr>
+        <w:spacing w:after="0" w:before="0" w:line="240" w:lineRule="auto"/>
+      </w:pPr>
+      <w:r>
+        <w:rPr>
+          <w:rFonts w:ascii="Consolas" w:hAnsi="Consolas" w:cs="Consolas"/>
+          <w:sz w:val="17"/>
+        </w:rPr>
+        <w:t xml:space="preserve">    printf("scrivi 1 per calcolare la somma\n");</w:t>
+      </w:r>
+    </w:p>
+    <w:p>
+      <w:pPr>
+        <w:spacing w:after="0" w:before="0" w:line="240" w:lineRule="auto"/>
+      </w:pPr>
+      <w:r>
+        <w:rPr>
+          <w:rFonts w:ascii="Consolas" w:hAnsi="Consolas" w:cs="Consolas"/>
+          <w:sz w:val="17"/>
+        </w:rPr>
+        <w:t xml:space="preserve">    printf("scrivi 2 per calcolare il prodotto\n");</w:t>
+      </w:r>
+    </w:p>
+    <w:p>
+      <w:pPr>
+        <w:spacing w:after="0" w:before="0" w:line="240" w:lineRule="auto"/>
+      </w:pPr>
+      <w:r>
+        <w:rPr>
+          <w:rFonts w:ascii="Consolas" w:hAnsi="Consolas" w:cs="Consolas"/>
+          <w:sz w:val="17"/>
+        </w:rPr>
+        <w:t xml:space="preserve">    printf("scrivi 3 per calcolare la media\n");</w:t>
+      </w:r>
+    </w:p>
+    <w:p>
+      <w:pPr>
+        <w:spacing w:after="0" w:before="0" w:line="240" w:lineRule="auto"/>
+      </w:pPr>
+      <w:r>
+        <w:rPr>
+          <w:rFonts w:ascii="Consolas" w:hAnsi="Consolas" w:cs="Consolas"/>
+          <w:sz w:val="17"/>
+        </w:rPr>
+        <w:t xml:space="preserve">    scanf("%d", &amp;scelta);</w:t>
+      </w:r>
+    </w:p>
+    <w:p>
+      <w:pPr>
+        <w:spacing w:after="0" w:before="0" w:line="240" w:lineRule="auto"/>
+      </w:pPr>
+      <w:r>
+        <w:rPr>
+          <w:rFonts w:ascii="Consolas" w:hAnsi="Consolas" w:cs="Consolas"/>
+          <w:sz w:val="17"/>
+        </w:rPr>
+      </w:r>
+    </w:p>
+    <w:p>
+      <w:pPr>
+        <w:spacing w:after="0" w:before="0" w:line="240" w:lineRule="auto"/>
+      </w:pPr>
+      <w:r>
+        <w:rPr>
+          <w:rFonts w:ascii="Consolas" w:hAnsi="Consolas" w:cs="Consolas"/>
+          <w:sz w:val="17"/>
+        </w:rPr>
+        <w:t xml:space="preserve">    if (scelta == 1) {</w:t>
+      </w:r>
+    </w:p>
+    <w:p>
+      <w:pPr>
+        <w:spacing w:after="0" w:before="0" w:line="240" w:lineRule="auto"/>
+      </w:pPr>
+      <w:r>
+        <w:rPr>
+          <w:rFonts w:ascii="Consolas" w:hAnsi="Consolas" w:cs="Consolas"/>
+          <w:sz w:val="17"/>
+        </w:rPr>
+        <w:t xml:space="preserve">        printf("Somma: %d\n", x1 + x2 + x3);</w:t>
+      </w:r>
+    </w:p>
+    <w:p>
+      <w:pPr>
+        <w:spacing w:after="0" w:before="0" w:line="240" w:lineRule="auto"/>
+      </w:pPr>
+      <w:r>
+        <w:rPr>
+          <w:rFonts w:ascii="Consolas" w:hAnsi="Consolas" w:cs="Consolas"/>
+          <w:sz w:val="17"/>
+        </w:rPr>
+        <w:t xml:space="preserve">    }</w:t>
+      </w:r>
+    </w:p>
+    <w:p>
+      <w:pPr>
+        <w:spacing w:after="0" w:before="0" w:line="240" w:lineRule="auto"/>
+      </w:pPr>
+      <w:r>
+        <w:rPr>
+          <w:rFonts w:ascii="Consolas" w:hAnsi="Consolas" w:cs="Consolas"/>
+          <w:sz w:val="17"/>
+        </w:rPr>
+        <w:t xml:space="preserve">    else if (scelta == 2) {</w:t>
+      </w:r>
+    </w:p>
+    <w:p>
+      <w:pPr>
+        <w:spacing w:after="0" w:before="0" w:line="240" w:lineRule="auto"/>
+      </w:pPr>
+      <w:r>
+        <w:rPr>
+          <w:rFonts w:ascii="Consolas" w:hAnsi="Consolas" w:cs="Consolas"/>
+          <w:sz w:val="17"/>
+        </w:rPr>
+        <w:t xml:space="preserve">        printf("Prodotto: %d\n", x1 * x2 * x3);</w:t>
+      </w:r>
+    </w:p>
+    <w:p>
+      <w:pPr>
+        <w:spacing w:after="0" w:before="0" w:line="240" w:lineRule="auto"/>
+      </w:pPr>
+      <w:r>
+        <w:rPr>
+          <w:rFonts w:ascii="Consolas" w:hAnsi="Consolas" w:cs="Consolas"/>
+          <w:sz w:val="17"/>
+        </w:rPr>
+        <w:t xml:space="preserve">    }</w:t>
+      </w:r>
+    </w:p>
+    <w:p>
+      <w:pPr>
+        <w:spacing w:after="0" w:before="0" w:line="240" w:lineRule="auto"/>
+      </w:pPr>
+      <w:r>
+        <w:rPr>
+          <w:rFonts w:ascii="Consolas" w:hAnsi="Consolas" w:cs="Consolas"/>
+          <w:sz w:val="17"/>
+        </w:rPr>
+        <w:t xml:space="preserve">    else if (scelta == 3) {</w:t>
+      </w:r>
+    </w:p>
+    <w:p>
+      <w:pPr>
+        <w:spacing w:after="0" w:before="0" w:line="240" w:lineRule="auto"/>
+      </w:pPr>
+      <w:r>
+        <w:rPr>
+          <w:rFonts w:ascii="Consolas" w:hAnsi="Consolas" w:cs="Consolas"/>
+          <w:sz w:val="17"/>
+        </w:rPr>
+        <w:t xml:space="preserve">        printf("Media: %f\n", (x1 + x2 + x3) / 3.0);</w:t>
+      </w:r>
+    </w:p>
+    <w:p>
+      <w:pPr>
+        <w:spacing w:after="0" w:before="0" w:line="240" w:lineRule="auto"/>
+      </w:pPr>
+      <w:r>
+        <w:rPr>
+          <w:rFonts w:ascii="Consolas" w:hAnsi="Consolas" w:cs="Consolas"/>
+          <w:sz w:val="17"/>
+        </w:rPr>
+        <w:t xml:space="preserve">    }</w:t>
+      </w:r>
+    </w:p>
+    <w:p>
+      <w:pPr>
+        <w:spacing w:after="0" w:before="0" w:line="240" w:lineRule="auto"/>
+      </w:pPr>
+      <w:r>
+        <w:rPr>
+          <w:rFonts w:ascii="Consolas" w:hAnsi="Consolas" w:cs="Consolas"/>
+          <w:sz w:val="17"/>
+        </w:rPr>
+        <w:t xml:space="preserve">    else {</w:t>
+      </w:r>
+    </w:p>
+    <w:p>
+      <w:pPr>
+        <w:spacing w:after="0" w:before="0" w:line="240" w:lineRule="auto"/>
+      </w:pPr>
+      <w:r>
+        <w:rPr>
+          <w:rFonts w:ascii="Consolas" w:hAnsi="Consolas" w:cs="Consolas"/>
+          <w:sz w:val="17"/>
+        </w:rPr>
+        <w:t xml:space="preserve">        printf("Operazione non valida\n");</w:t>
+      </w:r>
+    </w:p>
+    <w:p>
+      <w:pPr>
+        <w:spacing w:after="0" w:before="0" w:line="240" w:lineRule="auto"/>
+      </w:pPr>
+      <w:r>
+        <w:rPr>
+          <w:rFonts w:ascii="Consolas" w:hAnsi="Consolas" w:cs="Consolas"/>
+          <w:sz w:val="17"/>
+        </w:rPr>
+        <w:t xml:space="preserve">    }</w:t>
+      </w:r>
+    </w:p>
+    <w:p>
+      <w:pPr>
+        <w:spacing w:after="0" w:before="0" w:line="240" w:lineRule="auto"/>
+      </w:pPr>
+      <w:r>
+        <w:rPr>
+          <w:rFonts w:ascii="Consolas" w:hAnsi="Consolas" w:cs="Consolas"/>
+          <w:sz w:val="17"/>
+        </w:rPr>
+        <w:t>}</w:t>
+      </w:r>
+    </w:p>
+    <w:p/>
+    <w:p>
+      <w:r>
+        <w:rPr/>
+        <w:t xml:space="preserve">Due punti da notare. La media si calcola dividendo per </w:t>
+      </w:r>
+      <w:r>
+        <w:rPr>
+          <w:rFonts w:ascii="Consolas" w:hAnsi="Consolas" w:cs="Consolas"/>
+        </w:rPr>
+        <w:t>3.0</w:t>
+      </w:r>
+      <w:r>
+        <w:rPr/>
+        <w:t xml:space="preserve"> e non per </w:t>
+      </w:r>
+      <w:r>
+        <w:rPr>
+          <w:rFonts w:ascii="Consolas" w:hAnsi="Consolas" w:cs="Consolas"/>
+        </w:rPr>
+        <w:t>3</w:t>
+      </w:r>
+      <w:r>
+        <w:rPr/>
+        <w:t xml:space="preserve">: dividendo per l'intero 3 si avrebbe una divisione fra interi che scarta i decimali (capitolo 16), mentre con </w:t>
+      </w:r>
+      <w:r>
+        <w:rPr>
+          <w:rFonts w:ascii="Consolas" w:hAnsi="Consolas" w:cs="Consolas"/>
+        </w:rPr>
+        <w:t>3.0</w:t>
+      </w:r>
+      <w:r>
+        <w:rPr/>
+        <w:t xml:space="preserve"> il risultato è un reale. E lo schema </w:t>
+      </w:r>
+      <w:r>
+        <w:rPr>
+          <w:rFonts w:ascii="Consolas" w:hAnsi="Consolas" w:cs="Consolas"/>
+        </w:rPr>
+        <w:t>if ... else if ... else</w:t>
+      </w:r>
+      <w:r>
+        <w:rPr/>
+        <w:t xml:space="preserve"> con l'</w:t>
+      </w:r>
+      <w:r>
+        <w:rPr>
+          <w:rFonts w:ascii="Consolas" w:hAnsi="Consolas" w:cs="Consolas"/>
+        </w:rPr>
+        <w:t>else</w:t>
+      </w:r>
+      <w:r>
+        <w:rPr/>
+        <w:t xml:space="preserve"> finale è il modo giusto per gestire la scelta non valida, perché l'</w:t>
+      </w:r>
+      <w:r>
+        <w:rPr>
+          <w:rFonts w:ascii="Consolas" w:hAnsi="Consolas" w:cs="Consolas"/>
+        </w:rPr>
+        <w:t>else</w:t>
+      </w:r>
+      <w:r>
+        <w:rPr/>
+        <w:t xml:space="preserve"> scatta quando nessuna delle opzioni precedenti è vera.</w:t>
+      </w:r>
+    </w:p>
+    <w:p>
+      <w:r>
+        <w:rPr/>
+        <w:t>Il prossimo capitolo conclude il laboratorio 3 con due programmi più articolati: l'equazione di secondo grado e il gioco sasso-carta-forbici-lucertola-Spock.</w:t>
+      </w:r>
+    </w:p>
+    <w:p>
+      <w:pPr>
+        <w:pStyle w:val="Titolo1"/>
+      </w:pPr>
+      <w:r>
+        <w:rPr>
+          <w:b/>
+          <w:color w:val="EE0000"/>
+        </w:rPr>
+        <w:t>Capitolo 10: Laboratorio 3: Equazioni di Secondo Grado e Sasso-Carta-Forbici-Lucertola-Spock</w:t>
+      </w:r>
+    </w:p>
+    <w:p>
+      <w:pPr>
+        <w:pStyle w:val="Titolo2"/>
+      </w:pPr>
+      <w:r>
+        <w:rPr>
+          <w:b/>
+          <w:color w:val="E97132"/>
+        </w:rPr>
+        <w:t>L'equazione di secondo grado</w:t>
+      </w:r>
+    </w:p>
+    <w:p>
+      <w:r>
+        <w:rPr/>
+        <w:t xml:space="preserve">L'esercizio chiede di realizzare lo </w:t>
+      </w:r>
+      <w:r>
+        <w:rPr>
+          <w:b/>
+        </w:rPr>
+        <w:t>schema di risoluzione completo</w:t>
+      </w:r>
+      <w:r>
+        <w:rPr/>
+        <w:t xml:space="preserve"> dell'equazione di secondo grado ax² + bx + c = 0, che a lezione era stato visto in forma semplificata, considerando </w:t>
+      </w:r>
+      <w:r>
+        <w:rPr>
+          <w:b/>
+        </w:rPr>
+        <w:t>anche tutti i casi limite</w:t>
+      </w:r>
+      <w:r>
+        <w:rPr/>
+        <w:t xml:space="preserve">. Il programma </w:t>
+      </w:r>
+      <w:r>
+        <w:rPr>
+          <w:rFonts w:ascii="Consolas" w:hAnsi="Consolas" w:cs="Consolas"/>
+        </w:rPr>
+        <w:t>equaz_secondo.c</w:t>
+      </w:r>
+      <w:r>
+        <w:rPr/>
+        <w:t xml:space="preserve"> prende in ingresso i tre coefficienti a, b e c e calcola, quando è possibile, le radici dell'equazione e le stampa; quando non è possibile stampa un messaggio di errore appropriato e termina.</w:t>
+      </w:r>
+    </w:p>
+    <w:p>
+      <w:r>
+        <w:rPr/>
+        <w:t>I casi limite nascono dal fatto che la formula risolutiva vale solo se a è diverso da zero. Il flusso di risoluzione del laboratorio si legge così:</w:t>
+      </w:r>
+    </w:p>
+    <w:p>
+      <w:pPr>
+        <w:keepNext/>
+        <w:jc w:val="center"/>
+      </w:pPr>
+      <w:r>
+        <w:drawing>
+          <wp:inline xmlns:a="http://schemas.openxmlformats.org/drawingml/2006/main" xmlns:pic="http://schemas.openxmlformats.org/drawingml/2006/picture">
+            <wp:extent cx="4680000" cy="3114041"/>
+            <wp:docPr id="1" name="Picture 1"/>
+            <wp:cNvGraphicFramePr>
+              <a:graphicFrameLocks noChangeAspect="1"/>
+            </wp:cNvGraphicFramePr>
+            <a:graphic>
+              <a:graphicData uri="http://schemas.openxmlformats.org/drawingml/2006/picture">
+                <pic:pic>
+                  <pic:nvPicPr>
+                    <pic:cNvPr id="0" name="ch10_flow_equazione.png"/>
+                    <pic:cNvPicPr/>
+                  </pic:nvPicPr>
+                  <pic:blipFill>
+                    <a:blip r:embed="rId5"/>
+                    <a:stretch>
+                      <a:fillRect/>
+                    </a:stretch>
+                  </pic:blipFill>
+                  <pic:spPr>
+                    <a:xfrm>
+                      <a:off x="0" y="0"/>
+                      <a:ext cx="4680000" cy="3114041"/>
+                    </a:xfrm>
+                    <a:prstGeom prst="rect"/>
+                  </pic:spPr>
+                </pic:pic>
+              </a:graphicData>
+            </a:graphic>
+          </wp:inline>
+        </w:drawing>
+      </w:r>
+    </w:p>
+    <w:p>
+      <w:pPr>
+        <w:jc w:val="center"/>
+      </w:pPr>
+      <w:r>
+        <w:rPr>
+          <w:i/>
+          <w:sz w:val="18"/>
+        </w:rPr>
+        <w:t>Il flusso di risoluzione di ax² + bx + c = 0 ridisegnato dalle slide (in verde il «sì», in rosso il «no»).</w:t>
+      </w:r>
+    </w:p>
+    <w:p>
+      <w:r>
+        <w:rPr/>
+        <w:t xml:space="preserve">1. Se </w:t>
+      </w:r>
+      <w:r>
+        <w:rPr>
+          <w:b/>
+        </w:rPr>
+        <w:t>a = 0</w:t>
+      </w:r>
+      <w:r>
+        <w:rPr/>
+        <w:t xml:space="preserve"> l'equazione non è di secondo grado e si guarda b.</w:t>
+      </w:r>
+    </w:p>
+    <w:p>
+      <w:r>
+        <w:rPr/>
+        <w:t xml:space="preserve">2. Se a = 0 e </w:t>
+      </w:r>
+      <w:r>
+        <w:rPr>
+          <w:b/>
+        </w:rPr>
+        <w:t>b = 0</w:t>
+      </w:r>
+      <w:r>
+        <w:rPr/>
+        <w:t xml:space="preserve">, l'equazione diventa c = 0: se anche </w:t>
+      </w:r>
+      <w:r>
+        <w:rPr>
+          <w:b/>
+        </w:rPr>
+        <w:t>c = 0</w:t>
+      </w:r>
+      <w:r>
+        <w:rPr/>
+        <w:t xml:space="preserve"> è </w:t>
+      </w:r>
+      <w:r>
+        <w:rPr>
+          <w:b/>
+        </w:rPr>
+        <w:t>indeterminata</w:t>
+      </w:r>
+      <w:r>
+        <w:rPr/>
+        <w:t xml:space="preserve"> (ogni x è soluzione), altrimenti è </w:t>
+      </w:r>
+      <w:r>
+        <w:rPr>
+          <w:b/>
+        </w:rPr>
+        <w:t>impossibile</w:t>
+      </w:r>
+      <w:r>
+        <w:rPr/>
+        <w:t xml:space="preserve"> (nessuna x la soddisfa).</w:t>
+      </w:r>
+    </w:p>
+    <w:p>
+      <w:r>
+        <w:rPr/>
+        <w:t xml:space="preserve">3. Se a = 0 ma b ≠ 0 l'equazione è di primo grado e ha l'unica soluzione </w:t>
+      </w:r>
+      <w:r>
+        <w:rPr>
+          <w:b/>
+        </w:rPr>
+        <w:t>x₁ = −c / b</w:t>
+      </w:r>
+      <w:r>
+        <w:rPr/>
+        <w:t>.</w:t>
+      </w:r>
+    </w:p>
+    <w:p>
+      <w:r>
+        <w:rPr/>
+        <w:t xml:space="preserve">4. Se </w:t>
+      </w:r>
+      <w:r>
+        <w:rPr>
+          <w:b/>
+        </w:rPr>
+        <w:t>a ≠ 0</w:t>
+      </w:r>
+      <w:r>
+        <w:rPr/>
+        <w:t xml:space="preserve"> si calcolano il discriminante </w:t>
+      </w:r>
+      <w:r>
+        <w:rPr>
+          <w:b/>
+        </w:rPr>
+        <w:t>δ = b² − 4ac</w:t>
+      </w:r>
+      <w:r>
+        <w:rPr/>
+        <w:t xml:space="preserve"> e tre grandezze di servizio: </w:t>
+      </w:r>
+      <w:r>
+        <w:rPr>
+          <w:b/>
+        </w:rPr>
+        <w:t>W = 2a</w:t>
+      </w:r>
+      <w:r>
+        <w:rPr/>
+        <w:t xml:space="preserve">, </w:t>
+      </w:r>
+      <w:r>
+        <w:rPr>
+          <w:b/>
+        </w:rPr>
+        <w:t>W₁ = −b / W</w:t>
+      </w:r>
+      <w:r>
+        <w:rPr/>
+        <w:t xml:space="preserve"> e </w:t>
+      </w:r>
+      <w:r>
+        <w:rPr>
+          <w:b/>
+        </w:rPr>
+        <w:t>W₂ = √|δ| / W</w:t>
+      </w:r>
+      <w:r>
+        <w:rPr/>
+        <w:t>.</w:t>
+      </w:r>
+    </w:p>
+    <w:p>
+      <w:r>
+        <w:rPr/>
+        <w:t xml:space="preserve">5. Se </w:t>
+      </w:r>
+      <w:r>
+        <w:rPr>
+          <w:b/>
+        </w:rPr>
+        <w:t>δ = 0</w:t>
+      </w:r>
+      <w:r>
+        <w:rPr/>
+        <w:t xml:space="preserve"> c'è una </w:t>
+      </w:r>
+      <w:r>
+        <w:rPr>
+          <w:b/>
+        </w:rPr>
+        <w:t>singola radice</w:t>
+      </w:r>
+      <w:r>
+        <w:rPr/>
+        <w:t>, x₁ = W₁.</w:t>
+      </w:r>
+    </w:p>
+    <w:p>
+      <w:r>
+        <w:rPr/>
+        <w:t xml:space="preserve">6. Se </w:t>
+      </w:r>
+      <w:r>
+        <w:rPr>
+          <w:b/>
+        </w:rPr>
+        <w:t>δ &lt; 0</w:t>
+      </w:r>
+      <w:r>
+        <w:rPr/>
+        <w:t xml:space="preserve"> non ci sono radici reali, ma </w:t>
+      </w:r>
+      <w:r>
+        <w:rPr>
+          <w:b/>
+        </w:rPr>
+        <w:t>radici complesse coniugate</w:t>
+      </w:r>
+      <w:r>
+        <w:rPr/>
+        <w:t>.</w:t>
+      </w:r>
+    </w:p>
+    <w:p>
+      <w:r>
+        <w:rPr/>
+        <w:t xml:space="preserve">7. Se </w:t>
+      </w:r>
+      <w:r>
+        <w:rPr>
+          <w:b/>
+        </w:rPr>
+        <w:t>δ &gt; 0</w:t>
+      </w:r>
+      <w:r>
+        <w:rPr/>
+        <w:t xml:space="preserve"> ci sono due </w:t>
+      </w:r>
+      <w:r>
+        <w:rPr>
+          <w:b/>
+        </w:rPr>
+        <w:t>radici reali</w:t>
+      </w:r>
+      <w:r>
+        <w:rPr/>
+        <w:t>, x₁ = W₁ + W₂ e x₂ = W₁ − W₂.</w:t>
+      </w:r>
+    </w:p>
+    <w:p>
+      <w:r>
+        <w:rPr/>
+        <w:t>(In parole povere: prima di applicare la formula bisogna controllare che l'equazione sia davvero di secondo grado, perché con a = 0 si dividerebbe per zero. Poi il segno del discriminante dice quante soluzioni reali ci sono: due se è positivo, una se è zero, nessuna se è negativo.)</w:t>
+      </w:r>
+    </w:p>
+    <w:p>
+      <w:r>
+        <w:rPr/>
+        <w:t>Il perché di W₁ e W₂ (spiegazione nostra, non nelle slide) è la formula risolutiva x = (−b ± √δ) / (2a), che si può spezzare in due parti: x = −b/(2a) ± √δ/(2a), cioè W₁ ± W₂ (con il valore assoluto sotto la radice, perché per δ &lt; 0 la parte reale resta W₁ e la parte immaginaria è ±W₂).</w:t>
+      </w:r>
+    </w:p>
+    <w:p>
+      <w:r>
+        <w:rPr/>
+        <w:t xml:space="preserve">Per il calcolo il laboratorio ricorda di usare </w:t>
+      </w:r>
+      <w:r>
+        <w:rPr>
+          <w:rFonts w:ascii="Consolas" w:hAnsi="Consolas" w:cs="Consolas"/>
+        </w:rPr>
+        <w:t>sqrt()</w:t>
+      </w:r>
+      <w:r>
+        <w:rPr/>
+        <w:t xml:space="preserve"> per la radice quadrata, definita in </w:t>
+      </w:r>
+      <w:r>
+        <w:rPr>
+          <w:rFonts w:ascii="Consolas" w:hAnsi="Consolas" w:cs="Consolas"/>
+        </w:rPr>
+        <w:t>&lt;math.h&gt;</w:t>
+      </w:r>
+      <w:r>
+        <w:rPr/>
+        <w:t xml:space="preserve">, e </w:t>
+      </w:r>
+      <w:r>
+        <w:rPr>
+          <w:rFonts w:ascii="Consolas" w:hAnsi="Consolas" w:cs="Consolas"/>
+        </w:rPr>
+        <w:t>abs()</w:t>
+      </w:r>
+      <w:r>
+        <w:rPr/>
+        <w:t xml:space="preserve"> per il valore assoluto, definita in </w:t>
+      </w:r>
+      <w:r>
+        <w:rPr>
+          <w:rFonts w:ascii="Consolas" w:hAnsi="Consolas" w:cs="Consolas"/>
+        </w:rPr>
+        <w:t>&lt;stdlib.h&gt;</w:t>
+      </w:r>
+      <w:r>
+        <w:rPr/>
+        <w:t>. Una soluzione, nell'ipotesi che i coefficienti siano interi:</w:t>
+      </w:r>
+    </w:p>
+    <w:p>
+      <w:pPr>
+        <w:spacing w:after="0" w:before="0" w:line="240" w:lineRule="auto"/>
+      </w:pPr>
+      <w:r>
+        <w:rPr>
+          <w:rFonts w:ascii="Consolas" w:hAnsi="Consolas" w:cs="Consolas"/>
+          <w:sz w:val="17"/>
+        </w:rPr>
+        <w:t>#include &lt;stdio.h&gt;</w:t>
+      </w:r>
+    </w:p>
+    <w:p>
+      <w:pPr>
+        <w:spacing w:after="0" w:before="0" w:line="240" w:lineRule="auto"/>
+      </w:pPr>
+      <w:r>
+        <w:rPr>
+          <w:rFonts w:ascii="Consolas" w:hAnsi="Consolas" w:cs="Consolas"/>
+          <w:sz w:val="17"/>
+        </w:rPr>
+        <w:t>#include &lt;math.h&gt;</w:t>
+      </w:r>
+    </w:p>
+    <w:p>
+      <w:pPr>
+        <w:spacing w:after="0" w:before="0" w:line="240" w:lineRule="auto"/>
+      </w:pPr>
+      <w:r>
+        <w:rPr>
+          <w:rFonts w:ascii="Consolas" w:hAnsi="Consolas" w:cs="Consolas"/>
+          <w:sz w:val="17"/>
+        </w:rPr>
+        <w:t>#include &lt;stdlib.h&gt;</w:t>
+      </w:r>
+    </w:p>
+    <w:p>
+      <w:pPr>
+        <w:spacing w:after="0" w:before="0" w:line="240" w:lineRule="auto"/>
+      </w:pPr>
+      <w:r>
+        <w:rPr>
+          <w:rFonts w:ascii="Consolas" w:hAnsi="Consolas" w:cs="Consolas"/>
+          <w:sz w:val="17"/>
+        </w:rPr>
+      </w:r>
+    </w:p>
+    <w:p>
+      <w:pPr>
+        <w:spacing w:after="0" w:before="0" w:line="240" w:lineRule="auto"/>
+      </w:pPr>
+      <w:r>
+        <w:rPr>
+          <w:rFonts w:ascii="Consolas" w:hAnsi="Consolas" w:cs="Consolas"/>
+          <w:sz w:val="17"/>
+        </w:rPr>
+        <w:t>int main(void) {</w:t>
+      </w:r>
+    </w:p>
+    <w:p>
+      <w:pPr>
+        <w:spacing w:after="0" w:before="0" w:line="240" w:lineRule="auto"/>
+      </w:pPr>
+      <w:r>
+        <w:rPr>
+          <w:rFonts w:ascii="Consolas" w:hAnsi="Consolas" w:cs="Consolas"/>
+          <w:sz w:val="17"/>
+        </w:rPr>
+        <w:t xml:space="preserve">    int a, b, c;</w:t>
+      </w:r>
+    </w:p>
+    <w:p>
+      <w:pPr>
+        <w:spacing w:after="0" w:before="0" w:line="240" w:lineRule="auto"/>
+      </w:pPr>
+      <w:r>
+        <w:rPr>
+          <w:rFonts w:ascii="Consolas" w:hAnsi="Consolas" w:cs="Consolas"/>
+          <w:sz w:val="17"/>
+        </w:rPr>
+        <w:t xml:space="preserve">    printf("Inserisci a, b, c: ");</w:t>
+      </w:r>
+    </w:p>
+    <w:p>
+      <w:pPr>
+        <w:spacing w:after="0" w:before="0" w:line="240" w:lineRule="auto"/>
+      </w:pPr>
+      <w:r>
+        <w:rPr>
+          <w:rFonts w:ascii="Consolas" w:hAnsi="Consolas" w:cs="Consolas"/>
+          <w:sz w:val="17"/>
+        </w:rPr>
+        <w:t xml:space="preserve">    scanf("%d %d %d", &amp;a, &amp;b, &amp;c);</w:t>
+      </w:r>
+    </w:p>
+    <w:p>
+      <w:pPr>
+        <w:spacing w:after="0" w:before="0" w:line="240" w:lineRule="auto"/>
+      </w:pPr>
+      <w:r>
+        <w:rPr>
+          <w:rFonts w:ascii="Consolas" w:hAnsi="Consolas" w:cs="Consolas"/>
+          <w:sz w:val="17"/>
+        </w:rPr>
+      </w:r>
+    </w:p>
+    <w:p>
+      <w:pPr>
+        <w:spacing w:after="0" w:before="0" w:line="240" w:lineRule="auto"/>
+      </w:pPr>
+      <w:r>
+        <w:rPr>
+          <w:rFonts w:ascii="Consolas" w:hAnsi="Consolas" w:cs="Consolas"/>
+          <w:sz w:val="17"/>
+        </w:rPr>
+        <w:t xml:space="preserve">    if (a == 0) {</w:t>
+      </w:r>
+    </w:p>
+    <w:p>
+      <w:pPr>
+        <w:spacing w:after="0" w:before="0" w:line="240" w:lineRule="auto"/>
+      </w:pPr>
+      <w:r>
+        <w:rPr>
+          <w:rFonts w:ascii="Consolas" w:hAnsi="Consolas" w:cs="Consolas"/>
+          <w:sz w:val="17"/>
+        </w:rPr>
+        <w:t xml:space="preserve">        if (b == 0) {</w:t>
+      </w:r>
+    </w:p>
+    <w:p>
+      <w:pPr>
+        <w:spacing w:after="0" w:before="0" w:line="240" w:lineRule="auto"/>
+      </w:pPr>
+      <w:r>
+        <w:rPr>
+          <w:rFonts w:ascii="Consolas" w:hAnsi="Consolas" w:cs="Consolas"/>
+          <w:sz w:val="17"/>
+        </w:rPr>
+        <w:t xml:space="preserve">            if (c == 0) {</w:t>
+      </w:r>
+    </w:p>
+    <w:p>
+      <w:pPr>
+        <w:spacing w:after="0" w:before="0" w:line="240" w:lineRule="auto"/>
+      </w:pPr>
+      <w:r>
+        <w:rPr>
+          <w:rFonts w:ascii="Consolas" w:hAnsi="Consolas" w:cs="Consolas"/>
+          <w:sz w:val="17"/>
+        </w:rPr>
+        <w:t xml:space="preserve">                printf("Equazione indeterminata\n");</w:t>
+      </w:r>
+    </w:p>
+    <w:p>
+      <w:pPr>
+        <w:spacing w:after="0" w:before="0" w:line="240" w:lineRule="auto"/>
+      </w:pPr>
+      <w:r>
+        <w:rPr>
+          <w:rFonts w:ascii="Consolas" w:hAnsi="Consolas" w:cs="Consolas"/>
+          <w:sz w:val="17"/>
+        </w:rPr>
+        <w:t xml:space="preserve">            }</w:t>
+      </w:r>
+    </w:p>
+    <w:p>
+      <w:pPr>
+        <w:spacing w:after="0" w:before="0" w:line="240" w:lineRule="auto"/>
+      </w:pPr>
+      <w:r>
+        <w:rPr>
+          <w:rFonts w:ascii="Consolas" w:hAnsi="Consolas" w:cs="Consolas"/>
+          <w:sz w:val="17"/>
+        </w:rPr>
+        <w:t xml:space="preserve">            else {</w:t>
+      </w:r>
+    </w:p>
+    <w:p>
+      <w:pPr>
+        <w:spacing w:after="0" w:before="0" w:line="240" w:lineRule="auto"/>
+      </w:pPr>
+      <w:r>
+        <w:rPr>
+          <w:rFonts w:ascii="Consolas" w:hAnsi="Consolas" w:cs="Consolas"/>
+          <w:sz w:val="17"/>
+        </w:rPr>
+        <w:t xml:space="preserve">                printf("Equazione impossibile\n");</w:t>
+      </w:r>
+    </w:p>
+    <w:p>
+      <w:pPr>
+        <w:spacing w:after="0" w:before="0" w:line="240" w:lineRule="auto"/>
+      </w:pPr>
+      <w:r>
+        <w:rPr>
+          <w:rFonts w:ascii="Consolas" w:hAnsi="Consolas" w:cs="Consolas"/>
+          <w:sz w:val="17"/>
+        </w:rPr>
+        <w:t xml:space="preserve">            }</w:t>
+      </w:r>
+    </w:p>
+    <w:p>
+      <w:pPr>
+        <w:spacing w:after="0" w:before="0" w:line="240" w:lineRule="auto"/>
+      </w:pPr>
+      <w:r>
+        <w:rPr>
+          <w:rFonts w:ascii="Consolas" w:hAnsi="Consolas" w:cs="Consolas"/>
+          <w:sz w:val="17"/>
+        </w:rPr>
+        <w:t xml:space="preserve">        }</w:t>
+      </w:r>
+    </w:p>
+    <w:p>
+      <w:pPr>
+        <w:spacing w:after="0" w:before="0" w:line="240" w:lineRule="auto"/>
+      </w:pPr>
+      <w:r>
+        <w:rPr>
+          <w:rFonts w:ascii="Consolas" w:hAnsi="Consolas" w:cs="Consolas"/>
+          <w:sz w:val="17"/>
+        </w:rPr>
+        <w:t xml:space="preserve">        else {</w:t>
+      </w:r>
+    </w:p>
+    <w:p>
+      <w:pPr>
+        <w:spacing w:after="0" w:before="0" w:line="240" w:lineRule="auto"/>
+      </w:pPr>
+      <w:r>
+        <w:rPr>
+          <w:rFonts w:ascii="Consolas" w:hAnsi="Consolas" w:cs="Consolas"/>
+          <w:sz w:val="17"/>
+        </w:rPr>
+        <w:t xml:space="preserve">            printf("x1 = %f\n", 0.0 - (double)c / b);</w:t>
+      </w:r>
+    </w:p>
+    <w:p>
+      <w:pPr>
+        <w:spacing w:after="0" w:before="0" w:line="240" w:lineRule="auto"/>
+      </w:pPr>
+      <w:r>
+        <w:rPr>
+          <w:rFonts w:ascii="Consolas" w:hAnsi="Consolas" w:cs="Consolas"/>
+          <w:sz w:val="17"/>
+        </w:rPr>
+        <w:t xml:space="preserve">        }</w:t>
+      </w:r>
+    </w:p>
+    <w:p>
+      <w:pPr>
+        <w:spacing w:after="0" w:before="0" w:line="240" w:lineRule="auto"/>
+      </w:pPr>
+      <w:r>
+        <w:rPr>
+          <w:rFonts w:ascii="Consolas" w:hAnsi="Consolas" w:cs="Consolas"/>
+          <w:sz w:val="17"/>
+        </w:rPr>
+        <w:t xml:space="preserve">    }</w:t>
+      </w:r>
+    </w:p>
+    <w:p>
+      <w:pPr>
+        <w:spacing w:after="0" w:before="0" w:line="240" w:lineRule="auto"/>
+      </w:pPr>
+      <w:r>
+        <w:rPr>
+          <w:rFonts w:ascii="Consolas" w:hAnsi="Consolas" w:cs="Consolas"/>
+          <w:sz w:val="17"/>
+        </w:rPr>
+        <w:t xml:space="preserve">    else {</w:t>
+      </w:r>
+    </w:p>
+    <w:p>
+      <w:pPr>
+        <w:spacing w:after="0" w:before="0" w:line="240" w:lineRule="auto"/>
+      </w:pPr>
+      <w:r>
+        <w:rPr>
+          <w:rFonts w:ascii="Consolas" w:hAnsi="Consolas" w:cs="Consolas"/>
+          <w:sz w:val="17"/>
+        </w:rPr>
+        <w:t xml:space="preserve">        int delta = b * b - 4 * a * c;</w:t>
+      </w:r>
+    </w:p>
+    <w:p>
+      <w:pPr>
+        <w:spacing w:after="0" w:before="0" w:line="240" w:lineRule="auto"/>
+      </w:pPr>
+      <w:r>
+        <w:rPr>
+          <w:rFonts w:ascii="Consolas" w:hAnsi="Consolas" w:cs="Consolas"/>
+          <w:sz w:val="17"/>
+        </w:rPr>
+        <w:t xml:space="preserve">        double W  = 2.0 * a;</w:t>
+      </w:r>
+    </w:p>
+    <w:p>
+      <w:pPr>
+        <w:spacing w:after="0" w:before="0" w:line="240" w:lineRule="auto"/>
+      </w:pPr>
+      <w:r>
+        <w:rPr>
+          <w:rFonts w:ascii="Consolas" w:hAnsi="Consolas" w:cs="Consolas"/>
+          <w:sz w:val="17"/>
+        </w:rPr>
+        <w:t xml:space="preserve">        double W1 = 0.0 - b / W;</w:t>
+      </w:r>
+    </w:p>
+    <w:p>
+      <w:pPr>
+        <w:spacing w:after="0" w:before="0" w:line="240" w:lineRule="auto"/>
+      </w:pPr>
+      <w:r>
+        <w:rPr>
+          <w:rFonts w:ascii="Consolas" w:hAnsi="Consolas" w:cs="Consolas"/>
+          <w:sz w:val="17"/>
+        </w:rPr>
+        <w:t xml:space="preserve">        double W2 = sqrt(abs(delta)) / W;</w:t>
+      </w:r>
+    </w:p>
+    <w:p>
+      <w:pPr>
+        <w:spacing w:after="0" w:before="0" w:line="240" w:lineRule="auto"/>
+      </w:pPr>
+      <w:r>
+        <w:rPr>
+          <w:rFonts w:ascii="Consolas" w:hAnsi="Consolas" w:cs="Consolas"/>
+          <w:sz w:val="17"/>
+        </w:rPr>
+      </w:r>
+    </w:p>
+    <w:p>
+      <w:pPr>
+        <w:spacing w:after="0" w:before="0" w:line="240" w:lineRule="auto"/>
+      </w:pPr>
+      <w:r>
+        <w:rPr>
+          <w:rFonts w:ascii="Consolas" w:hAnsi="Consolas" w:cs="Consolas"/>
+          <w:sz w:val="17"/>
+        </w:rPr>
+        <w:t xml:space="preserve">        if (delta == 0) {</w:t>
+      </w:r>
+    </w:p>
+    <w:p>
+      <w:pPr>
+        <w:spacing w:after="0" w:before="0" w:line="240" w:lineRule="auto"/>
+      </w:pPr>
+      <w:r>
+        <w:rPr>
+          <w:rFonts w:ascii="Consolas" w:hAnsi="Consolas" w:cs="Consolas"/>
+          <w:sz w:val="17"/>
+        </w:rPr>
+        <w:t xml:space="preserve">            printf("Singola radice: x1 = %f\n", W1);</w:t>
+      </w:r>
+    </w:p>
+    <w:p>
+      <w:pPr>
+        <w:spacing w:after="0" w:before="0" w:line="240" w:lineRule="auto"/>
+      </w:pPr>
+      <w:r>
+        <w:rPr>
+          <w:rFonts w:ascii="Consolas" w:hAnsi="Consolas" w:cs="Consolas"/>
+          <w:sz w:val="17"/>
+        </w:rPr>
+        <w:t xml:space="preserve">        }</w:t>
+      </w:r>
+    </w:p>
+    <w:p>
+      <w:pPr>
+        <w:spacing w:after="0" w:before="0" w:line="240" w:lineRule="auto"/>
+      </w:pPr>
+      <w:r>
+        <w:rPr>
+          <w:rFonts w:ascii="Consolas" w:hAnsi="Consolas" w:cs="Consolas"/>
+          <w:sz w:val="17"/>
+        </w:rPr>
+        <w:t xml:space="preserve">        else if (delta &lt; 0) {</w:t>
+      </w:r>
+    </w:p>
+    <w:p>
+      <w:pPr>
+        <w:spacing w:after="0" w:before="0" w:line="240" w:lineRule="auto"/>
+      </w:pPr>
+      <w:r>
+        <w:rPr>
+          <w:rFonts w:ascii="Consolas" w:hAnsi="Consolas" w:cs="Consolas"/>
+          <w:sz w:val="17"/>
+        </w:rPr>
+        <w:t xml:space="preserve">            printf("Radici complesse coniugate\n");</w:t>
+      </w:r>
+    </w:p>
+    <w:p>
+      <w:pPr>
+        <w:spacing w:after="0" w:before="0" w:line="240" w:lineRule="auto"/>
+      </w:pPr>
+      <w:r>
+        <w:rPr>
+          <w:rFonts w:ascii="Consolas" w:hAnsi="Consolas" w:cs="Consolas"/>
+          <w:sz w:val="17"/>
+        </w:rPr>
+        <w:t xml:space="preserve">        }</w:t>
+      </w:r>
+    </w:p>
+    <w:p>
+      <w:pPr>
+        <w:spacing w:after="0" w:before="0" w:line="240" w:lineRule="auto"/>
+      </w:pPr>
+      <w:r>
+        <w:rPr>
+          <w:rFonts w:ascii="Consolas" w:hAnsi="Consolas" w:cs="Consolas"/>
+          <w:sz w:val="17"/>
+        </w:rPr>
+        <w:t xml:space="preserve">        else {</w:t>
+      </w:r>
+    </w:p>
+    <w:p>
+      <w:pPr>
+        <w:spacing w:after="0" w:before="0" w:line="240" w:lineRule="auto"/>
+      </w:pPr>
+      <w:r>
+        <w:rPr>
+          <w:rFonts w:ascii="Consolas" w:hAnsi="Consolas" w:cs="Consolas"/>
+          <w:sz w:val="17"/>
+        </w:rPr>
+        <w:t xml:space="preserve">            printf("x1 = %f, x2 = %f\n", W1 + W2, W1 - W2);</w:t>
+      </w:r>
+    </w:p>
+    <w:p>
+      <w:pPr>
+        <w:spacing w:after="0" w:before="0" w:line="240" w:lineRule="auto"/>
+      </w:pPr>
+      <w:r>
+        <w:rPr>
+          <w:rFonts w:ascii="Consolas" w:hAnsi="Consolas" w:cs="Consolas"/>
+          <w:sz w:val="17"/>
+        </w:rPr>
+        <w:t xml:space="preserve">        }</w:t>
+      </w:r>
+    </w:p>
+    <w:p>
+      <w:pPr>
+        <w:spacing w:after="0" w:before="0" w:line="240" w:lineRule="auto"/>
+      </w:pPr>
+      <w:r>
+        <w:rPr>
+          <w:rFonts w:ascii="Consolas" w:hAnsi="Consolas" w:cs="Consolas"/>
+          <w:sz w:val="17"/>
+        </w:rPr>
+        <w:t xml:space="preserve">    }</w:t>
+      </w:r>
+    </w:p>
+    <w:p>
+      <w:pPr>
+        <w:spacing w:after="0" w:before="0" w:line="240" w:lineRule="auto"/>
+      </w:pPr>
+      <w:r>
+        <w:rPr>
+          <w:rFonts w:ascii="Consolas" w:hAnsi="Consolas" w:cs="Consolas"/>
+          <w:sz w:val="17"/>
+        </w:rPr>
+        <w:t>}</w:t>
+      </w:r>
+    </w:p>
+    <w:p/>
+    <w:p>
+      <w:r>
+        <w:rPr/>
+        <w:t xml:space="preserve">Alcune attenzioni. </w:t>
+      </w:r>
+      <w:r>
+        <w:rPr>
+          <w:rFonts w:ascii="Consolas" w:hAnsi="Consolas" w:cs="Consolas"/>
+        </w:rPr>
+        <w:t>W</w:t>
+      </w:r>
+      <w:r>
+        <w:rPr/>
+        <w:t xml:space="preserve"> è dichiarata </w:t>
+      </w:r>
+      <w:r>
+        <w:rPr>
+          <w:rFonts w:ascii="Consolas" w:hAnsi="Consolas" w:cs="Consolas"/>
+        </w:rPr>
+        <w:t>double</w:t>
+      </w:r>
+      <w:r>
+        <w:rPr/>
+        <w:t xml:space="preserve"> e vale </w:t>
+      </w:r>
+      <w:r>
+        <w:rPr>
+          <w:rFonts w:ascii="Consolas" w:hAnsi="Consolas" w:cs="Consolas"/>
+        </w:rPr>
+        <w:t>2.0 * a</w:t>
+      </w:r>
+      <w:r>
+        <w:rPr/>
+        <w:t xml:space="preserve">, così le divisioni </w:t>
+      </w:r>
+      <w:r>
+        <w:rPr>
+          <w:rFonts w:ascii="Consolas" w:hAnsi="Consolas" w:cs="Consolas"/>
+        </w:rPr>
+        <w:t>-b / W</w:t>
+      </w:r>
+      <w:r>
+        <w:rPr/>
+        <w:t xml:space="preserve"> e </w:t>
+      </w:r>
+      <w:r>
+        <w:rPr>
+          <w:rFonts w:ascii="Consolas" w:hAnsi="Consolas" w:cs="Consolas"/>
+        </w:rPr>
+        <w:t>sqrt(...) / W</w:t>
+      </w:r>
+      <w:r>
+        <w:rPr/>
+        <w:t xml:space="preserve"> sono fra reali: se invece W fosse un intero, </w:t>
+      </w:r>
+      <w:r>
+        <w:rPr>
+          <w:rFonts w:ascii="Consolas" w:hAnsi="Consolas" w:cs="Consolas"/>
+        </w:rPr>
+        <w:t>-b / W</w:t>
+      </w:r>
+      <w:r>
+        <w:rPr/>
+        <w:t xml:space="preserve"> scarterebbe i decimali (capitolo 16). Nel ramo </w:t>
+      </w:r>
+      <w:r>
+        <w:rPr>
+          <w:rFonts w:ascii="Consolas" w:hAnsi="Consolas" w:cs="Consolas"/>
+        </w:rPr>
+        <w:t>a == 0</w:t>
+      </w:r>
+      <w:r>
+        <w:rPr/>
+        <w:t xml:space="preserve"> il cast </w:t>
+      </w:r>
+      <w:r>
+        <w:rPr>
+          <w:rFonts w:ascii="Consolas" w:hAnsi="Consolas" w:cs="Consolas"/>
+        </w:rPr>
+        <w:t>(double)c</w:t>
+      </w:r>
+      <w:r>
+        <w:rPr/>
+        <w:t xml:space="preserve"> evita la stessa divisione fra interi. Per le radici complesse la tabella dei casi di prova riporta solo la dicitura «Radici complesse coniugate»; volendo si potrebbe stampare la parte reale W₁ e quella immaginaria ±W₂. Infine </w:t>
+      </w:r>
+      <w:r>
+        <w:rPr>
+          <w:rFonts w:ascii="Consolas" w:hAnsi="Consolas" w:cs="Consolas"/>
+        </w:rPr>
+        <w:t>abs()</w:t>
+      </w:r>
+      <w:r>
+        <w:rPr/>
+        <w:t xml:space="preserve"> lavora con numeri interi: se i coefficienti fossero dei </w:t>
+      </w:r>
+      <w:r>
+        <w:rPr>
+          <w:rFonts w:ascii="Consolas" w:hAnsi="Consolas" w:cs="Consolas"/>
+        </w:rPr>
+        <w:t>double</w:t>
+      </w:r>
+      <w:r>
+        <w:rPr/>
+        <w:t xml:space="preserve"> bisognerebbe usare </w:t>
+      </w:r>
+      <w:r>
+        <w:rPr>
+          <w:rFonts w:ascii="Consolas" w:hAnsi="Consolas" w:cs="Consolas"/>
+        </w:rPr>
+        <w:t>fabs()</w:t>
+      </w:r>
+      <w:r>
+        <w:rPr/>
+        <w:t xml:space="preserve">, anch'essa in </w:t>
+      </w:r>
+      <w:r>
+        <w:rPr>
+          <w:rFonts w:ascii="Consolas" w:hAnsi="Consolas" w:cs="Consolas"/>
+        </w:rPr>
+        <w:t>&lt;math.h&gt;</w:t>
+      </w:r>
+      <w:r>
+        <w:rPr/>
+        <w:t xml:space="preserve"> (nota nostra, il laboratorio parla solo di </w:t>
+      </w:r>
+      <w:r>
+        <w:rPr>
+          <w:rFonts w:ascii="Consolas" w:hAnsi="Consolas" w:cs="Consolas"/>
+        </w:rPr>
+        <w:t>abs</w:t>
+      </w:r>
+      <w:r>
+        <w:rPr/>
+        <w:t>).</w:t>
+      </w:r>
+    </w:p>
+    <w:p>
+      <w:r>
+        <w:rPr/>
+        <w:t>Il laboratorio propone sette casi di prova. Provando i coefficienti nello schema si ottengono questi risultati:</w:t>
+      </w:r>
+    </w:p>
+    <w:p>
+      <w:pPr>
+        <w:numPr>
+          <w:ilvl w:val="0"/>
+          <w:numId w:val="1"/>
+        </w:numPr>
+      </w:pPr>
+      <w:r>
+        <w:rPr/>
+        <w:t>a = 0, b = 0, c = 0: indeterminata;</w:t>
+      </w:r>
+    </w:p>
+    <w:p>
+      <w:pPr>
+        <w:numPr>
+          <w:ilvl w:val="0"/>
+          <w:numId w:val="1"/>
+        </w:numPr>
+      </w:pPr>
+      <w:r>
+        <w:rPr/>
+        <w:t>a = 0, b = 0, c = 4: impossibile;</w:t>
+      </w:r>
+    </w:p>
+    <w:p>
+      <w:pPr>
+        <w:numPr>
+          <w:ilvl w:val="0"/>
+          <w:numId w:val="1"/>
+        </w:numPr>
+      </w:pPr>
+      <w:r>
+        <w:rPr/>
+        <w:t>a = 0, b = 2, c = −4: x₁ = 2;</w:t>
+      </w:r>
+    </w:p>
+    <w:p>
+      <w:pPr>
+        <w:numPr>
+          <w:ilvl w:val="0"/>
+          <w:numId w:val="1"/>
+        </w:numPr>
+      </w:pPr>
+      <w:r>
+        <w:rPr/>
+        <w:t>a = 1, b = 0, c = −121: x₁ = 11, x₂ = −11;</w:t>
+      </w:r>
+    </w:p>
+    <w:p>
+      <w:pPr>
+        <w:numPr>
+          <w:ilvl w:val="0"/>
+          <w:numId w:val="1"/>
+        </w:numPr>
+      </w:pPr>
+      <w:r>
+        <w:rPr/>
+        <w:t>a = 1, b = 2, c = 1: x₁ = −1 (singola radice);</w:t>
+      </w:r>
+    </w:p>
+    <w:p>
+      <w:pPr>
+        <w:numPr>
+          <w:ilvl w:val="0"/>
+          <w:numId w:val="1"/>
+        </w:numPr>
+      </w:pPr>
+      <w:r>
+        <w:rPr/>
+        <w:t>a = 1, b = −3, c = 10: radici complesse coniugate;</w:t>
+      </w:r>
+    </w:p>
+    <w:p>
+      <w:pPr>
+        <w:numPr>
+          <w:ilvl w:val="0"/>
+          <w:numId w:val="1"/>
+        </w:numPr>
+      </w:pPr>
+      <w:r>
+        <w:rPr/>
+        <w:t>a = 5, b = 20, c = 0: x₁ = 0, x₂ = −4.</w:t>
+      </w:r>
+    </w:p>
+    <w:p>
+      <w:r>
+        <w:rPr/>
+        <w:t>Verifichiamo l'ultimo: δ = 400, W = 10, W₁ = −20/10 = −2, W₂ = 20/10 = 2, quindi x₁ = −2 + 2 = 0 e x₂ = −2 − 2 = −4. Il penultimo ha δ = 9 − 40 = −31, negativo, e quindi nessuna radice reale.</w:t>
+      </w:r>
+    </w:p>
+    <w:p>
+      <w:r>
+        <w:rPr/>
+        <w:t xml:space="preserve">Un dettaglio pratico: sui sistemi Unix </w:t>
+      </w:r>
+      <w:r>
+        <w:rPr>
+          <w:rFonts w:ascii="Consolas" w:hAnsi="Consolas" w:cs="Consolas"/>
+        </w:rPr>
+        <w:t>sqrt</w:t>
+      </w:r>
+      <w:r>
+        <w:rPr/>
+        <w:t xml:space="preserve"> richiede di collegare la libreria matematica con </w:t>
+      </w:r>
+      <w:r>
+        <w:rPr>
+          <w:rFonts w:ascii="Consolas" w:hAnsi="Consolas" w:cs="Consolas"/>
+        </w:rPr>
+        <w:t>gcc equaz_secondo.c -lm</w:t>
+      </w:r>
+      <w:r>
+        <w:rPr/>
+        <w:t xml:space="preserve"> (capitolo 15 della teoria). Le espressioni con </w:t>
+      </w:r>
+      <w:r>
+        <w:rPr>
+          <w:rFonts w:ascii="Consolas" w:hAnsi="Consolas" w:cs="Consolas"/>
+        </w:rPr>
+        <w:t>0.0 - ...</w:t>
+      </w:r>
+      <w:r>
+        <w:rPr/>
+        <w:t xml:space="preserve"> evitano di stampare «-0.000000» quando il risultato è zero (nostra precauzione, non richiesta dalle slide).</w:t>
+      </w:r>
+    </w:p>
+    <w:p>
+      <w:pPr>
+        <w:pStyle w:val="Titolo2"/>
+      </w:pPr>
+      <w:r>
+        <w:rPr>
+          <w:b/>
+          <w:color w:val="E97132"/>
+        </w:rPr>
+        <w:t>Sasso-carta-forbici-lucertola-Spock</w:t>
+      </w:r>
+    </w:p>
+    <w:p>
+      <w:r>
+        <w:rPr/>
+        <w:t xml:space="preserve">L'ultimo esercizio è una variante del gioco della morra cinese: </w:t>
+      </w:r>
+      <w:r>
+        <w:rPr>
+          <w:b/>
+        </w:rPr>
+        <w:t>sasso-carta-forbici-lucertola-Spock</w:t>
+      </w:r>
+      <w:r>
+        <w:rPr/>
+        <w:t xml:space="preserve"> (</w:t>
+      </w:r>
+      <w:r>
+        <w:rPr>
+          <w:i/>
+        </w:rPr>
+        <w:t>rock-paper-scissors-lizard-Spock</w:t>
+      </w:r>
+      <w:r>
+        <w:rPr/>
+        <w:t xml:space="preserve">), una variante fantasiosa inventata da due studenti statunitensi, Sam Kass e Karen Bryla, e resa famosa dal telefilm </w:t>
+      </w:r>
+      <w:r>
+        <w:rPr>
+          <w:i/>
+        </w:rPr>
+        <w:t>The Big Bang Theory</w:t>
+      </w:r>
+      <w:r>
+        <w:rPr/>
+        <w:t xml:space="preserve">. Estende la morra cinese a </w:t>
+      </w:r>
+      <w:r>
+        <w:rPr>
+          <w:b/>
+        </w:rPr>
+        <w:t>cinque stati</w:t>
+      </w:r>
+      <w:r>
+        <w:rPr/>
+        <w:t xml:space="preserve">, aggiungendo la lucertola e Spock, il celebre personaggio di </w:t>
+      </w:r>
+      <w:r>
+        <w:rPr>
+          <w:i/>
+        </w:rPr>
+        <w:t>Star Trek</w:t>
+      </w:r>
+      <w:r>
+        <w:rPr/>
+        <w:t>. L'esercizio si svolge su Moodle con Coderunner (quiz Lab03-Es3): bisogna seguire il testo e completare l'esercizio. Il testo del quiz non è nelle slide, quindi la codifica delle scelte e il formato dell'output vanno letti nel quiz stesso.</w:t>
+      </w:r>
+    </w:p>
+    <w:p>
+      <w:r>
+        <w:rPr/>
+        <w:t xml:space="preserve">L'unico suggerimento che il laboratorio dà riguarda gli input: come fare a determinare se «gli input non sono stati letti»? Si ricorda che la funzione </w:t>
+      </w:r>
+      <w:r>
+        <w:rPr>
+          <w:rFonts w:ascii="Consolas" w:hAnsi="Consolas" w:cs="Consolas"/>
+        </w:rPr>
+        <w:t>scanf</w:t>
+      </w:r>
+      <w:r>
+        <w:rPr/>
+        <w:t xml:space="preserve"> </w:t>
+      </w:r>
+      <w:r>
+        <w:rPr>
+          <w:b/>
+        </w:rPr>
+        <w:t>restituisce il numero di specificatori di conversione letti con successo</w:t>
+      </w:r>
+      <w:r>
+        <w:rPr/>
+        <w:t xml:space="preserve"> dallo standard input (capitolo 10 della teoria). Per esempio, se si leggono due scelte con </w:t>
+      </w:r>
+      <w:r>
+        <w:rPr>
+          <w:rFonts w:ascii="Consolas" w:hAnsi="Consolas" w:cs="Consolas"/>
+        </w:rPr>
+        <w:t>scanf("%d %d", &amp;g1, &amp;g2)</w:t>
+      </w:r>
+      <w:r>
+        <w:rPr/>
+        <w:t>, il valore restituito deve essere 2; se è minore, l'input non è stato letto correttamente.</w:t>
+      </w:r>
+    </w:p>
+    <w:p>
+      <w:r>
+        <w:rPr/>
+        <w:t xml:space="preserve">(In parole povere: </w:t>
+      </w:r>
+      <w:r>
+        <w:rPr>
+          <w:rFonts w:ascii="Consolas" w:hAnsi="Consolas" w:cs="Consolas"/>
+        </w:rPr>
+        <w:t>scanf</w:t>
+      </w:r>
+      <w:r>
+        <w:rPr/>
+        <w:t xml:space="preserve"> non si limita a leggere, ma dice anche com'è andata, restituendo quante cose è riuscita a leggere. Confrontando quel numero con quello atteso sai se l'utente ha scritto dati validi.)</w:t>
+      </w:r>
+    </w:p>
+    <w:p>
+      <w:r>
+        <w:rPr/>
+        <w:t xml:space="preserve">Le regole del gioco originale (che non sono scritte nelle slide) sono dieci: le forbici tagliano la carta, la carta avvolge il sasso, il sasso schiaccia la lucertola, la lucertola avvelena Spock, Spock rompe le forbici, le forbici decapitano la lucertola, la lucertola mangia la carta, la carta smentisce Spock, Spock vaporizza il sasso e il sasso rompe le forbici. Con cinque scelte diventano molti i casi da trattare con una catena di </w:t>
+      </w:r>
+      <w:r>
+        <w:rPr>
+          <w:rFonts w:ascii="Consolas" w:hAnsi="Consolas" w:cs="Consolas"/>
+        </w:rPr>
+        <w:t>if</w:t>
+      </w:r>
+      <w:r>
+        <w:rPr/>
+        <w:t xml:space="preserve">; si può ridurre il lavoro osservando che le regole sono «circolari». Numerando le scelte nell'ordine forbici 0, carta 1, sasso 2, lucertola 3, Spock 4, il giocatore che ha scelto </w:t>
+      </w:r>
+      <w:r>
+        <w:rPr>
+          <w:i/>
+        </w:rPr>
+        <w:t>i</w:t>
+      </w:r>
+      <w:r>
+        <w:rPr/>
+        <w:t xml:space="preserve"> batte quello che ha scelto </w:t>
+      </w:r>
+      <w:r>
+        <w:rPr>
+          <w:i/>
+        </w:rPr>
+        <w:t>j</w:t>
+      </w:r>
+      <w:r>
+        <w:rPr/>
+        <w:t xml:space="preserve"> esattamente quando </w:t>
+      </w:r>
+      <w:r>
+        <w:rPr>
+          <w:rFonts w:ascii="Consolas" w:hAnsi="Consolas" w:cs="Consolas"/>
+        </w:rPr>
+        <w:t>(j - i + 5) % 5</w:t>
+      </w:r>
+      <w:r>
+        <w:rPr/>
+        <w:t xml:space="preserve"> vale 1 oppure 3. Uno schema possibile (nostra proposta, da adattare al testo del quiz) è:</w:t>
+      </w:r>
+    </w:p>
+    <w:p>
+      <w:pPr>
+        <w:spacing w:after="0" w:before="0" w:line="240" w:lineRule="auto"/>
+      </w:pPr>
+      <w:r>
+        <w:rPr>
+          <w:rFonts w:ascii="Consolas" w:hAnsi="Consolas" w:cs="Consolas"/>
+          <w:sz w:val="17"/>
+        </w:rPr>
+        <w:t>int g1, g2;</w:t>
+      </w:r>
+    </w:p>
+    <w:p>
+      <w:pPr>
+        <w:spacing w:after="0" w:before="0" w:line="240" w:lineRule="auto"/>
+      </w:pPr>
+      <w:r>
+        <w:rPr>
+          <w:rFonts w:ascii="Consolas" w:hAnsi="Consolas" w:cs="Consolas"/>
+          <w:sz w:val="17"/>
+        </w:rPr>
+        <w:t>int letti = scanf("%d %d", &amp;g1, &amp;g2);</w:t>
+      </w:r>
+    </w:p>
+    <w:p>
+      <w:pPr>
+        <w:spacing w:after="0" w:before="0" w:line="240" w:lineRule="auto"/>
+      </w:pPr>
+      <w:r>
+        <w:rPr>
+          <w:rFonts w:ascii="Consolas" w:hAnsi="Consolas" w:cs="Consolas"/>
+          <w:sz w:val="17"/>
+        </w:rPr>
+      </w:r>
+    </w:p>
+    <w:p>
+      <w:pPr>
+        <w:spacing w:after="0" w:before="0" w:line="240" w:lineRule="auto"/>
+      </w:pPr>
+      <w:r>
+        <w:rPr>
+          <w:rFonts w:ascii="Consolas" w:hAnsi="Consolas" w:cs="Consolas"/>
+          <w:sz w:val="17"/>
+        </w:rPr>
+        <w:t>if (letti != 2) {</w:t>
+      </w:r>
+    </w:p>
+    <w:p>
+      <w:pPr>
+        <w:spacing w:after="0" w:before="0" w:line="240" w:lineRule="auto"/>
+      </w:pPr>
+      <w:r>
+        <w:rPr>
+          <w:rFonts w:ascii="Consolas" w:hAnsi="Consolas" w:cs="Consolas"/>
+          <w:sz w:val="17"/>
+        </w:rPr>
+        <w:t xml:space="preserve">    printf("Input non letti\n");</w:t>
+      </w:r>
+    </w:p>
+    <w:p>
+      <w:pPr>
+        <w:spacing w:after="0" w:before="0" w:line="240" w:lineRule="auto"/>
+      </w:pPr>
+      <w:r>
+        <w:rPr>
+          <w:rFonts w:ascii="Consolas" w:hAnsi="Consolas" w:cs="Consolas"/>
+          <w:sz w:val="17"/>
+        </w:rPr>
+        <w:t>}</w:t>
+      </w:r>
+    </w:p>
+    <w:p>
+      <w:pPr>
+        <w:spacing w:after="0" w:before="0" w:line="240" w:lineRule="auto"/>
+      </w:pPr>
+      <w:r>
+        <w:rPr>
+          <w:rFonts w:ascii="Consolas" w:hAnsi="Consolas" w:cs="Consolas"/>
+          <w:sz w:val="17"/>
+        </w:rPr>
+        <w:t>else if (g1 &lt; 0 || g1 &gt; 4 || g2 &lt; 0 || g2 &gt; 4) {</w:t>
+      </w:r>
+    </w:p>
+    <w:p>
+      <w:pPr>
+        <w:spacing w:after="0" w:before="0" w:line="240" w:lineRule="auto"/>
+      </w:pPr>
+      <w:r>
+        <w:rPr>
+          <w:rFonts w:ascii="Consolas" w:hAnsi="Consolas" w:cs="Consolas"/>
+          <w:sz w:val="17"/>
+        </w:rPr>
+        <w:t xml:space="preserve">    printf("Scelta non valida\n");</w:t>
+      </w:r>
+    </w:p>
+    <w:p>
+      <w:pPr>
+        <w:spacing w:after="0" w:before="0" w:line="240" w:lineRule="auto"/>
+      </w:pPr>
+      <w:r>
+        <w:rPr>
+          <w:rFonts w:ascii="Consolas" w:hAnsi="Consolas" w:cs="Consolas"/>
+          <w:sz w:val="17"/>
+        </w:rPr>
+        <w:t>}</w:t>
+      </w:r>
+    </w:p>
+    <w:p>
+      <w:pPr>
+        <w:spacing w:after="0" w:before="0" w:line="240" w:lineRule="auto"/>
+      </w:pPr>
+      <w:r>
+        <w:rPr>
+          <w:rFonts w:ascii="Consolas" w:hAnsi="Consolas" w:cs="Consolas"/>
+          <w:sz w:val="17"/>
+        </w:rPr>
+        <w:t>else if (g1 == g2) {</w:t>
+      </w:r>
+    </w:p>
+    <w:p>
+      <w:pPr>
+        <w:spacing w:after="0" w:before="0" w:line="240" w:lineRule="auto"/>
+      </w:pPr>
+      <w:r>
+        <w:rPr>
+          <w:rFonts w:ascii="Consolas" w:hAnsi="Consolas" w:cs="Consolas"/>
+          <w:sz w:val="17"/>
+        </w:rPr>
+        <w:t xml:space="preserve">    printf("Pareggio\n");</w:t>
+      </w:r>
+    </w:p>
+    <w:p>
+      <w:pPr>
+        <w:spacing w:after="0" w:before="0" w:line="240" w:lineRule="auto"/>
+      </w:pPr>
+      <w:r>
+        <w:rPr>
+          <w:rFonts w:ascii="Consolas" w:hAnsi="Consolas" w:cs="Consolas"/>
+          <w:sz w:val="17"/>
+        </w:rPr>
+        <w:t>}</w:t>
+      </w:r>
+    </w:p>
+    <w:p>
+      <w:pPr>
+        <w:spacing w:after="0" w:before="0" w:line="240" w:lineRule="auto"/>
+      </w:pPr>
+      <w:r>
+        <w:rPr>
+          <w:rFonts w:ascii="Consolas" w:hAnsi="Consolas" w:cs="Consolas"/>
+          <w:sz w:val="17"/>
+        </w:rPr>
+        <w:t>else if ((g2 - g1 + 5) % 5 == 1 || (g2 - g1 + 5) % 5 == 3) {</w:t>
+      </w:r>
+    </w:p>
+    <w:p>
+      <w:pPr>
+        <w:spacing w:after="0" w:before="0" w:line="240" w:lineRule="auto"/>
+      </w:pPr>
+      <w:r>
+        <w:rPr>
+          <w:rFonts w:ascii="Consolas" w:hAnsi="Consolas" w:cs="Consolas"/>
+          <w:sz w:val="17"/>
+        </w:rPr>
+        <w:t xml:space="preserve">    printf("Vince il giocatore 1\n");</w:t>
+      </w:r>
+    </w:p>
+    <w:p>
+      <w:pPr>
+        <w:spacing w:after="0" w:before="0" w:line="240" w:lineRule="auto"/>
+      </w:pPr>
+      <w:r>
+        <w:rPr>
+          <w:rFonts w:ascii="Consolas" w:hAnsi="Consolas" w:cs="Consolas"/>
+          <w:sz w:val="17"/>
+        </w:rPr>
+        <w:t>}</w:t>
+      </w:r>
+    </w:p>
+    <w:p>
+      <w:pPr>
+        <w:spacing w:after="0" w:before="0" w:line="240" w:lineRule="auto"/>
+      </w:pPr>
+      <w:r>
+        <w:rPr>
+          <w:rFonts w:ascii="Consolas" w:hAnsi="Consolas" w:cs="Consolas"/>
+          <w:sz w:val="17"/>
+        </w:rPr>
+        <w:t>else {</w:t>
+      </w:r>
+    </w:p>
+    <w:p>
+      <w:pPr>
+        <w:spacing w:after="0" w:before="0" w:line="240" w:lineRule="auto"/>
+      </w:pPr>
+      <w:r>
+        <w:rPr>
+          <w:rFonts w:ascii="Consolas" w:hAnsi="Consolas" w:cs="Consolas"/>
+          <w:sz w:val="17"/>
+        </w:rPr>
+        <w:t xml:space="preserve">    printf("Vince il giocatore 2\n");</w:t>
+      </w:r>
+    </w:p>
+    <w:p>
+      <w:pPr>
+        <w:spacing w:after="0" w:before="0" w:line="240" w:lineRule="auto"/>
+      </w:pPr>
+      <w:r>
+        <w:rPr>
+          <w:rFonts w:ascii="Consolas" w:hAnsi="Consolas" w:cs="Consolas"/>
+          <w:sz w:val="17"/>
+        </w:rPr>
+        <w:t>}</w:t>
+      </w:r>
+    </w:p>
+    <w:p/>
+    <w:p>
+      <w:r>
+        <w:rPr/>
+        <w:t xml:space="preserve">Con questo schema i controlli vanno </w:t>
+      </w:r>
+      <w:r>
+        <w:rPr>
+          <w:b/>
+        </w:rPr>
+        <w:t>nell'ordine giusto</w:t>
+      </w:r>
+      <w:r>
+        <w:rPr/>
+        <w:t>: prima si verifica che gli input siano stati letti (</w:t>
+      </w:r>
+      <w:r>
+        <w:rPr>
+          <w:rFonts w:ascii="Consolas" w:hAnsi="Consolas" w:cs="Consolas"/>
+        </w:rPr>
+        <w:t>letti</w:t>
+      </w:r>
+      <w:r>
+        <w:rPr/>
+        <w:t xml:space="preserve">), poi che siano validi, poi si distinguono pareggio e vittorie. L'ordine conta perché ogni </w:t>
+      </w:r>
+      <w:r>
+        <w:rPr>
+          <w:rFonts w:ascii="Consolas" w:hAnsi="Consolas" w:cs="Consolas"/>
+        </w:rPr>
+        <w:t>else if</w:t>
+      </w:r>
+      <w:r>
+        <w:rPr/>
+        <w:t xml:space="preserve"> presuppone che i casi precedenti siano esclusi: usare </w:t>
+      </w:r>
+      <w:r>
+        <w:rPr>
+          <w:rFonts w:ascii="Consolas" w:hAnsi="Consolas" w:cs="Consolas"/>
+        </w:rPr>
+        <w:t>g1</w:t>
+      </w:r>
+      <w:r>
+        <w:rPr/>
+        <w:t xml:space="preserve"> e </w:t>
+      </w:r>
+      <w:r>
+        <w:rPr>
+          <w:rFonts w:ascii="Consolas" w:hAnsi="Consolas" w:cs="Consolas"/>
+        </w:rPr>
+        <w:t>g2</w:t>
+      </w:r>
+      <w:r>
+        <w:rPr/>
+        <w:t xml:space="preserve"> prima di sapere che sono stati letti sarebbe un errore.</w:t>
+      </w:r>
+    </w:p>
+    <w:p>
+      <w:r>
+        <w:rPr/>
+        <w:t>Con questo il laboratorio 3 si chiude: dai confronti fra numeri si è arrivati a programmi che scelgono fra più casi, e il passo successivo della teoria, i cicli, permetterà di ripetere queste scelte.</w:t>
       </w:r>
     </w:p>
     <w:sectPr>

</xml_diff>